<commit_message>
Video guías y protocolos: tarjetas editables en PowerPoint y contenido ajustado a la rúbrica
- Ejemplos aplicados por curso de vida, consecuencias reales (Barrancabermeja y Yarumal) y dimensión ética
- Consecuencia de cumplir la guía (mortalidad < 1 %) y corrección gramatical
- PNG para Clipchamp exportados desde el PowerPoint; Word actualizado (7:42, 24 escenas)

Co-Authored-By: Claude Opus 5.5 <noreply@anthropic.com>
Claude-Session: https://claude.ai/code/session_01XuLJcNgUM3tZLL1ekwQRQZ
</commit_message>
<xml_diff>
--- a/Actividades/Video_Guias_Protocolos_Clipchamp/Guion_Video_Guias_y_Protocolos.docx
+++ b/Actividades/Video_Guias_Protocolos_Clipchamp/Guion_Video_Guias_y_Protocolos.docx
@@ -853,6 +853,30 @@
     </w:p>
     <w:p>
       <w:pPr>
+        <w:spacing w:after="80" w:line="259"/>
+        <w:jc w:val="both"/>
+      </w:pPr>
+      <w:r>
+        <w:rPr>
+          <w:rFonts w:ascii="Arial" w:cs="Arial" w:eastAsia="Arial" w:hAnsi="Arial"/>
+          <w:b/>
+          <w:bCs/>
+          <w:sz w:val="22"/>
+          <w:szCs w:val="22"/>
+        </w:rPr>
+        <w:t xml:space="preserve">Consecuencias de cumplir la guía: </w:t>
+      </w:r>
+      <w:r>
+        <w:rPr>
+          <w:rFonts w:ascii="Arial" w:cs="Arial" w:eastAsia="Arial" w:hAnsi="Arial"/>
+          <w:sz w:val="22"/>
+          <w:szCs w:val="22"/>
+        </w:rPr>
+        <w:t xml:space="preserve">la adherencia cambia el desenlace. La detección oportuna de los signos de alarma y el acceso a una atención adecuada reducen la mortalidad del dengue grave a menos del 1 %, y en 2025 la letalidad regional reportada por la Organización Panamericana de la Salud fue de 0,05 %. Por el contrario, una salida sin clasificación ni control deja al paciente sin vigilancia justo antes de la fase crítica, que es cuando aparecen el choque y las complicaciones.</w:t>
+      </w:r>
+    </w:p>
+    <w:p>
+      <w:pPr>
         <w:pStyle w:val="Heading1"/>
         <w:spacing w:after="120" w:before="240"/>
       </w:pPr>
@@ -1037,7 +1061,7 @@
                 <w:sz w:val="18"/>
                 <w:szCs w:val="18"/>
               </w:rPr>
-              <w:t xml:space="preserve">Aplicación</w:t>
+              <w:t xml:space="preserve">Ejemplo aplicado</w:t>
             </w:r>
           </w:p>
         </w:tc>
@@ -1145,7 +1169,7 @@
                 <w:sz w:val="18"/>
                 <w:szCs w:val="18"/>
               </w:rPr>
-              <w:t xml:space="preserve">Control prenatal, código rojo ante hemorragia obstétrica, manejo de la preeclampsia y atención humanizada del parto.</w:t>
+              <w:t xml:space="preserve">Ante una hemorragia posparto se activa el código rojo y el equipo actúa en minutos, con funciones definidas para cada integrante.</w:t>
             </w:r>
           </w:p>
         </w:tc>
@@ -1253,7 +1277,7 @@
                 <w:sz w:val="18"/>
                 <w:szCs w:val="18"/>
               </w:rPr>
-              <w:t xml:space="preserve">Crecimiento y desarrollo, enfermedades prevalentes de la infancia, desnutrición aguda y dengue en niños.</w:t>
+              <w:t xml:space="preserve">En el caso analizado, la guía de dengue define si el niño se maneja en casa con control diario o si debe hospitalizarse.</w:t>
             </w:r>
           </w:p>
         </w:tc>
@@ -1361,7 +1385,7 @@
                 <w:sz w:val="18"/>
                 <w:szCs w:val="18"/>
               </w:rPr>
-              <w:t xml:space="preserve">Anticoncepción, prevención del embarazo adolescente, atención de violencias y tamizaje en salud mental.</w:t>
+              <w:t xml:space="preserve">Una víctima de violencia sexual se atiende como urgencia médica, con profilaxis y anticoncepción de emergencia dentro de las primeras 72 horas.</w:t>
             </w:r>
           </w:p>
         </w:tc>
@@ -1469,7 +1493,7 @@
                 <w:sz w:val="18"/>
                 <w:szCs w:val="18"/>
               </w:rPr>
-              <w:t xml:space="preserve">Detección temprana y control de enfermedades crónicas no transmisibles.</w:t>
+              <w:t xml:space="preserve">Las guías de hipertensión y diabetes fijan metas de control de la presión arterial y la glucosa en cada consulta.</w:t>
             </w:r>
           </w:p>
         </w:tc>
@@ -1577,7 +1601,7 @@
                 <w:sz w:val="18"/>
                 <w:szCs w:val="18"/>
               </w:rPr>
-              <w:t xml:space="preserve">Funcionalidad, prevención de caídas, control de enfermedades crónicas y atención integral.</w:t>
+              <w:t xml:space="preserve">En cada control se valora el riesgo de caídas y la funcionalidad, para prevenir fracturas y pérdida de autonomía.</w:t>
             </w:r>
           </w:p>
         </w:tc>
@@ -2243,6 +2267,113 @@
           <w:szCs w:val="22"/>
         </w:rPr>
         <w:t xml:space="preserve">La jurisprudencia del Consejo de Estado aplica a la actividad médica el régimen de la falla probada del servicio, y en general la obligación del médico se entiende como de medios y no de resultados: no se le exige curar, sino actuar con la diligencia de la lex artis. Para que exista responsabilidad deben probarse el daño, la falla y el nexo causal. En ese análisis, las guías de práctica clínica son el referente con el que se compara la atención, y la historia clínica (Resolución 1995 de 1999) es la prueba de si se siguieron y de por qué se tomaron las decisiones.</w:t>
+      </w:r>
+    </w:p>
+    <w:p>
+      <w:pPr>
+        <w:pStyle w:val="Heading2"/>
+        <w:spacing w:after="100" w:before="180"/>
+      </w:pPr>
+      <w:r>
+        <w:rPr>
+          <w:rFonts w:ascii="Arial" w:cs="Arial" w:eastAsia="Arial" w:hAnsi="Arial"/>
+          <w:b/>
+          <w:bCs/>
+          <w:color w:val="2E5496"/>
+          <w:sz w:val="23"/>
+          <w:szCs w:val="23"/>
+        </w:rPr>
+        <w:t xml:space="preserve">4.1 Ejemplos de consecuencias concretas</w:t>
+      </w:r>
+    </w:p>
+    <w:p>
+      <w:pPr>
+        <w:pStyle w:val="ListParagraph"/>
+        <w:numPr>
+          <w:ilvl w:val="0"/>
+          <w:numId w:val="2"/>
+        </w:numPr>
+        <w:spacing w:after="60" w:line="290"/>
+        <w:jc w:val="both"/>
+      </w:pPr>
+      <w:r>
+        <w:rPr>
+          <w:rFonts w:ascii="Arial" w:cs="Arial" w:eastAsia="Arial" w:hAnsi="Arial"/>
+          <w:b/>
+          <w:bCs/>
+          <w:sz w:val="22"/>
+          <w:szCs w:val="22"/>
+        </w:rPr>
+        <w:t xml:space="preserve">Consecuencia penal (Barrancabermeja, 2026): </w:t>
+      </w:r>
+      <w:r>
+        <w:rPr>
+          <w:rFonts w:ascii="Arial" w:cs="Arial" w:eastAsia="Arial" w:hAnsi="Arial"/>
+          <w:sz w:val="22"/>
+          <w:szCs w:val="22"/>
+        </w:rPr>
+        <w:t xml:space="preserve">un médico fue condenado en primera instancia a cuatro años de prisión por homicidio culposo, tras la muerte de una paciente en un procedimiento estético e invasivo para el que, según Medicina Legal, no tenía la especialización ni la licencia requeridas (El Colombiano, 2026).</w:t>
+      </w:r>
+    </w:p>
+    <w:p>
+      <w:pPr>
+        <w:pStyle w:val="ListParagraph"/>
+        <w:numPr>
+          <w:ilvl w:val="0"/>
+          <w:numId w:val="2"/>
+        </w:numPr>
+        <w:spacing w:after="60" w:line="290"/>
+        <w:jc w:val="both"/>
+      </w:pPr>
+      <w:r>
+        <w:rPr>
+          <w:rFonts w:ascii="Arial" w:cs="Arial" w:eastAsia="Arial" w:hAnsi="Arial"/>
+          <w:b/>
+          <w:bCs/>
+          <w:sz w:val="22"/>
+          <w:szCs w:val="22"/>
+        </w:rPr>
+        <w:t xml:space="preserve">Consecuencia clínica e institucional (Yarumal, 2026): </w:t>
+      </w:r>
+      <w:r>
+        <w:rPr>
+          <w:rFonts w:ascii="Arial" w:cs="Arial" w:eastAsia="Arial" w:hAnsi="Arial"/>
+          <w:sz w:val="22"/>
+          <w:szCs w:val="22"/>
+        </w:rPr>
+        <w:t xml:space="preserve">un antiácido de uso oral se administró por vía intravenosa; la paciente fue remitida a cuidados intensivos, y el hospital reconoció el evento adverso, inició la investigación y apartó de sus funciones a la estudiante en práctica (ESE Hospital San Juan de Dios de Yarumal, 2026).</w:t>
+      </w:r>
+    </w:p>
+    <w:p>
+      <w:pPr>
+        <w:pStyle w:val="Heading2"/>
+        <w:spacing w:after="100" w:before="180"/>
+      </w:pPr>
+      <w:r>
+        <w:rPr>
+          <w:rFonts w:ascii="Arial" w:cs="Arial" w:eastAsia="Arial" w:hAnsi="Arial"/>
+          <w:b/>
+          <w:bCs/>
+          <w:color w:val="2E5496"/>
+          <w:sz w:val="23"/>
+          <w:szCs w:val="23"/>
+        </w:rPr>
+        <w:t xml:space="preserve">4.2 Dimensión ética y seguridad del paciente</w:t>
+      </w:r>
+    </w:p>
+    <w:p>
+      <w:pPr>
+        <w:spacing w:after="80" w:line="259"/>
+        <w:ind w:firstLine="567"/>
+        <w:jc w:val="both"/>
+      </w:pPr>
+      <w:r>
+        <w:rPr>
+          <w:rFonts w:ascii="Arial" w:cs="Arial" w:eastAsia="Arial" w:hAnsi="Arial"/>
+          <w:sz w:val="22"/>
+          <w:szCs w:val="22"/>
+        </w:rPr>
+        <w:t xml:space="preserve">No seguir una guía sin una razón clínica justificada vulnera los principios de la ética en salud: la no maleficencia (no causar daño evitable), la beneficencia (actuar en favor del paciente con la mejor evidencia disponible) y la justicia (que todos los pacientes reciban el mismo estándar de calidad). Por eso la adherencia es una práctica segura en el sentido de la Política de Seguridad del Paciente: cada paso de la guía funciona como una barrera que impide que un error llegue al paciente.</w:t>
       </w:r>
     </w:p>
     <w:p>
@@ -3206,7 +3337,7 @@
           <w:sz w:val="22"/>
           <w:szCs w:val="22"/>
         </w:rPr>
-        <w:t xml:space="preserve">Clínicas (complicaciones, secuelas y muertes evitables), éticas (pérdida de confianza de la comunidad y afectación de los profesionales como segundas víctimas), legales (demandas, condenas penales y sanciones ético-disciplinarias y de la Supersalud) e institucionales (mayores costos, daño a la reputación y riesgo para la habilitación y la acreditación).</w:t>
+        <w:t xml:space="preserve">Clínicas (complicaciones, secuelas y muertes evitables), éticas (se vulneran los principios de no maleficencia y beneficencia, se pierde la confianza de la comunidad y los profesionales se afectan como segundas víctimas), legales (demandas, condenas penales y sanciones ético-disciplinarias y de la Supersalud) e institucionales (mayores costos, daño a la reputación y riesgo para la habilitación y la acreditación).</w:t>
       </w:r>
     </w:p>
     <w:p>
@@ -3252,7 +3383,7 @@
           <w:sz w:val="22"/>
           <w:szCs w:val="22"/>
         </w:rPr>
-        <w:t xml:space="preserve">7:42 (23 escenas), dentro del rango de 5 a 8 minutos. </w:t>
+        <w:t xml:space="preserve">7:42 (24 escenas), dentro del rango de 5 a 8 minutos. </w:t>
       </w:r>
       <w:r>
         <w:rPr>
@@ -3627,7 +3758,7 @@
                 <w:sz w:val="18"/>
                 <w:szCs w:val="18"/>
               </w:rPr>
-              <w:t xml:space="preserve">0:00 – 0:08</w:t>
+              <w:t xml:space="preserve">0:00 – 0:06</w:t>
             </w:r>
           </w:p>
         </w:tc>
@@ -3763,7 +3894,7 @@
                 <w:sz w:val="18"/>
                 <w:szCs w:val="18"/>
               </w:rPr>
-              <w:t xml:space="preserve">8 s</w:t>
+              <w:t xml:space="preserve">6 s</w:t>
             </w:r>
           </w:p>
         </w:tc>
@@ -3837,7 +3968,7 @@
                 <w:sz w:val="18"/>
                 <w:szCs w:val="18"/>
               </w:rPr>
-              <w:t xml:space="preserve">0:08 – 0:28</w:t>
+              <w:t xml:space="preserve">0:06 – 0:24</w:t>
             </w:r>
           </w:p>
         </w:tc>
@@ -3973,7 +4104,7 @@
                 <w:sz w:val="18"/>
                 <w:szCs w:val="18"/>
               </w:rPr>
-              <w:t xml:space="preserve">20 s</w:t>
+              <w:t xml:space="preserve">18 s</w:t>
             </w:r>
           </w:p>
         </w:tc>
@@ -4047,7 +4178,7 @@
                 <w:sz w:val="18"/>
                 <w:szCs w:val="18"/>
               </w:rPr>
-              <w:t xml:space="preserve">0:28 – 0:50</w:t>
+              <w:t xml:space="preserve">0:24 – 0:42</w:t>
             </w:r>
           </w:p>
         </w:tc>
@@ -4183,7 +4314,7 @@
                 <w:sz w:val="18"/>
                 <w:szCs w:val="18"/>
               </w:rPr>
-              <w:t xml:space="preserve">22 s</w:t>
+              <w:t xml:space="preserve">18 s</w:t>
             </w:r>
           </w:p>
         </w:tc>
@@ -4257,7 +4388,7 @@
                 <w:sz w:val="18"/>
                 <w:szCs w:val="18"/>
               </w:rPr>
-              <w:t xml:space="preserve">0:50 – 1:10</w:t>
+              <w:t xml:space="preserve">0:42 – 0:58</w:t>
             </w:r>
           </w:p>
         </w:tc>
@@ -4393,7 +4524,7 @@
                 <w:sz w:val="18"/>
                 <w:szCs w:val="18"/>
               </w:rPr>
-              <w:t xml:space="preserve">20 s</w:t>
+              <w:t xml:space="preserve">16 s</w:t>
             </w:r>
           </w:p>
         </w:tc>
@@ -4467,7 +4598,7 @@
                 <w:sz w:val="18"/>
                 <w:szCs w:val="18"/>
               </w:rPr>
-              <w:t xml:space="preserve">1:10 – 1:30</w:t>
+              <w:t xml:space="preserve">0:58 – 1:16</w:t>
             </w:r>
           </w:p>
         </w:tc>
@@ -4603,7 +4734,7 @@
                 <w:sz w:val="18"/>
                 <w:szCs w:val="18"/>
               </w:rPr>
-              <w:t xml:space="preserve">20 s</w:t>
+              <w:t xml:space="preserve">18 s</w:t>
             </w:r>
           </w:p>
         </w:tc>
@@ -4677,7 +4808,7 @@
                 <w:sz w:val="18"/>
                 <w:szCs w:val="18"/>
               </w:rPr>
-              <w:t xml:space="preserve">1:30 – 1:52</w:t>
+              <w:t xml:space="preserve">1:16 – 1:38</w:t>
             </w:r>
           </w:p>
         </w:tc>
@@ -4887,7 +5018,7 @@
                 <w:sz w:val="18"/>
                 <w:szCs w:val="18"/>
               </w:rPr>
-              <w:t xml:space="preserve">1:52 – 2:17</w:t>
+              <w:t xml:space="preserve">1:38 – 2:03</w:t>
             </w:r>
           </w:p>
         </w:tc>
@@ -5097,7 +5228,7 @@
                 <w:sz w:val="18"/>
                 <w:szCs w:val="18"/>
               </w:rPr>
-              <w:t xml:space="preserve">2:17 – 2:39</w:t>
+              <w:t xml:space="preserve">2:03 – 2:25</w:t>
             </w:r>
           </w:p>
         </w:tc>
@@ -5307,7 +5438,7 @@
                 <w:sz w:val="18"/>
                 <w:szCs w:val="18"/>
               </w:rPr>
-              <w:t xml:space="preserve">2:39 – 3:01</w:t>
+              <w:t xml:space="preserve">2:25 – 2:50</w:t>
             </w:r>
           </w:p>
         </w:tc>
@@ -5341,7 +5472,7 @@
                 <w:sz w:val="18"/>
                 <w:szCs w:val="18"/>
               </w:rPr>
-              <w:t xml:space="preserve">Comparación en dos columnas: lo que exige la guía y lo que reporta la familia.</w:t>
+              <w:t xml:space="preserve">Comparación en dos columnas (lo que exige la guía y lo que reporta la familia) y una franja con la consecuencia de cumplirla.</w:t>
             </w:r>
           </w:p>
         </w:tc>
@@ -5375,7 +5506,7 @@
                 <w:sz w:val="18"/>
                 <w:szCs w:val="18"/>
               </w:rPr>
-              <w:t xml:space="preserve">Lo que exige la guía · Lo que reporta la familia</w:t>
+              <w:t xml:space="preserve">Lo que exige la guía · Lo que reporta la familia · Si se cumple la guía: letalidad menor al 1 %</w:t>
             </w:r>
           </w:p>
         </w:tc>
@@ -5443,7 +5574,7 @@
                 <w:sz w:val="18"/>
                 <w:szCs w:val="18"/>
               </w:rPr>
-              <w:t xml:space="preserve">22 s</w:t>
+              <w:t xml:space="preserve">25 s</w:t>
             </w:r>
           </w:p>
         </w:tc>
@@ -5517,7 +5648,7 @@
                 <w:sz w:val="18"/>
                 <w:szCs w:val="18"/>
               </w:rPr>
-              <w:t xml:space="preserve">3:01 – 3:26</w:t>
+              <w:t xml:space="preserve">2:50 – 3:15</w:t>
             </w:r>
           </w:p>
         </w:tc>
@@ -5727,7 +5858,7 @@
                 <w:sz w:val="18"/>
                 <w:szCs w:val="18"/>
               </w:rPr>
-              <w:t xml:space="preserve">3:26 – 3:48</w:t>
+              <w:t xml:space="preserve">3:15 – 3:40</w:t>
             </w:r>
           </w:p>
         </w:tc>
@@ -5761,7 +5892,7 @@
                 <w:sz w:val="18"/>
                 <w:szCs w:val="18"/>
               </w:rPr>
-              <w:t xml:space="preserve">Línea del curso de vida (gestación → infancia) con las normas y guías de cada momento.</w:t>
+              <w:t xml:space="preserve">Línea del curso de vida (gestación → infancia) con las normas y un ejemplo aplicado en cada momento.</w:t>
             </w:r>
           </w:p>
         </w:tc>
@@ -5863,7 +5994,7 @@
                 <w:sz w:val="18"/>
                 <w:szCs w:val="18"/>
               </w:rPr>
-              <w:t xml:space="preserve">22 s</w:t>
+              <w:t xml:space="preserve">25 s</w:t>
             </w:r>
           </w:p>
         </w:tc>
@@ -5937,7 +6068,7 @@
                 <w:sz w:val="18"/>
                 <w:szCs w:val="18"/>
               </w:rPr>
-              <w:t xml:space="preserve">3:48 – 4:12</w:t>
+              <w:t xml:space="preserve">3:40 – 4:05</w:t>
             </w:r>
           </w:p>
         </w:tc>
@@ -5971,7 +6102,7 @@
                 <w:sz w:val="18"/>
                 <w:szCs w:val="18"/>
               </w:rPr>
-              <w:t xml:space="preserve">Continuación de la línea del curso de vida (adolescencia → adultez → vejez) con sus normas y guías.</w:t>
+              <w:t xml:space="preserve">Continuación de la línea del curso de vida (adolescencia → adultez → vejez) con sus normas y un ejemplo aplicado en cada momento.</w:t>
             </w:r>
           </w:p>
         </w:tc>
@@ -6073,7 +6204,7 @@
                 <w:sz w:val="18"/>
                 <w:szCs w:val="18"/>
               </w:rPr>
-              <w:t xml:space="preserve">24 s</w:t>
+              <w:t xml:space="preserve">25 s</w:t>
             </w:r>
           </w:p>
         </w:tc>
@@ -6147,7 +6278,7 @@
                 <w:sz w:val="18"/>
                 <w:szCs w:val="18"/>
               </w:rPr>
-              <w:t xml:space="preserve">4:12 – 4:37</w:t>
+              <w:t xml:space="preserve">4:05 – 4:30</w:t>
             </w:r>
           </w:p>
         </w:tc>
@@ -6357,7 +6488,7 @@
                 <w:sz w:val="18"/>
                 <w:szCs w:val="18"/>
               </w:rPr>
-              <w:t xml:space="preserve">4:37 – 4:59</w:t>
+              <w:t xml:space="preserve">4:30 – 4:48</w:t>
             </w:r>
           </w:p>
         </w:tc>
@@ -6493,7 +6624,7 @@
                 <w:sz w:val="18"/>
                 <w:szCs w:val="18"/>
               </w:rPr>
-              <w:t xml:space="preserve">22 s</w:t>
+              <w:t xml:space="preserve">18 s</w:t>
             </w:r>
           </w:p>
         </w:tc>
@@ -6533,7 +6664,7 @@
                 <w:sz w:val="18"/>
                 <w:szCs w:val="18"/>
               </w:rPr>
-              <w:t xml:space="preserve">15. Consecuencias de no adherirse</w:t>
+              <w:t xml:space="preserve">15. Consecuencias reales</w:t>
             </w:r>
           </w:p>
         </w:tc>
@@ -6567,7 +6698,7 @@
                 <w:sz w:val="18"/>
                 <w:szCs w:val="18"/>
               </w:rPr>
-              <w:t xml:space="preserve">4:59 – 5:19</w:t>
+              <w:t xml:space="preserve">4:48 – 5:13</w:t>
             </w:r>
           </w:p>
         </w:tc>
@@ -6601,7 +6732,7 @@
                 <w:sz w:val="18"/>
                 <w:szCs w:val="18"/>
               </w:rPr>
-              <w:t xml:space="preserve">Cuatro íconos en fila: clínicas, éticas, legales e institucionales.</w:t>
+              <w:t xml:space="preserve">Dos tarjetas con casos reales: Barrancabermeja (condena penal) y Yarumal (evento adverso e investigación), con su fuente.</w:t>
             </w:r>
           </w:p>
         </w:tc>
@@ -6635,7 +6766,7 @@
                 <w:sz w:val="18"/>
                 <w:szCs w:val="18"/>
               </w:rPr>
-              <w:t xml:space="preserve">Consecuencias clínicas · éticas · legales · institucionales</w:t>
+              <w:t xml:space="preserve">Barrancabermeja, 2026: condena por homicidio culposo · Yarumal, 2026: evento adverso e investigación</w:t>
             </w:r>
           </w:p>
         </w:tc>
@@ -6703,7 +6834,7 @@
                 <w:sz w:val="18"/>
                 <w:szCs w:val="18"/>
               </w:rPr>
-              <w:t xml:space="preserve">20 s</w:t>
+              <w:t xml:space="preserve">25 s</w:t>
             </w:r>
           </w:p>
         </w:tc>
@@ -6743,7 +6874,7 @@
                 <w:sz w:val="18"/>
                 <w:szCs w:val="18"/>
               </w:rPr>
-              <w:t xml:space="preserve">16. Barreras para cumplir la guía</w:t>
+              <w:t xml:space="preserve">16. Consecuencias de no adherirse</w:t>
             </w:r>
           </w:p>
         </w:tc>
@@ -6777,7 +6908,7 @@
                 <w:sz w:val="18"/>
                 <w:szCs w:val="18"/>
               </w:rPr>
-              <w:t xml:space="preserve">5:19 – 5:39</w:t>
+              <w:t xml:space="preserve">5:13 – 5:33</w:t>
             </w:r>
           </w:p>
         </w:tc>
@@ -6811,7 +6942,7 @@
                 <w:sz w:val="18"/>
                 <w:szCs w:val="18"/>
               </w:rPr>
-              <w:t xml:space="preserve">Video de stock de una sala de urgencias congestionada; panel con las cuatro barreras. Video de stock: “busy emergency room”.</w:t>
+              <w:t xml:space="preserve">Cuatro íconos en fila: clínicas, éticas, legales e institucionales.</w:t>
             </w:r>
           </w:p>
         </w:tc>
@@ -6845,7 +6976,7 @@
                 <w:sz w:val="18"/>
                 <w:szCs w:val="18"/>
               </w:rPr>
-              <w:t xml:space="preserve">Recursos · Capacitación · Cultura de seguridad · Liderazgo</w:t>
+              <w:t xml:space="preserve">Consecuencias clínicas · éticas · legales · institucionales</w:t>
             </w:r>
           </w:p>
         </w:tc>
@@ -6879,7 +7010,7 @@
                 <w:sz w:val="18"/>
                 <w:szCs w:val="18"/>
               </w:rPr>
-              <w:t xml:space="preserve">Voz en off. Música: reflexiva.</w:t>
+              <w:t xml:space="preserve">Voz en off. Música: tensión suave.</w:t>
             </w:r>
           </w:p>
         </w:tc>
@@ -6953,7 +7084,7 @@
                 <w:sz w:val="18"/>
                 <w:szCs w:val="18"/>
               </w:rPr>
-              <w:t xml:space="preserve">17. Acciones de mejora</w:t>
+              <w:t xml:space="preserve">17. Barreras para cumplir la guía</w:t>
             </w:r>
           </w:p>
         </w:tc>
@@ -6987,7 +7118,7 @@
                 <w:sz w:val="18"/>
                 <w:szCs w:val="18"/>
               </w:rPr>
-              <w:t xml:space="preserve">5:39 – 6:04</w:t>
+              <w:t xml:space="preserve">5:33 – 5:51</w:t>
             </w:r>
           </w:p>
         </w:tc>
@@ -7021,7 +7152,7 @@
                 <w:sz w:val="18"/>
                 <w:szCs w:val="18"/>
               </w:rPr>
-              <w:t xml:space="preserve">Lista de chequeo con cinco acciones de mejora y sus responsables.</w:t>
+              <w:t xml:space="preserve">Video de stock de una sala de urgencias congestionada; panel con las cuatro barreras. Video de stock: “busy emergency room”.</w:t>
             </w:r>
           </w:p>
         </w:tc>
@@ -7055,7 +7186,7 @@
                 <w:sz w:val="18"/>
                 <w:szCs w:val="18"/>
               </w:rPr>
-              <w:t xml:space="preserve">Capacitación · Formatos · Auditorías · Simulacros · Análisis de casos</w:t>
+              <w:t xml:space="preserve">Recursos · Capacitación · Cultura de seguridad · Liderazgo</w:t>
             </w:r>
           </w:p>
         </w:tc>
@@ -7089,7 +7220,7 @@
                 <w:sz w:val="18"/>
                 <w:szCs w:val="18"/>
               </w:rPr>
-              <w:t xml:space="preserve">Voz en off. Música: esperanzadora.</w:t>
+              <w:t xml:space="preserve">Voz en off. Música: reflexiva.</w:t>
             </w:r>
           </w:p>
         </w:tc>
@@ -7123,7 +7254,7 @@
                 <w:sz w:val="18"/>
                 <w:szCs w:val="18"/>
               </w:rPr>
-              <w:t xml:space="preserve">25 s</w:t>
+              <w:t xml:space="preserve">18 s</w:t>
             </w:r>
           </w:p>
         </w:tc>
@@ -7163,7 +7294,7 @@
                 <w:sz w:val="18"/>
                 <w:szCs w:val="18"/>
               </w:rPr>
-              <w:t xml:space="preserve">18. Indicadores de seguimiento</w:t>
+              <w:t xml:space="preserve">18. Acciones de mejora</w:t>
             </w:r>
           </w:p>
         </w:tc>
@@ -7197,7 +7328,7 @@
                 <w:sz w:val="18"/>
                 <w:szCs w:val="18"/>
               </w:rPr>
-              <w:t xml:space="preserve">6:04 – 6:24</w:t>
+              <w:t xml:space="preserve">5:51 – 6:16</w:t>
             </w:r>
           </w:p>
         </w:tc>
@@ -7231,7 +7362,7 @@
                 <w:sz w:val="18"/>
                 <w:szCs w:val="18"/>
               </w:rPr>
-              <w:t xml:space="preserve">Tablero de cinco indicadores con su fórmula y meta.</w:t>
+              <w:t xml:space="preserve">Lista de chequeo con cinco acciones de mejora y sus responsables.</w:t>
             </w:r>
           </w:p>
         </w:tc>
@@ -7265,7 +7396,7 @@
                 <w:sz w:val="18"/>
                 <w:szCs w:val="18"/>
               </w:rPr>
-              <w:t xml:space="preserve">Adherencia · Reconsultas · Eventos adversos · Tiempos · Letalidad</w:t>
+              <w:t xml:space="preserve">Capacitación · Formatos · Auditorías · Simulacros · Análisis de casos</w:t>
             </w:r>
           </w:p>
         </w:tc>
@@ -7333,7 +7464,7 @@
                 <w:sz w:val="18"/>
                 <w:szCs w:val="18"/>
               </w:rPr>
-              <w:t xml:space="preserve">20 s</w:t>
+              <w:t xml:space="preserve">25 s</w:t>
             </w:r>
           </w:p>
         </w:tc>
@@ -7373,7 +7504,7 @@
                 <w:sz w:val="18"/>
                 <w:szCs w:val="18"/>
               </w:rPr>
-              <w:t xml:space="preserve">19. Mi postura</w:t>
+              <w:t xml:space="preserve">19. Indicadores de seguimiento</w:t>
             </w:r>
           </w:p>
         </w:tc>
@@ -7407,7 +7538,7 @@
                 <w:sz w:val="18"/>
                 <w:szCs w:val="18"/>
               </w:rPr>
-              <w:t xml:space="preserve">6:24 – 6:49</w:t>
+              <w:t xml:space="preserve">6:16 – 6:32</w:t>
             </w:r>
           </w:p>
         </w:tc>
@@ -7441,7 +7572,7 @@
                 <w:sz w:val="18"/>
                 <w:szCs w:val="18"/>
               </w:rPr>
-              <w:t xml:space="preserve">Balanza: a un lado lo que aporta la guía y al otro su límite; abajo, la postura personal.</w:t>
+              <w:t xml:space="preserve">Tablero de cinco indicadores con su fórmula y meta.</w:t>
             </w:r>
           </w:p>
         </w:tc>
@@ -7475,7 +7606,7 @@
                 <w:sz w:val="18"/>
                 <w:szCs w:val="18"/>
               </w:rPr>
-              <w:t xml:space="preserve">La guía es el piso, no el techo</w:t>
+              <w:t xml:space="preserve">Adherencia · Reconsultas · Eventos adversos · Tiempos · Letalidad</w:t>
             </w:r>
           </w:p>
         </w:tc>
@@ -7509,7 +7640,7 @@
                 <w:sz w:val="18"/>
                 <w:szCs w:val="18"/>
               </w:rPr>
-              <w:t xml:space="preserve">Voz en off. Música: reflexiva.</w:t>
+              <w:t xml:space="preserve">Voz en off. Música: esperanzadora.</w:t>
             </w:r>
           </w:p>
         </w:tc>
@@ -7543,7 +7674,7 @@
                 <w:sz w:val="18"/>
                 <w:szCs w:val="18"/>
               </w:rPr>
-              <w:t xml:space="preserve">25 s</w:t>
+              <w:t xml:space="preserve">16 s</w:t>
             </w:r>
           </w:p>
         </w:tc>
@@ -7583,7 +7714,7 @@
                 <w:sz w:val="18"/>
                 <w:szCs w:val="18"/>
               </w:rPr>
-              <w:t xml:space="preserve">20. Importancia según el marco legal</w:t>
+              <w:t xml:space="preserve">20. Mi postura</w:t>
             </w:r>
           </w:p>
         </w:tc>
@@ -7617,7 +7748,7 @@
                 <w:sz w:val="18"/>
                 <w:szCs w:val="18"/>
               </w:rPr>
-              <w:t xml:space="preserve">6:49 – 7:09</w:t>
+              <w:t xml:space="preserve">6:32 – 6:54</w:t>
             </w:r>
           </w:p>
         </w:tc>
@@ -7651,7 +7782,7 @@
                 <w:sz w:val="18"/>
                 <w:szCs w:val="18"/>
               </w:rPr>
-              <w:t xml:space="preserve">Tres escudos: protege al paciente, al profesional y a la institución.</w:t>
+              <w:t xml:space="preserve">Balanza: a un lado lo que aporta la guía y al otro su límite; abajo, la postura personal.</w:t>
             </w:r>
           </w:p>
         </w:tc>
@@ -7685,7 +7816,7 @@
                 <w:sz w:val="18"/>
                 <w:szCs w:val="18"/>
               </w:rPr>
-              <w:t xml:space="preserve">Adherencia = seguridad del paciente</w:t>
+              <w:t xml:space="preserve">La guía es el piso, no el techo</w:t>
             </w:r>
           </w:p>
         </w:tc>
@@ -7719,7 +7850,7 @@
                 <w:sz w:val="18"/>
                 <w:szCs w:val="18"/>
               </w:rPr>
-              <w:t xml:space="preserve">Voz en off. Música: esperanzadora.</w:t>
+              <w:t xml:space="preserve">Voz en off. Música: reflexiva.</w:t>
             </w:r>
           </w:p>
         </w:tc>
@@ -7753,7 +7884,7 @@
                 <w:sz w:val="18"/>
                 <w:szCs w:val="18"/>
               </w:rPr>
-              <w:t xml:space="preserve">20 s</w:t>
+              <w:t xml:space="preserve">22 s</w:t>
             </w:r>
           </w:p>
         </w:tc>
@@ -7793,7 +7924,7 @@
                 <w:sz w:val="18"/>
                 <w:szCs w:val="18"/>
               </w:rPr>
-              <w:t xml:space="preserve">21. Cierre</w:t>
+              <w:t xml:space="preserve">21. Importancia según el marco legal</w:t>
             </w:r>
           </w:p>
         </w:tc>
@@ -7827,7 +7958,7 @@
                 <w:sz w:val="18"/>
                 <w:szCs w:val="18"/>
               </w:rPr>
-              <w:t xml:space="preserve">7:09 – 7:24</w:t>
+              <w:t xml:space="preserve">6:54 – 7:14</w:t>
             </w:r>
           </w:p>
         </w:tc>
@@ -7861,7 +7992,7 @@
                 <w:sz w:val="18"/>
                 <w:szCs w:val="18"/>
               </w:rPr>
-              <w:t xml:space="preserve">Video de stock de una médica atendiendo a un niño; frase final. Video de stock: “doctor child patient”.</w:t>
+              <w:t xml:space="preserve">Tres escudos: protege al paciente, al profesional y a la institución.</w:t>
             </w:r>
           </w:p>
         </w:tc>
@@ -7895,7 +8026,7 @@
                 <w:sz w:val="18"/>
                 <w:szCs w:val="18"/>
               </w:rPr>
-              <w:t xml:space="preserve">Una guía bien aplicada es una decisión a tiempo</w:t>
+              <w:t xml:space="preserve">Adherencia = seguridad del paciente</w:t>
             </w:r>
           </w:p>
         </w:tc>
@@ -7929,7 +8060,7 @@
                 <w:sz w:val="18"/>
                 <w:szCs w:val="18"/>
               </w:rPr>
-              <w:t xml:space="preserve">Voz en off. Música: cálida, crece y se desvanece.</w:t>
+              <w:t xml:space="preserve">Voz en off. Música: esperanzadora.</w:t>
             </w:r>
           </w:p>
         </w:tc>
@@ -7963,7 +8094,7 @@
                 <w:sz w:val="18"/>
                 <w:szCs w:val="18"/>
               </w:rPr>
-              <w:t xml:space="preserve">15 s</w:t>
+              <w:t xml:space="preserve">20 s</w:t>
             </w:r>
           </w:p>
         </w:tc>
@@ -8003,7 +8134,7 @@
                 <w:sz w:val="18"/>
                 <w:szCs w:val="18"/>
               </w:rPr>
-              <w:t xml:space="preserve">22. Referencias</w:t>
+              <w:t xml:space="preserve">22. Cierre</w:t>
             </w:r>
           </w:p>
         </w:tc>
@@ -8037,7 +8168,7 @@
                 <w:sz w:val="18"/>
                 <w:szCs w:val="18"/>
               </w:rPr>
-              <w:t xml:space="preserve">7:24 – 7:34</w:t>
+              <w:t xml:space="preserve">7:14 – 7:26</w:t>
             </w:r>
           </w:p>
         </w:tc>
@@ -8071,7 +8202,7 @@
                 <w:sz w:val="18"/>
                 <w:szCs w:val="18"/>
               </w:rPr>
-              <w:t xml:space="preserve">Lista de referencias en dos columnas.</w:t>
+              <w:t xml:space="preserve">Video de stock de una médica atendiendo a un niño; frase final. Video de stock: “doctor child patient”.</w:t>
             </w:r>
           </w:p>
         </w:tc>
@@ -8105,7 +8236,7 @@
                 <w:sz w:val="18"/>
                 <w:szCs w:val="18"/>
               </w:rPr>
-              <w:t xml:space="preserve">Referencias</w:t>
+              <w:t xml:space="preserve">Una guía bien aplicada es una decisión a tiempo</w:t>
             </w:r>
           </w:p>
         </w:tc>
@@ -8139,7 +8270,7 @@
                 <w:sz w:val="18"/>
                 <w:szCs w:val="18"/>
               </w:rPr>
-              <w:t xml:space="preserve">Sin voz. Música: suave.</w:t>
+              <w:t xml:space="preserve">Voz en off. Música: cálida, crece y se desvanece.</w:t>
             </w:r>
           </w:p>
         </w:tc>
@@ -8173,7 +8304,7 @@
                 <w:sz w:val="18"/>
                 <w:szCs w:val="18"/>
               </w:rPr>
-              <w:t xml:space="preserve">10 s</w:t>
+              <w:t xml:space="preserve">12 s</w:t>
             </w:r>
           </w:p>
         </w:tc>
@@ -8213,7 +8344,7 @@
                 <w:sz w:val="18"/>
                 <w:szCs w:val="18"/>
               </w:rPr>
-              <w:t xml:space="preserve">23. Créditos</w:t>
+              <w:t xml:space="preserve">23. Referencias</w:t>
             </w:r>
           </w:p>
         </w:tc>
@@ -8247,7 +8378,7 @@
                 <w:sz w:val="18"/>
                 <w:szCs w:val="18"/>
               </w:rPr>
-              <w:t xml:space="preserve">7:34 – 7:42</w:t>
+              <w:t xml:space="preserve">7:26 – 7:36</w:t>
             </w:r>
           </w:p>
         </w:tc>
@@ -8281,6 +8412,216 @@
                 <w:sz w:val="18"/>
                 <w:szCs w:val="18"/>
               </w:rPr>
+              <w:t xml:space="preserve">Lista de referencias en dos columnas.</w:t>
+            </w:r>
+          </w:p>
+        </w:tc>
+        <w:tc>
+          <w:tcPr>
+            <w:tcW w:type="dxa" w:w="2050"/>
+            <w:tcBorders>
+              <w:top w:val="single" w:color="8EAADB" w:sz="4"/>
+              <w:left w:val="single" w:color="8EAADB" w:sz="4"/>
+              <w:bottom w:val="single" w:color="8EAADB" w:sz="4"/>
+              <w:right w:val="single" w:color="8EAADB" w:sz="4"/>
+            </w:tcBorders>
+            <w:tcMar>
+              <w:top w:type="dxa" w:w="35"/>
+              <w:left w:type="dxa" w:w="80"/>
+              <w:bottom w:type="dxa" w:w="35"/>
+              <w:right w:type="dxa" w:w="80"/>
+            </w:tcMar>
+            <w:vAlign w:val="center"/>
+          </w:tcPr>
+          <w:p>
+            <w:pPr>
+              <w:spacing w:after="20"/>
+            </w:pPr>
+            <w:r>
+              <w:rPr>
+                <w:rFonts w:ascii="Arial" w:cs="Arial" w:eastAsia="Arial" w:hAnsi="Arial"/>
+                <w:b w:val="false"/>
+                <w:bCs w:val="false"/>
+                <w:color w:val="000000"/>
+                <w:sz w:val="18"/>
+                <w:szCs w:val="18"/>
+              </w:rPr>
+              <w:t xml:space="preserve">Referencias</w:t>
+            </w:r>
+          </w:p>
+        </w:tc>
+        <w:tc>
+          <w:tcPr>
+            <w:tcW w:type="dxa" w:w="1610"/>
+            <w:tcBorders>
+              <w:top w:val="single" w:color="8EAADB" w:sz="4"/>
+              <w:left w:val="single" w:color="8EAADB" w:sz="4"/>
+              <w:bottom w:val="single" w:color="8EAADB" w:sz="4"/>
+              <w:right w:val="single" w:color="8EAADB" w:sz="4"/>
+            </w:tcBorders>
+            <w:tcMar>
+              <w:top w:type="dxa" w:w="35"/>
+              <w:left w:type="dxa" w:w="80"/>
+              <w:bottom w:type="dxa" w:w="35"/>
+              <w:right w:type="dxa" w:w="80"/>
+            </w:tcMar>
+            <w:vAlign w:val="center"/>
+          </w:tcPr>
+          <w:p>
+            <w:pPr>
+              <w:spacing w:after="20"/>
+            </w:pPr>
+            <w:r>
+              <w:rPr>
+                <w:rFonts w:ascii="Arial" w:cs="Arial" w:eastAsia="Arial" w:hAnsi="Arial"/>
+                <w:b w:val="false"/>
+                <w:bCs w:val="false"/>
+                <w:color w:val="000000"/>
+                <w:sz w:val="18"/>
+                <w:szCs w:val="18"/>
+              </w:rPr>
+              <w:t xml:space="preserve">Sin voz. Música: suave.</w:t>
+            </w:r>
+          </w:p>
+        </w:tc>
+        <w:tc>
+          <w:tcPr>
+            <w:tcW w:type="dxa" w:w="1000"/>
+            <w:tcBorders>
+              <w:top w:val="single" w:color="8EAADB" w:sz="4"/>
+              <w:left w:val="single" w:color="8EAADB" w:sz="4"/>
+              <w:bottom w:val="single" w:color="8EAADB" w:sz="4"/>
+              <w:right w:val="single" w:color="8EAADB" w:sz="4"/>
+            </w:tcBorders>
+            <w:tcMar>
+              <w:top w:type="dxa" w:w="35"/>
+              <w:left w:type="dxa" w:w="80"/>
+              <w:bottom w:type="dxa" w:w="35"/>
+              <w:right w:type="dxa" w:w="80"/>
+            </w:tcMar>
+            <w:vAlign w:val="center"/>
+          </w:tcPr>
+          <w:p>
+            <w:pPr>
+              <w:spacing w:after="20"/>
+            </w:pPr>
+            <w:r>
+              <w:rPr>
+                <w:rFonts w:ascii="Arial" w:cs="Arial" w:eastAsia="Arial" w:hAnsi="Arial"/>
+                <w:b w:val="false"/>
+                <w:bCs w:val="false"/>
+                <w:color w:val="000000"/>
+                <w:sz w:val="18"/>
+                <w:szCs w:val="18"/>
+              </w:rPr>
+              <w:t xml:space="preserve">10 s</w:t>
+            </w:r>
+          </w:p>
+        </w:tc>
+      </w:tr>
+      <w:tr>
+        <w:trPr>
+          <w:tblHeader w:val="false"/>
+        </w:trPr>
+        <w:tc>
+          <w:tcPr>
+            <w:tcW w:type="dxa" w:w="1500"/>
+            <w:tcBorders>
+              <w:top w:val="single" w:color="8EAADB" w:sz="4"/>
+              <w:left w:val="single" w:color="8EAADB" w:sz="4"/>
+              <w:bottom w:val="single" w:color="8EAADB" w:sz="4"/>
+              <w:right w:val="single" w:color="8EAADB" w:sz="4"/>
+            </w:tcBorders>
+            <w:shd w:fill="DEEAF6" w:color="auto" w:val="clear"/>
+            <w:tcMar>
+              <w:top w:type="dxa" w:w="35"/>
+              <w:left w:type="dxa" w:w="80"/>
+              <w:bottom w:type="dxa" w:w="35"/>
+              <w:right w:type="dxa" w:w="80"/>
+            </w:tcMar>
+            <w:vAlign w:val="center"/>
+          </w:tcPr>
+          <w:p>
+            <w:pPr>
+              <w:spacing w:after="20"/>
+            </w:pPr>
+            <w:r>
+              <w:rPr>
+                <w:rFonts w:ascii="Arial" w:cs="Arial" w:eastAsia="Arial" w:hAnsi="Arial"/>
+                <w:b/>
+                <w:bCs/>
+                <w:color w:val="000000"/>
+                <w:sz w:val="18"/>
+                <w:szCs w:val="18"/>
+              </w:rPr>
+              <w:t xml:space="preserve">24. Créditos</w:t>
+            </w:r>
+          </w:p>
+        </w:tc>
+        <w:tc>
+          <w:tcPr>
+            <w:tcW w:type="dxa" w:w="850"/>
+            <w:tcBorders>
+              <w:top w:val="single" w:color="8EAADB" w:sz="4"/>
+              <w:left w:val="single" w:color="8EAADB" w:sz="4"/>
+              <w:bottom w:val="single" w:color="8EAADB" w:sz="4"/>
+              <w:right w:val="single" w:color="8EAADB" w:sz="4"/>
+            </w:tcBorders>
+            <w:tcMar>
+              <w:top w:type="dxa" w:w="35"/>
+              <w:left w:type="dxa" w:w="80"/>
+              <w:bottom w:type="dxa" w:w="35"/>
+              <w:right w:type="dxa" w:w="80"/>
+            </w:tcMar>
+            <w:vAlign w:val="center"/>
+          </w:tcPr>
+          <w:p>
+            <w:pPr>
+              <w:spacing w:after="20"/>
+            </w:pPr>
+            <w:r>
+              <w:rPr>
+                <w:rFonts w:ascii="Arial" w:cs="Arial" w:eastAsia="Arial" w:hAnsi="Arial"/>
+                <w:b w:val="false"/>
+                <w:bCs w:val="false"/>
+                <w:color w:val="000000"/>
+                <w:sz w:val="18"/>
+                <w:szCs w:val="18"/>
+              </w:rPr>
+              <w:t xml:space="preserve">7:36 – 7:42</w:t>
+            </w:r>
+          </w:p>
+        </w:tc>
+        <w:tc>
+          <w:tcPr>
+            <w:tcW w:type="dxa" w:w="2350"/>
+            <w:tcBorders>
+              <w:top w:val="single" w:color="8EAADB" w:sz="4"/>
+              <w:left w:val="single" w:color="8EAADB" w:sz="4"/>
+              <w:bottom w:val="single" w:color="8EAADB" w:sz="4"/>
+              <w:right w:val="single" w:color="8EAADB" w:sz="4"/>
+            </w:tcBorders>
+            <w:tcMar>
+              <w:top w:type="dxa" w:w="35"/>
+              <w:left w:type="dxa" w:w="80"/>
+              <w:bottom w:type="dxa" w:w="35"/>
+              <w:right w:type="dxa" w:w="80"/>
+            </w:tcMar>
+            <w:vAlign w:val="center"/>
+          </w:tcPr>
+          <w:p>
+            <w:pPr>
+              <w:spacing w:after="20"/>
+            </w:pPr>
+            <w:r>
+              <w:rPr>
+                <w:rFonts w:ascii="Arial" w:cs="Arial" w:eastAsia="Arial" w:hAnsi="Arial"/>
+                <w:b w:val="false"/>
+                <w:bCs w:val="false"/>
+                <w:color w:val="000000"/>
+                <w:sz w:val="18"/>
+                <w:szCs w:val="18"/>
+              </w:rPr>
               <w:t xml:space="preserve">Créditos: autora, curso, docente, imágenes, música y edición.</w:t>
             </w:r>
           </w:p>
@@ -8383,7 +8724,7 @@
                 <w:sz w:val="18"/>
                 <w:szCs w:val="18"/>
               </w:rPr>
-              <w:t xml:space="preserve">8 s</w:t>
+              <w:t xml:space="preserve">6 s</w:t>
             </w:r>
           </w:p>
         </w:tc>
@@ -8686,7 +9027,7 @@
                 <w:sz w:val="18"/>
                 <w:szCs w:val="18"/>
               </w:rPr>
-              <w:t xml:space="preserve">0:00 – 0:08</w:t>
+              <w:t xml:space="preserve">0:00 – 0:06</w:t>
             </w:r>
           </w:p>
         </w:tc>
@@ -8828,7 +9169,7 @@
                 <w:sz w:val="18"/>
                 <w:szCs w:val="18"/>
               </w:rPr>
-              <w:t xml:space="preserve">0:08 – 0:28</w:t>
+              <w:t xml:space="preserve">0:06 – 0:24</w:t>
             </w:r>
           </w:p>
         </w:tc>
@@ -8862,7 +9203,7 @@
                 <w:sz w:val="18"/>
                 <w:szCs w:val="18"/>
               </w:rPr>
-              <w:t xml:space="preserve">Hola, soy Yina Vanessa Cadena Mantilla, estudiante de la Especialización en Gerencia y Auditoría de la Calidad en Salud de UNIMINUTO. En este video analizo, a partir de un caso real de Santander, por qué seguir las guías y los protocolos puede salvar una vida.</w:t>
+              <w:t xml:space="preserve">Hola, soy Yina Vanessa Cadena Mantilla, de la Especialización en Gerencia y Auditoría de la Calidad en Salud de UNIMINUTO. A partir de un caso real de Santander, analizo por qué seguir las guías y los protocolos puede salvar una vida.</w:t>
             </w:r>
           </w:p>
         </w:tc>
@@ -8970,7 +9311,7 @@
                 <w:sz w:val="18"/>
                 <w:szCs w:val="18"/>
               </w:rPr>
-              <w:t xml:space="preserve">0:28 – 0:50</w:t>
+              <w:t xml:space="preserve">0:24 – 0:42</w:t>
             </w:r>
           </w:p>
         </w:tc>
@@ -9004,7 +9345,7 @@
                 <w:sz w:val="18"/>
                 <w:szCs w:val="18"/>
               </w:rPr>
-              <w:t xml:space="preserve">Primero, tres conceptos. Una guía de práctica clínica reúne recomendaciones basadas en la mejor evidencia. Un protocolo las adapta a cada institución y dice quién hace qué. Y un algoritmo resume las decisiones paso a paso. Ninguno reemplaza el juicio clínico: lo orientan.</w:t>
+              <w:t xml:space="preserve">Primero, tres conceptos. La guía de práctica clínica reúne recomendaciones basadas en evidencia; el protocolo las adapta a cada institución, y el algoritmo resume las decisiones paso a paso. Ninguno reemplaza el juicio clínico; todos lo orientan.</w:t>
             </w:r>
           </w:p>
         </w:tc>
@@ -9112,7 +9453,7 @@
                 <w:sz w:val="18"/>
                 <w:szCs w:val="18"/>
               </w:rPr>
-              <w:t xml:space="preserve">0:50 – 1:10</w:t>
+              <w:t xml:space="preserve">0:42 – 0:58</w:t>
             </w:r>
           </w:p>
         </w:tc>
@@ -9146,7 +9487,7 @@
                 <w:sz w:val="18"/>
                 <w:szCs w:val="18"/>
               </w:rPr>
-              <w:t xml:space="preserve">Una guía no se escribe por opinión. Según Torres-Tamayo y colaboradores, parte de preguntas clínicas concretas, busca y califica la evidencia, formula recomendaciones con un grupo de expertos y se actualiza periódicamente. Por eso es confiable.</w:t>
+              <w:t xml:space="preserve">Una guía no se escribe por opinión: según Torres-Tamayo y colaboradores, parte de preguntas clínicas, busca y califica la evidencia, formula recomendaciones y se actualiza periódicamente.</w:t>
             </w:r>
           </w:p>
         </w:tc>
@@ -9254,7 +9595,7 @@
                 <w:sz w:val="18"/>
                 <w:szCs w:val="18"/>
               </w:rPr>
-              <w:t xml:space="preserve">1:10 – 1:30</w:t>
+              <w:t xml:space="preserve">0:58 – 1:16</w:t>
             </w:r>
           </w:p>
         </w:tc>
@@ -9288,7 +9629,7 @@
                 <w:sz w:val="18"/>
                 <w:szCs w:val="18"/>
               </w:rPr>
-              <w:t xml:space="preserve">El caso ocurrió en Santander, el departamento con más casos de dengue del país en 2025, con más de nueve mil casos notificados. En medio de esa epidemia, la guía de dengue era la herramienta clave para decidir quién podía irse a casa y quién no.</w:t>
+              <w:t xml:space="preserve">El caso ocurrió en Santander, el departamento con más casos de dengue del país en 2025: más de nueve mil. En plena epidemia, la guía de dengue era la herramienta clave para decidir quién podía irse a casa y quién no.</w:t>
             </w:r>
           </w:p>
         </w:tc>
@@ -9396,7 +9737,7 @@
                 <w:sz w:val="18"/>
                 <w:szCs w:val="18"/>
               </w:rPr>
-              <w:t xml:space="preserve">1:30 – 1:52</w:t>
+              <w:t xml:space="preserve">1:16 – 1:38</w:t>
             </w:r>
           </w:p>
         </w:tc>
@@ -9538,7 +9879,7 @@
                 <w:sz w:val="18"/>
                 <w:szCs w:val="18"/>
               </w:rPr>
-              <w:t xml:space="preserve">1:52 – 2:17</w:t>
+              <w:t xml:space="preserve">1:38 – 2:03</w:t>
             </w:r>
           </w:p>
         </w:tc>
@@ -9680,7 +10021,7 @@
                 <w:sz w:val="18"/>
                 <w:szCs w:val="18"/>
               </w:rPr>
-              <w:t xml:space="preserve">2:17 – 2:39</w:t>
+              <w:t xml:space="preserve">2:03 – 2:25</w:t>
             </w:r>
           </w:p>
         </w:tc>
@@ -9822,7 +10163,7 @@
                 <w:sz w:val="18"/>
                 <w:szCs w:val="18"/>
               </w:rPr>
-              <w:t xml:space="preserve">2:39 – 3:01</w:t>
+              <w:t xml:space="preserve">2:25 – 2:50</w:t>
             </w:r>
           </w:p>
         </w:tc>
@@ -9856,7 +10197,7 @@
                 <w:sz w:val="18"/>
                 <w:szCs w:val="18"/>
               </w:rPr>
-              <w:t xml:space="preserve">Si el relato de la familia se confirma, la decisión se basó en las plaquetas, un dato que por sí solo no descarta el riesgo. La guía pide clasificar por signos de alarma y asegurar el control diario. Solo la investigación dirá si hubo una falla.</w:t>
+              <w:t xml:space="preserve">Si el relato de la familia se confirma, la decisión se basó en las plaquetas, un dato que por sí solo no descarta el riesgo. Cumplir la guía cambia el desenlace: con clasificación y tratamiento oportunos, la mortalidad del dengue grave baja a menos del 1 %. Solo la investigación dirá si hubo una falla.</w:t>
             </w:r>
           </w:p>
         </w:tc>
@@ -9964,7 +10305,7 @@
                 <w:sz w:val="18"/>
                 <w:szCs w:val="18"/>
               </w:rPr>
-              <w:t xml:space="preserve">3:01 – 3:26</w:t>
+              <w:t xml:space="preserve">2:50 – 3:15</w:t>
             </w:r>
           </w:p>
         </w:tc>
@@ -10106,7 +10447,7 @@
                 <w:sz w:val="18"/>
                 <w:szCs w:val="18"/>
               </w:rPr>
-              <w:t xml:space="preserve">3:26 – 3:48</w:t>
+              <w:t xml:space="preserve">3:15 – 3:40</w:t>
             </w:r>
           </w:p>
         </w:tc>
@@ -10140,7 +10481,7 @@
                 <w:sz w:val="18"/>
                 <w:szCs w:val="18"/>
               </w:rPr>
-              <w:t xml:space="preserve">La normatividad también organiza las guías por cursos de vida. En la gestación, la Resolución 3280 de 2018 adopta la Ruta Materno Perinatal, y las guías de embarazo incluyen el código rojo. En la infancia, la ruta define la valoración integral, y la Resolución 2350 de 2020 orienta la atención de la desnutrición aguda.</w:t>
+              <w:t xml:space="preserve">Las guías también se organizan por cursos de vida. En la gestación, la Ruta Materno Perinatal incluye el código rojo: ante una hemorragia posparto, el equipo actúa en minutos. En la infancia, la ruta define la valoración integral, la Resolución 2350 orienta la desnutrición aguda y la guía de dengue decide, como en este caso, quién se hospitaliza.</w:t>
             </w:r>
           </w:p>
         </w:tc>
@@ -10248,7 +10589,7 @@
                 <w:sz w:val="18"/>
                 <w:szCs w:val="18"/>
               </w:rPr>
-              <w:t xml:space="preserve">3:48 – 4:12</w:t>
+              <w:t xml:space="preserve">3:40 – 4:05</w:t>
             </w:r>
           </w:p>
         </w:tc>
@@ -10282,7 +10623,7 @@
                 <w:sz w:val="18"/>
                 <w:szCs w:val="18"/>
               </w:rPr>
-              <w:t xml:space="preserve">En la adolescencia y la juventud, la ruta incluye la salud sexual y mental, y la Resolución 459 de 2012 fija el protocolo para víctimas de violencia sexual. En la adultez, las guías de hipertensión y diabetes orientan el control del riesgo cardiovascular. Y en la vejez, se suma el Decreto 681 de 2022.</w:t>
+              <w:t xml:space="preserve">En la adolescencia, la Resolución 459 de 2012 obliga a atender a una víctima de violencia sexual como una urgencia, con profilaxis en las primeras 72 horas. En la adultez, las guías de hipertensión y diabetes fijan metas de control. Y en la vejez, la ruta y el Decreto 681 de 2022 priorizan la prevención de caídas.</w:t>
             </w:r>
           </w:p>
         </w:tc>
@@ -10390,7 +10731,7 @@
                 <w:sz w:val="18"/>
                 <w:szCs w:val="18"/>
               </w:rPr>
-              <w:t xml:space="preserve">4:12 – 4:37</w:t>
+              <w:t xml:space="preserve">4:05 – 4:30</w:t>
             </w:r>
           </w:p>
         </w:tc>
@@ -10532,7 +10873,7 @@
                 <w:sz w:val="18"/>
                 <w:szCs w:val="18"/>
               </w:rPr>
-              <w:t xml:space="preserve">4:37 – 4:59</w:t>
+              <w:t xml:space="preserve">4:30 – 4:48</w:t>
             </w:r>
           </w:p>
         </w:tc>
@@ -10566,7 +10907,7 @@
                 <w:sz w:val="18"/>
                 <w:szCs w:val="18"/>
               </w:rPr>
-              <w:t xml:space="preserve">Para que haya responsabilidad deben probarse tres cosas: el daño, la falla y la relación entre ambos. La obligación del médico es de medios, no de resultados; por eso los jueces comparan la atención con la lex artis, y las guías y la historia clínica son la prueba.</w:t>
+              <w:t xml:space="preserve">Para que haya responsabilidad deben probarse el daño, la falla y la relación entre ambos. La obligación es de medios, no de resultados: el juez compara la atención con la lex artis, y la guía y la historia clínica son la prueba.</w:t>
             </w:r>
           </w:p>
         </w:tc>
@@ -10640,7 +10981,7 @@
                 <w:sz w:val="18"/>
                 <w:szCs w:val="18"/>
               </w:rPr>
-              <w:t xml:space="preserve">Consecuencias de no adherirse</w:t>
+              <w:t xml:space="preserve">Consecuencias reales</w:t>
             </w:r>
           </w:p>
         </w:tc>
@@ -10674,7 +11015,7 @@
                 <w:sz w:val="18"/>
                 <w:szCs w:val="18"/>
               </w:rPr>
-              <w:t xml:space="preserve">4:59 – 5:19</w:t>
+              <w:t xml:space="preserve">4:48 – 5:13</w:t>
             </w:r>
           </w:p>
         </w:tc>
@@ -10708,7 +11049,7 @@
                 <w:sz w:val="18"/>
                 <w:szCs w:val="18"/>
               </w:rPr>
-              <w:t xml:space="preserve">¿Qué pasa cuando una institución no se adhiere a sus guías? Hay consecuencias clínicas, como complicaciones y muertes evitables; éticas, como la pérdida de confianza; legales, como demandas y sanciones; e institucionales, como mayores costos y daño a su reputación.</w:t>
+              <w:t xml:space="preserve">Estas consecuencias son reales. En Barrancabermeja, en 2026, un médico fue condenado en primera instancia a cuatro años de prisión por homicidio culposo, tras un procedimiento estético para el que no tenía la especialización requerida. Y en Yarumal, un error en la vía de administración llevó a una paciente a cuidados intensivos y a una investigación.</w:t>
             </w:r>
           </w:p>
         </w:tc>
@@ -10782,7 +11123,7 @@
                 <w:sz w:val="18"/>
                 <w:szCs w:val="18"/>
               </w:rPr>
-              <w:t xml:space="preserve">Barreras para cumplir la guía</w:t>
+              <w:t xml:space="preserve">Consecuencias de no adherirse</w:t>
             </w:r>
           </w:p>
         </w:tc>
@@ -10816,7 +11157,7 @@
                 <w:sz w:val="18"/>
                 <w:szCs w:val="18"/>
               </w:rPr>
-              <w:t xml:space="preserve">5:19 – 5:39</w:t>
+              <w:t xml:space="preserve">5:13 – 5:33</w:t>
             </w:r>
           </w:p>
         </w:tc>
@@ -10850,7 +11191,7 @@
                 <w:sz w:val="18"/>
                 <w:szCs w:val="18"/>
               </w:rPr>
-              <w:t xml:space="preserve">En casos como este, las barreras suelen repetirse: urgencias saturadas durante la epidemia, personal que rota y no conoce la guía, una cultura que decide por un solo dato de laboratorio, y líderes que no miden la adherencia.</w:t>
+              <w:t xml:space="preserve">¿Qué pasa cuando una institución no se adhiere a sus guías? Hay consecuencias clínicas, como muertes evitables; éticas, porque se rompen los principios de no hacer daño y de buscar el bien del paciente; legales, como demandas y sanciones; e institucionales, como mayores costos y pérdida de confianza.</w:t>
             </w:r>
           </w:p>
         </w:tc>
@@ -10924,7 +11265,7 @@
                 <w:sz w:val="18"/>
                 <w:szCs w:val="18"/>
               </w:rPr>
-              <w:t xml:space="preserve">Acciones de mejora</w:t>
+              <w:t xml:space="preserve">Barreras para cumplir la guía</w:t>
             </w:r>
           </w:p>
         </w:tc>
@@ -10958,7 +11299,7 @@
                 <w:sz w:val="18"/>
                 <w:szCs w:val="18"/>
               </w:rPr>
-              <w:t xml:space="preserve">5:39 – 6:04</w:t>
+              <w:t xml:space="preserve">5:33 – 5:51</w:t>
             </w:r>
           </w:p>
         </w:tc>
@@ -10992,7 +11333,7 @@
                 <w:sz w:val="18"/>
                 <w:szCs w:val="18"/>
               </w:rPr>
-              <w:t xml:space="preserve">Propongo acciones realistas: capacitar al personal en la guía de dengue y en las rutas integrales; estandarizar una hoja de egreso con los signos de alarma y la cita de control en 24 horas; hacer auditorías internas de historias clínicas dentro del PAMEC; y realizar simulacros de dengue grave.</w:t>
+              <w:t xml:space="preserve">En casos como este, las barreras suelen repetirse: urgencias saturadas durante la epidemia, personal que rota y no conoce la guía, una cultura que decide por un solo dato de laboratorio, y líderes que no miden la adherencia.</w:t>
             </w:r>
           </w:p>
         </w:tc>
@@ -11066,7 +11407,7 @@
                 <w:sz w:val="18"/>
                 <w:szCs w:val="18"/>
               </w:rPr>
-              <w:t xml:space="preserve">Indicadores de seguimiento</w:t>
+              <w:t xml:space="preserve">Acciones de mejora</w:t>
             </w:r>
           </w:p>
         </w:tc>
@@ -11100,7 +11441,7 @@
                 <w:sz w:val="18"/>
                 <w:szCs w:val="18"/>
               </w:rPr>
-              <w:t xml:space="preserve">6:04 – 6:24</w:t>
+              <w:t xml:space="preserve">5:51 – 6:16</w:t>
             </w:r>
           </w:p>
         </w:tc>
@@ -11134,7 +11475,7 @@
                 <w:sz w:val="18"/>
                 <w:szCs w:val="18"/>
               </w:rPr>
-              <w:t xml:space="preserve">Y para saber si funciona, se miden indicadores: el porcentaje de adherencia a la guía, las reconsultas en menos de 72 horas, los eventos adversos, el tiempo de atención en urgencias y la letalidad por dengue.</w:t>
+              <w:t xml:space="preserve">Propongo acciones realistas: capacitar al personal en la guía de dengue y en las rutas integrales; estandarizar una hoja de egreso con los signos de alarma y la cita de control en 24 horas; hacer auditorías internas de historias clínicas dentro del PAMEC; y realizar simulacros de dengue grave.</w:t>
             </w:r>
           </w:p>
         </w:tc>
@@ -11208,7 +11549,7 @@
                 <w:sz w:val="18"/>
                 <w:szCs w:val="18"/>
               </w:rPr>
-              <w:t xml:space="preserve">Mi postura</w:t>
+              <w:t xml:space="preserve">Indicadores de seguimiento</w:t>
             </w:r>
           </w:p>
         </w:tc>
@@ -11242,7 +11583,7 @@
                 <w:sz w:val="18"/>
                 <w:szCs w:val="18"/>
               </w:rPr>
-              <w:t xml:space="preserve">6:24 – 6:49</w:t>
+              <w:t xml:space="preserve">6:16 – 6:32</w:t>
             </w:r>
           </w:p>
         </w:tc>
@@ -11276,7 +11617,7 @@
                 <w:sz w:val="18"/>
                 <w:szCs w:val="18"/>
               </w:rPr>
-              <w:t xml:space="preserve">¿Las guías limitan la autonomía médica? Mi postura es que no. La guía es el piso, no el techo: garantiza un mínimo de calidad para todos y deja espacio al juicio clínico. Apartarse de ella es posible, pero debe justificarse y quedar escrito en la historia clínica.</w:t>
+              <w:t xml:space="preserve">Para saber si funciona, se miden: la adherencia a la guía, las reconsultas en menos de 72 horas, los eventos adversos, el tiempo de atención y la letalidad por dengue.</w:t>
             </w:r>
           </w:p>
         </w:tc>
@@ -11350,7 +11691,7 @@
                 <w:sz w:val="18"/>
                 <w:szCs w:val="18"/>
               </w:rPr>
-              <w:t xml:space="preserve">Importancia según el marco legal</w:t>
+              <w:t xml:space="preserve">Mi postura</w:t>
             </w:r>
           </w:p>
         </w:tc>
@@ -11384,7 +11725,7 @@
                 <w:sz w:val="18"/>
                 <w:szCs w:val="18"/>
               </w:rPr>
-              <w:t xml:space="preserve">6:49 – 7:09</w:t>
+              <w:t xml:space="preserve">6:32 – 6:54</w:t>
             </w:r>
           </w:p>
         </w:tc>
@@ -11418,7 +11759,7 @@
                 <w:sz w:val="18"/>
                 <w:szCs w:val="18"/>
               </w:rPr>
-              <w:t xml:space="preserve">Por eso, según el marco legal, la adherencia a las guías es clave: protege al paciente, porque reduce errores; protege al profesional, porque demuestra que actuó con diligencia; y protege a la institución, porque es parte de la calidad que exige el sistema.</w:t>
+              <w:t xml:space="preserve">¿Las guías limitan la autonomía médica? Mi postura es que no. La guía es el piso, no el techo: garantiza un mínimo de calidad y deja espacio al juicio clínico. Apartarse de ella es posible, pero debe justificarse en la historia clínica.</w:t>
             </w:r>
           </w:p>
         </w:tc>
@@ -11492,7 +11833,7 @@
                 <w:sz w:val="18"/>
                 <w:szCs w:val="18"/>
               </w:rPr>
-              <w:t xml:space="preserve">Cierre</w:t>
+              <w:t xml:space="preserve">Importancia según el marco legal</w:t>
             </w:r>
           </w:p>
         </w:tc>
@@ -11526,7 +11867,7 @@
                 <w:sz w:val="18"/>
                 <w:szCs w:val="18"/>
               </w:rPr>
-              <w:t xml:space="preserve">7:09 – 7:24</w:t>
+              <w:t xml:space="preserve">6:54 – 7:14</w:t>
             </w:r>
           </w:p>
         </w:tc>
@@ -11560,7 +11901,7 @@
                 <w:sz w:val="18"/>
                 <w:szCs w:val="18"/>
               </w:rPr>
-              <w:t xml:space="preserve">Una guía bien aplicada es una decisión tomada a tiempo. Y en salud, decidir a tiempo es la diferencia entre volver a casa y no volver. Gracias.</w:t>
+              <w:t xml:space="preserve">Por eso, según el marco legal, la adherencia a las guías es clave: protege al paciente, porque reduce errores; protege al profesional, porque demuestra que actuó con diligencia; y protege a la institución, porque es parte de la calidad que exige el sistema.</w:t>
             </w:r>
           </w:p>
         </w:tc>
@@ -11634,7 +11975,7 @@
                 <w:sz w:val="18"/>
                 <w:szCs w:val="18"/>
               </w:rPr>
-              <w:t xml:space="preserve">Referencias</w:t>
+              <w:t xml:space="preserve">Cierre</w:t>
             </w:r>
           </w:p>
         </w:tc>
@@ -11668,7 +12009,7 @@
                 <w:sz w:val="18"/>
                 <w:szCs w:val="18"/>
               </w:rPr>
-              <w:t xml:space="preserve">7:24 – 7:34</w:t>
+              <w:t xml:space="preserve">7:14 – 7:26</w:t>
             </w:r>
           </w:p>
         </w:tc>
@@ -11702,7 +12043,7 @@
                 <w:sz w:val="18"/>
                 <w:szCs w:val="18"/>
               </w:rPr>
-              <w:t xml:space="preserve">(Sin voz.)</w:t>
+              <w:t xml:space="preserve">Una guía bien aplicada es una decisión tomada a tiempo. Y en salud, decidir a tiempo puede salvar una vida. Gracias.</w:t>
             </w:r>
           </w:p>
         </w:tc>
@@ -11776,6 +12117,148 @@
                 <w:sz w:val="18"/>
                 <w:szCs w:val="18"/>
               </w:rPr>
+              <w:t xml:space="preserve">Referencias</w:t>
+            </w:r>
+          </w:p>
+        </w:tc>
+        <w:tc>
+          <w:tcPr>
+            <w:tcW w:type="dxa" w:w="1300"/>
+            <w:tcBorders>
+              <w:top w:val="single" w:color="8EAADB" w:sz="4"/>
+              <w:left w:val="single" w:color="8EAADB" w:sz="4"/>
+              <w:bottom w:val="single" w:color="8EAADB" w:sz="4"/>
+              <w:right w:val="single" w:color="8EAADB" w:sz="4"/>
+            </w:tcBorders>
+            <w:tcMar>
+              <w:top w:type="dxa" w:w="35"/>
+              <w:left w:type="dxa" w:w="80"/>
+              <w:bottom w:type="dxa" w:w="35"/>
+              <w:right w:type="dxa" w:w="80"/>
+            </w:tcMar>
+            <w:vAlign w:val="center"/>
+          </w:tcPr>
+          <w:p>
+            <w:pPr>
+              <w:spacing w:after="20"/>
+            </w:pPr>
+            <w:r>
+              <w:rPr>
+                <w:rFonts w:ascii="Arial" w:cs="Arial" w:eastAsia="Arial" w:hAnsi="Arial"/>
+                <w:b w:val="false"/>
+                <w:bCs w:val="false"/>
+                <w:color w:val="000000"/>
+                <w:sz w:val="18"/>
+                <w:szCs w:val="18"/>
+              </w:rPr>
+              <w:t xml:space="preserve">7:26 – 7:36</w:t>
+            </w:r>
+          </w:p>
+        </w:tc>
+        <w:tc>
+          <w:tcPr>
+            <w:tcW w:type="dxa" w:w="5260"/>
+            <w:tcBorders>
+              <w:top w:val="single" w:color="8EAADB" w:sz="4"/>
+              <w:left w:val="single" w:color="8EAADB" w:sz="4"/>
+              <w:bottom w:val="single" w:color="8EAADB" w:sz="4"/>
+              <w:right w:val="single" w:color="8EAADB" w:sz="4"/>
+            </w:tcBorders>
+            <w:tcMar>
+              <w:top w:type="dxa" w:w="35"/>
+              <w:left w:type="dxa" w:w="80"/>
+              <w:bottom w:type="dxa" w:w="35"/>
+              <w:right w:type="dxa" w:w="80"/>
+            </w:tcMar>
+            <w:vAlign w:val="center"/>
+          </w:tcPr>
+          <w:p>
+            <w:pPr>
+              <w:spacing w:after="20"/>
+            </w:pPr>
+            <w:r>
+              <w:rPr>
+                <w:rFonts w:ascii="Arial" w:cs="Arial" w:eastAsia="Arial" w:hAnsi="Arial"/>
+                <w:b w:val="false"/>
+                <w:bCs w:val="false"/>
+                <w:color w:val="000000"/>
+                <w:sz w:val="18"/>
+                <w:szCs w:val="18"/>
+              </w:rPr>
+              <w:t xml:space="preserve">(Sin voz.)</w:t>
+            </w:r>
+          </w:p>
+        </w:tc>
+      </w:tr>
+      <w:tr>
+        <w:trPr>
+          <w:tblHeader w:val="false"/>
+        </w:trPr>
+        <w:tc>
+          <w:tcPr>
+            <w:tcW w:type="dxa" w:w="700"/>
+            <w:tcBorders>
+              <w:top w:val="single" w:color="8EAADB" w:sz="4"/>
+              <w:left w:val="single" w:color="8EAADB" w:sz="4"/>
+              <w:bottom w:val="single" w:color="8EAADB" w:sz="4"/>
+              <w:right w:val="single" w:color="8EAADB" w:sz="4"/>
+            </w:tcBorders>
+            <w:shd w:fill="DEEAF6" w:color="auto" w:val="clear"/>
+            <w:tcMar>
+              <w:top w:type="dxa" w:w="35"/>
+              <w:left w:type="dxa" w:w="80"/>
+              <w:bottom w:type="dxa" w:w="35"/>
+              <w:right w:type="dxa" w:w="80"/>
+            </w:tcMar>
+            <w:vAlign w:val="center"/>
+          </w:tcPr>
+          <w:p>
+            <w:pPr>
+              <w:spacing w:after="20"/>
+            </w:pPr>
+            <w:r>
+              <w:rPr>
+                <w:rFonts w:ascii="Arial" w:cs="Arial" w:eastAsia="Arial" w:hAnsi="Arial"/>
+                <w:b/>
+                <w:bCs/>
+                <w:color w:val="000000"/>
+                <w:sz w:val="18"/>
+                <w:szCs w:val="18"/>
+              </w:rPr>
+              <w:t xml:space="preserve">24</w:t>
+            </w:r>
+          </w:p>
+        </w:tc>
+        <w:tc>
+          <w:tcPr>
+            <w:tcW w:type="dxa" w:w="2100"/>
+            <w:tcBorders>
+              <w:top w:val="single" w:color="8EAADB" w:sz="4"/>
+              <w:left w:val="single" w:color="8EAADB" w:sz="4"/>
+              <w:bottom w:val="single" w:color="8EAADB" w:sz="4"/>
+              <w:right w:val="single" w:color="8EAADB" w:sz="4"/>
+            </w:tcBorders>
+            <w:tcMar>
+              <w:top w:type="dxa" w:w="35"/>
+              <w:left w:type="dxa" w:w="80"/>
+              <w:bottom w:type="dxa" w:w="35"/>
+              <w:right w:type="dxa" w:w="80"/>
+            </w:tcMar>
+            <w:vAlign w:val="center"/>
+          </w:tcPr>
+          <w:p>
+            <w:pPr>
+              <w:spacing w:after="20"/>
+            </w:pPr>
+            <w:r>
+              <w:rPr>
+                <w:rFonts w:ascii="Arial" w:cs="Arial" w:eastAsia="Arial" w:hAnsi="Arial"/>
+                <w:b w:val="false"/>
+                <w:bCs w:val="false"/>
+                <w:color w:val="000000"/>
+                <w:sz w:val="18"/>
+                <w:szCs w:val="18"/>
+              </w:rPr>
               <w:t xml:space="preserve">Créditos</w:t>
             </w:r>
           </w:p>
@@ -11810,7 +12293,7 @@
                 <w:sz w:val="18"/>
                 <w:szCs w:val="18"/>
               </w:rPr>
-              <w:t xml:space="preserve">7:34 – 7:42</w:t>
+              <w:t xml:space="preserve">7:36 – 7:42</w:t>
             </w:r>
           </w:p>
         </w:tc>
@@ -11919,6 +12402,64 @@
           <w:sz w:val="22"/>
           <w:szCs w:val="22"/>
         </w:rPr>
+        <w:t xml:space="preserve">Editar las tarjetas (opcional): </w:t>
+      </w:r>
+      <w:r>
+        <w:rPr>
+          <w:rFonts w:ascii="Arial" w:cs="Arial" w:eastAsia="Arial" w:hAnsi="Arial"/>
+          <w:sz w:val="22"/>
+          <w:szCs w:val="22"/>
+        </w:rPr>
+        <w:t xml:space="preserve">abra “Tarjetas_editables_Guias_y_Protocolos.pptx” en PowerPoint y cambie lo que necesite (curso, docente, semana, logo). Luego vaya a Archivo → Exportar → Cambiar el tipo de archivo → PNG → Todas las diapositivas. Las notas de cada diapositiva traen la voz en off.</w:t>
+      </w:r>
+    </w:p>
+    <w:p>
+      <w:pPr>
+        <w:pStyle w:val="ListParagraph"/>
+        <w:numPr>
+          <w:ilvl w:val="0"/>
+          <w:numId w:val="2"/>
+        </w:numPr>
+        <w:spacing w:after="60" w:line="290"/>
+        <w:jc w:val="both"/>
+      </w:pPr>
+      <w:r>
+        <w:rPr>
+          <w:rFonts w:ascii="Arial" w:cs="Arial" w:eastAsia="Arial" w:hAnsi="Arial"/>
+          <w:b/>
+          <w:bCs/>
+          <w:sz w:val="22"/>
+          <w:szCs w:val="22"/>
+        </w:rPr>
+        <w:t xml:space="preserve">Escenas OVERLAY editadas: </w:t>
+      </w:r>
+      <w:r>
+        <w:rPr>
+          <w:rFonts w:ascii="Arial" w:cs="Arial" w:eastAsia="Arial" w:hAnsi="Arial"/>
+          <w:sz w:val="22"/>
+          <w:szCs w:val="22"/>
+        </w:rPr>
+        <w:t xml:space="preserve">si modifica las diapositivas 2, 5, 17 o 22, borre el texto gris de indicación, seleccione el panel azul con sus textos, haga clic derecho → Guardar como imagen → PNG. Así la imagen queda con fondo transparente. Si no las modifica, use los PNG “OVERLAY” incluidos.</w:t>
+      </w:r>
+    </w:p>
+    <w:p>
+      <w:pPr>
+        <w:pStyle w:val="ListParagraph"/>
+        <w:numPr>
+          <w:ilvl w:val="0"/>
+          <w:numId w:val="2"/>
+        </w:numPr>
+        <w:spacing w:after="60" w:line="290"/>
+        <w:jc w:val="both"/>
+      </w:pPr>
+      <w:r>
+        <w:rPr>
+          <w:rFonts w:ascii="Arial" w:cs="Arial" w:eastAsia="Arial" w:hAnsi="Arial"/>
+          <w:b/>
+          <w:bCs/>
+          <w:sz w:val="22"/>
+          <w:szCs w:val="22"/>
+        </w:rPr>
         <w:t xml:space="preserve">Importar las tarjetas: </w:t>
       </w:r>
       <w:r>
@@ -11948,7 +12489,7 @@
           <w:sz w:val="22"/>
           <w:szCs w:val="22"/>
         </w:rPr>
-        <w:t xml:space="preserve">Escenas con video de stock (2, 5, 16 y 21): </w:t>
+        <w:t xml:space="preserve">Escenas con video de stock (2, 5, 17 y 22): </w:t>
       </w:r>
       <w:r>
         <w:rPr>
@@ -12506,7 +13047,7 @@
                 <w:sz w:val="18"/>
                 <w:szCs w:val="18"/>
               </w:rPr>
-              <w:t xml:space="preserve">8 s</w:t>
+              <w:t xml:space="preserve">6 s</w:t>
             </w:r>
           </w:p>
         </w:tc>
@@ -12682,7 +13223,7 @@
                 <w:sz w:val="18"/>
                 <w:szCs w:val="18"/>
               </w:rPr>
-              <w:t xml:space="preserve">20 s</w:t>
+              <w:t xml:space="preserve">18 s</w:t>
             </w:r>
           </w:p>
         </w:tc>
@@ -12858,7 +13399,7 @@
                 <w:sz w:val="18"/>
                 <w:szCs w:val="18"/>
               </w:rPr>
-              <w:t xml:space="preserve">22 s</w:t>
+              <w:t xml:space="preserve">18 s</w:t>
             </w:r>
           </w:p>
         </w:tc>
@@ -13034,7 +13575,7 @@
                 <w:sz w:val="18"/>
                 <w:szCs w:val="18"/>
               </w:rPr>
-              <w:t xml:space="preserve">20 s</w:t>
+              <w:t xml:space="preserve">16 s</w:t>
             </w:r>
           </w:p>
         </w:tc>
@@ -13210,7 +13751,7 @@
                 <w:sz w:val="18"/>
                 <w:szCs w:val="18"/>
               </w:rPr>
-              <w:t xml:space="preserve">20 s</w:t>
+              <w:t xml:space="preserve">18 s</w:t>
             </w:r>
           </w:p>
         </w:tc>
@@ -13914,7 +14455,7 @@
                 <w:sz w:val="18"/>
                 <w:szCs w:val="18"/>
               </w:rPr>
-              <w:t xml:space="preserve">22 s</w:t>
+              <w:t xml:space="preserve">25 s</w:t>
             </w:r>
           </w:p>
         </w:tc>
@@ -14266,7 +14807,7 @@
                 <w:sz w:val="18"/>
                 <w:szCs w:val="18"/>
               </w:rPr>
-              <w:t xml:space="preserve">22 s</w:t>
+              <w:t xml:space="preserve">25 s</w:t>
             </w:r>
           </w:p>
         </w:tc>
@@ -14442,7 +14983,7 @@
                 <w:sz w:val="18"/>
                 <w:szCs w:val="18"/>
               </w:rPr>
-              <w:t xml:space="preserve">24 s</w:t>
+              <w:t xml:space="preserve">25 s</w:t>
             </w:r>
           </w:p>
         </w:tc>
@@ -14794,7 +15335,7 @@
                 <w:sz w:val="18"/>
                 <w:szCs w:val="18"/>
               </w:rPr>
-              <w:t xml:space="preserve">22 s</w:t>
+              <w:t xml:space="preserve">18 s</w:t>
             </w:r>
           </w:p>
         </w:tc>
@@ -14868,7 +15409,7 @@
                 <w:sz w:val="18"/>
                 <w:szCs w:val="18"/>
               </w:rPr>
-              <w:t xml:space="preserve">Consecuencias de no adherirse</w:t>
+              <w:t xml:space="preserve">Consecuencias reales</w:t>
             </w:r>
           </w:p>
         </w:tc>
@@ -14970,7 +15511,7 @@
                 <w:sz w:val="18"/>
                 <w:szCs w:val="18"/>
               </w:rPr>
-              <w:t xml:space="preserve">20 s</w:t>
+              <w:t xml:space="preserve">25 s</w:t>
             </w:r>
           </w:p>
         </w:tc>
@@ -15044,7 +15585,7 @@
                 <w:sz w:val="18"/>
                 <w:szCs w:val="18"/>
               </w:rPr>
-              <w:t xml:space="preserve">Barreras para cumplir la guía</w:t>
+              <w:t xml:space="preserve">Consecuencias de no adherirse</w:t>
             </w:r>
           </w:p>
         </w:tc>
@@ -15078,7 +15619,7 @@
                 <w:sz w:val="18"/>
                 <w:szCs w:val="18"/>
               </w:rPr>
-              <w:t xml:space="preserve">16_OVERLAY.png</w:t>
+              <w:t xml:space="preserve">16_tarjeta.png</w:t>
             </w:r>
           </w:p>
         </w:tc>
@@ -15112,7 +15653,7 @@
                 <w:sz w:val="18"/>
                 <w:szCs w:val="18"/>
               </w:rPr>
-              <w:t xml:space="preserve">“busy emergency room”</w:t>
+              <w:t xml:space="preserve">No aplica</w:t>
             </w:r>
           </w:p>
         </w:tc>
@@ -15220,7 +15761,7 @@
                 <w:sz w:val="18"/>
                 <w:szCs w:val="18"/>
               </w:rPr>
-              <w:t xml:space="preserve">Acciones de mejora</w:t>
+              <w:t xml:space="preserve">Barreras para cumplir la guía</w:t>
             </w:r>
           </w:p>
         </w:tc>
@@ -15254,7 +15795,7 @@
                 <w:sz w:val="18"/>
                 <w:szCs w:val="18"/>
               </w:rPr>
-              <w:t xml:space="preserve">17_tarjeta.png</w:t>
+              <w:t xml:space="preserve">17_OVERLAY.png</w:t>
             </w:r>
           </w:p>
         </w:tc>
@@ -15288,7 +15829,7 @@
                 <w:sz w:val="18"/>
                 <w:szCs w:val="18"/>
               </w:rPr>
-              <w:t xml:space="preserve">No aplica</w:t>
+              <w:t xml:space="preserve">“busy emergency room”</w:t>
             </w:r>
           </w:p>
         </w:tc>
@@ -15322,7 +15863,7 @@
                 <w:sz w:val="18"/>
                 <w:szCs w:val="18"/>
               </w:rPr>
-              <w:t xml:space="preserve">25 s</w:t>
+              <w:t xml:space="preserve">18 s</w:t>
             </w:r>
           </w:p>
         </w:tc>
@@ -15396,7 +15937,7 @@
                 <w:sz w:val="18"/>
                 <w:szCs w:val="18"/>
               </w:rPr>
-              <w:t xml:space="preserve">Indicadores de seguimiento</w:t>
+              <w:t xml:space="preserve">Acciones de mejora</w:t>
             </w:r>
           </w:p>
         </w:tc>
@@ -15498,7 +16039,7 @@
                 <w:sz w:val="18"/>
                 <w:szCs w:val="18"/>
               </w:rPr>
-              <w:t xml:space="preserve">20 s</w:t>
+              <w:t xml:space="preserve">25 s</w:t>
             </w:r>
           </w:p>
         </w:tc>
@@ -15572,7 +16113,7 @@
                 <w:sz w:val="18"/>
                 <w:szCs w:val="18"/>
               </w:rPr>
-              <w:t xml:space="preserve">Mi postura</w:t>
+              <w:t xml:space="preserve">Indicadores de seguimiento</w:t>
             </w:r>
           </w:p>
         </w:tc>
@@ -15674,7 +16215,7 @@
                 <w:sz w:val="18"/>
                 <w:szCs w:val="18"/>
               </w:rPr>
-              <w:t xml:space="preserve">25 s</w:t>
+              <w:t xml:space="preserve">16 s</w:t>
             </w:r>
           </w:p>
         </w:tc>
@@ -15748,7 +16289,7 @@
                 <w:sz w:val="18"/>
                 <w:szCs w:val="18"/>
               </w:rPr>
-              <w:t xml:space="preserve">Importancia según el marco legal</w:t>
+              <w:t xml:space="preserve">Mi postura</w:t>
             </w:r>
           </w:p>
         </w:tc>
@@ -15850,7 +16391,7 @@
                 <w:sz w:val="18"/>
                 <w:szCs w:val="18"/>
               </w:rPr>
-              <w:t xml:space="preserve">20 s</w:t>
+              <w:t xml:space="preserve">22 s</w:t>
             </w:r>
           </w:p>
         </w:tc>
@@ -15924,7 +16465,7 @@
                 <w:sz w:val="18"/>
                 <w:szCs w:val="18"/>
               </w:rPr>
-              <w:t xml:space="preserve">Cierre</w:t>
+              <w:t xml:space="preserve">Importancia según el marco legal</w:t>
             </w:r>
           </w:p>
         </w:tc>
@@ -15958,7 +16499,7 @@
                 <w:sz w:val="18"/>
                 <w:szCs w:val="18"/>
               </w:rPr>
-              <w:t xml:space="preserve">21_OVERLAY.png</w:t>
+              <w:t xml:space="preserve">21_tarjeta.png</w:t>
             </w:r>
           </w:p>
         </w:tc>
@@ -15992,7 +16533,7 @@
                 <w:sz w:val="18"/>
                 <w:szCs w:val="18"/>
               </w:rPr>
-              <w:t xml:space="preserve">“doctor child patient”</w:t>
+              <w:t xml:space="preserve">No aplica</w:t>
             </w:r>
           </w:p>
         </w:tc>
@@ -16026,7 +16567,7 @@
                 <w:sz w:val="18"/>
                 <w:szCs w:val="18"/>
               </w:rPr>
-              <w:t xml:space="preserve">15 s</w:t>
+              <w:t xml:space="preserve">20 s</w:t>
             </w:r>
           </w:p>
         </w:tc>
@@ -16100,7 +16641,7 @@
                 <w:sz w:val="18"/>
                 <w:szCs w:val="18"/>
               </w:rPr>
-              <w:t xml:space="preserve">Referencias</w:t>
+              <w:t xml:space="preserve">Cierre</w:t>
             </w:r>
           </w:p>
         </w:tc>
@@ -16134,7 +16675,7 @@
                 <w:sz w:val="18"/>
                 <w:szCs w:val="18"/>
               </w:rPr>
-              <w:t xml:space="preserve">22_tarjeta.png</w:t>
+              <w:t xml:space="preserve">22_OVERLAY.png</w:t>
             </w:r>
           </w:p>
         </w:tc>
@@ -16168,7 +16709,7 @@
                 <w:sz w:val="18"/>
                 <w:szCs w:val="18"/>
               </w:rPr>
-              <w:t xml:space="preserve">No aplica</w:t>
+              <w:t xml:space="preserve">“doctor child patient”</w:t>
             </w:r>
           </w:p>
         </w:tc>
@@ -16202,7 +16743,7 @@
                 <w:sz w:val="18"/>
                 <w:szCs w:val="18"/>
               </w:rPr>
-              <w:t xml:space="preserve">10 s</w:t>
+              <w:t xml:space="preserve">12 s</w:t>
             </w:r>
           </w:p>
         </w:tc>
@@ -16276,6 +16817,182 @@
                 <w:sz w:val="18"/>
                 <w:szCs w:val="18"/>
               </w:rPr>
+              <w:t xml:space="preserve">Referencias</w:t>
+            </w:r>
+          </w:p>
+        </w:tc>
+        <w:tc>
+          <w:tcPr>
+            <w:tcW w:type="dxa" w:w="2500"/>
+            <w:tcBorders>
+              <w:top w:val="single" w:color="8EAADB" w:sz="4"/>
+              <w:left w:val="single" w:color="8EAADB" w:sz="4"/>
+              <w:bottom w:val="single" w:color="8EAADB" w:sz="4"/>
+              <w:right w:val="single" w:color="8EAADB" w:sz="4"/>
+            </w:tcBorders>
+            <w:tcMar>
+              <w:top w:type="dxa" w:w="35"/>
+              <w:left w:type="dxa" w:w="80"/>
+              <w:bottom w:type="dxa" w:w="35"/>
+              <w:right w:type="dxa" w:w="80"/>
+            </w:tcMar>
+            <w:vAlign w:val="center"/>
+          </w:tcPr>
+          <w:p>
+            <w:pPr>
+              <w:spacing w:after="20"/>
+            </w:pPr>
+            <w:r>
+              <w:rPr>
+                <w:rFonts w:ascii="Arial" w:cs="Arial" w:eastAsia="Arial" w:hAnsi="Arial"/>
+                <w:b w:val="false"/>
+                <w:bCs w:val="false"/>
+                <w:color w:val="000000"/>
+                <w:sz w:val="18"/>
+                <w:szCs w:val="18"/>
+              </w:rPr>
+              <w:t xml:space="preserve">23_tarjeta.png</w:t>
+            </w:r>
+          </w:p>
+        </w:tc>
+        <w:tc>
+          <w:tcPr>
+            <w:tcW w:type="dxa" w:w="2460"/>
+            <w:tcBorders>
+              <w:top w:val="single" w:color="8EAADB" w:sz="4"/>
+              <w:left w:val="single" w:color="8EAADB" w:sz="4"/>
+              <w:bottom w:val="single" w:color="8EAADB" w:sz="4"/>
+              <w:right w:val="single" w:color="8EAADB" w:sz="4"/>
+            </w:tcBorders>
+            <w:tcMar>
+              <w:top w:type="dxa" w:w="35"/>
+              <w:left w:type="dxa" w:w="80"/>
+              <w:bottom w:type="dxa" w:w="35"/>
+              <w:right w:type="dxa" w:w="80"/>
+            </w:tcMar>
+            <w:vAlign w:val="center"/>
+          </w:tcPr>
+          <w:p>
+            <w:pPr>
+              <w:spacing w:after="20"/>
+            </w:pPr>
+            <w:r>
+              <w:rPr>
+                <w:rFonts w:ascii="Arial" w:cs="Arial" w:eastAsia="Arial" w:hAnsi="Arial"/>
+                <w:b w:val="false"/>
+                <w:bCs w:val="false"/>
+                <w:color w:val="000000"/>
+                <w:sz w:val="18"/>
+                <w:szCs w:val="18"/>
+              </w:rPr>
+              <w:t xml:space="preserve">No aplica</w:t>
+            </w:r>
+          </w:p>
+        </w:tc>
+        <w:tc>
+          <w:tcPr>
+            <w:tcW w:type="dxa" w:w="1000"/>
+            <w:tcBorders>
+              <w:top w:val="single" w:color="8EAADB" w:sz="4"/>
+              <w:left w:val="single" w:color="8EAADB" w:sz="4"/>
+              <w:bottom w:val="single" w:color="8EAADB" w:sz="4"/>
+              <w:right w:val="single" w:color="8EAADB" w:sz="4"/>
+            </w:tcBorders>
+            <w:tcMar>
+              <w:top w:type="dxa" w:w="35"/>
+              <w:left w:type="dxa" w:w="80"/>
+              <w:bottom w:type="dxa" w:w="35"/>
+              <w:right w:type="dxa" w:w="80"/>
+            </w:tcMar>
+            <w:vAlign w:val="center"/>
+          </w:tcPr>
+          <w:p>
+            <w:pPr>
+              <w:spacing w:after="20"/>
+            </w:pPr>
+            <w:r>
+              <w:rPr>
+                <w:rFonts w:ascii="Arial" w:cs="Arial" w:eastAsia="Arial" w:hAnsi="Arial"/>
+                <w:b w:val="false"/>
+                <w:bCs w:val="false"/>
+                <w:color w:val="000000"/>
+                <w:sz w:val="18"/>
+                <w:szCs w:val="18"/>
+              </w:rPr>
+              <w:t xml:space="preserve">10 s</w:t>
+            </w:r>
+          </w:p>
+        </w:tc>
+      </w:tr>
+      <w:tr>
+        <w:trPr>
+          <w:tblHeader w:val="false"/>
+        </w:trPr>
+        <w:tc>
+          <w:tcPr>
+            <w:tcW w:type="dxa" w:w="700"/>
+            <w:tcBorders>
+              <w:top w:val="single" w:color="8EAADB" w:sz="4"/>
+              <w:left w:val="single" w:color="8EAADB" w:sz="4"/>
+              <w:bottom w:val="single" w:color="8EAADB" w:sz="4"/>
+              <w:right w:val="single" w:color="8EAADB" w:sz="4"/>
+            </w:tcBorders>
+            <w:shd w:fill="DEEAF6" w:color="auto" w:val="clear"/>
+            <w:tcMar>
+              <w:top w:type="dxa" w:w="35"/>
+              <w:left w:type="dxa" w:w="80"/>
+              <w:bottom w:type="dxa" w:w="35"/>
+              <w:right w:type="dxa" w:w="80"/>
+            </w:tcMar>
+            <w:vAlign w:val="center"/>
+          </w:tcPr>
+          <w:p>
+            <w:pPr>
+              <w:spacing w:after="20"/>
+            </w:pPr>
+            <w:r>
+              <w:rPr>
+                <w:rFonts w:ascii="Arial" w:cs="Arial" w:eastAsia="Arial" w:hAnsi="Arial"/>
+                <w:b/>
+                <w:bCs/>
+                <w:color w:val="000000"/>
+                <w:sz w:val="18"/>
+                <w:szCs w:val="18"/>
+              </w:rPr>
+              <w:t xml:space="preserve">24</w:t>
+            </w:r>
+          </w:p>
+        </w:tc>
+        <w:tc>
+          <w:tcPr>
+            <w:tcW w:type="dxa" w:w="2700"/>
+            <w:tcBorders>
+              <w:top w:val="single" w:color="8EAADB" w:sz="4"/>
+              <w:left w:val="single" w:color="8EAADB" w:sz="4"/>
+              <w:bottom w:val="single" w:color="8EAADB" w:sz="4"/>
+              <w:right w:val="single" w:color="8EAADB" w:sz="4"/>
+            </w:tcBorders>
+            <w:tcMar>
+              <w:top w:type="dxa" w:w="35"/>
+              <w:left w:type="dxa" w:w="80"/>
+              <w:bottom w:type="dxa" w:w="35"/>
+              <w:right w:type="dxa" w:w="80"/>
+            </w:tcMar>
+            <w:vAlign w:val="center"/>
+          </w:tcPr>
+          <w:p>
+            <w:pPr>
+              <w:spacing w:after="20"/>
+            </w:pPr>
+            <w:r>
+              <w:rPr>
+                <w:rFonts w:ascii="Arial" w:cs="Arial" w:eastAsia="Arial" w:hAnsi="Arial"/>
+                <w:b w:val="false"/>
+                <w:bCs w:val="false"/>
+                <w:color w:val="000000"/>
+                <w:sz w:val="18"/>
+                <w:szCs w:val="18"/>
+              </w:rPr>
               <w:t xml:space="preserve">Créditos</w:t>
             </w:r>
           </w:p>
@@ -16310,7 +17027,7 @@
                 <w:sz w:val="18"/>
                 <w:szCs w:val="18"/>
               </w:rPr>
-              <w:t xml:space="preserve">23_tarjeta.png</w:t>
+              <w:t xml:space="preserve">24_tarjeta.png</w:t>
             </w:r>
           </w:p>
         </w:tc>
@@ -16378,7 +17095,7 @@
                 <w:sz w:val="18"/>
                 <w:szCs w:val="18"/>
               </w:rPr>
-              <w:t xml:space="preserve">8 s</w:t>
+              <w:t xml:space="preserve">6 s</w:t>
             </w:r>
           </w:p>
         </w:tc>
@@ -16625,7 +17342,41 @@
           <w:sz w:val="22"/>
           <w:szCs w:val="22"/>
         </w:rPr>
+        <w:t xml:space="preserve">El Colombiano. (2026, febrero). Condenan a médico a 4 años por homicidio culposo tras negligencia en cirugía estética en Barrancabermeja. https://www.elcolombiano.com/colombia/condenan-medico-4-anos-homicidio-culposo-cirugia-estetica-barrancabermeja-HC33134344</w:t>
+      </w:r>
+    </w:p>
+    <w:p>
+      <w:pPr>
+        <w:spacing w:after="100" w:line="276"/>
+        <w:ind w:left="567" w:hanging="567"/>
+        <w:jc w:val="left"/>
+      </w:pPr>
+      <w:r>
+        <w:rPr>
+          <w:rFonts w:ascii="Arial" w:cs="Arial" w:eastAsia="Arial" w:hAnsi="Arial"/>
+          <w:i w:val="false"/>
+          <w:iCs w:val="false"/>
+          <w:sz w:val="22"/>
+          <w:szCs w:val="22"/>
+        </w:rPr>
         <w:t xml:space="preserve">El Tiempo. (2025, noviembre). La preocupante historia de niña que murió por dengue en Bucaramanga: denuncian que en primer hospital la devolvieron para cuidado en casa y falleció. https://www.eltiempo.com/colombia/santander/la-preocupante-historia-de-nina-que-murio-por-dengue-en-bucaramanga-denuncian-que-en-primer-hospital-la-devolvieron-para-cuidado-en-casa-y-fallecio-3505931</w:t>
+      </w:r>
+    </w:p>
+    <w:p>
+      <w:pPr>
+        <w:spacing w:after="100" w:line="276"/>
+        <w:ind w:left="567" w:hanging="567"/>
+        <w:jc w:val="left"/>
+      </w:pPr>
+      <w:r>
+        <w:rPr>
+          <w:rFonts w:ascii="Arial" w:cs="Arial" w:eastAsia="Arial" w:hAnsi="Arial"/>
+          <w:i w:val="false"/>
+          <w:iCs w:val="false"/>
+          <w:sz w:val="22"/>
+          <w:szCs w:val="22"/>
+        </w:rPr>
+        <w:t xml:space="preserve">ESE Hospital San Juan de Dios de Yarumal. (2026, 22 de abril). Comunicado a la opinión pública sobre el evento adverso en el servicio de urgencias.</w:t>
       </w:r>
     </w:p>
     <w:p>
@@ -16907,6 +17658,23 @@
           <w:szCs w:val="22"/>
         </w:rPr>
         <w:t xml:space="preserve">. OPS.</w:t>
+      </w:r>
+    </w:p>
+    <w:p>
+      <w:pPr>
+        <w:spacing w:after="100" w:line="276"/>
+        <w:ind w:left="567" w:hanging="567"/>
+        <w:jc w:val="left"/>
+      </w:pPr>
+      <w:r>
+        <w:rPr>
+          <w:rFonts w:ascii="Arial" w:cs="Arial" w:eastAsia="Arial" w:hAnsi="Arial"/>
+          <w:i w:val="false"/>
+          <w:iCs w:val="false"/>
+          <w:sz w:val="22"/>
+          <w:szCs w:val="22"/>
+        </w:rPr>
+        <w:t xml:space="preserve">Organización Panamericana de la Salud. (2026, 20 de febrero). OPS actualiza situación del dengue en las Américas y recomienda reforzar la vigilancia. https://www.paho.org/es/noticias/20-2-2026-ops-actualiza-situacion-dengue-americas-recomienda-reforzar-vigilancia</w:t>
       </w:r>
     </w:p>
     <w:p>

</xml_diff>

<commit_message>
Video guías y protocolos: guion con el nuevo inicio (4 textos de 10 s) y duración 7:50
Co-Authored-By: Claude Opus 5.5 <noreply@anthropic.com>
Claude-Session: https://claude.ai/code/session_01XuLJcNgUM3tZLL1ekwQRQZ
</commit_message>
<xml_diff>
--- a/Actividades/Video_Guias_Protocolos_Clipchamp/Guion_Video_Guias_y_Protocolos.docx
+++ b/Actividades/Video_Guias_Protocolos_Clipchamp/Guion_Video_Guias_y_Protocolos.docx
@@ -111,7 +111,7 @@
           <w:sz w:val="24"/>
           <w:szCs w:val="24"/>
         </w:rPr>
-        <w:t xml:space="preserve">Curso: [Nombre del curso]</w:t>
+        <w:t xml:space="preserve">Curso: Normatividad Regulación Salud</w:t>
       </w:r>
     </w:p>
     <w:p>
@@ -127,7 +127,7 @@
           <w:sz w:val="24"/>
           <w:szCs w:val="24"/>
         </w:rPr>
-        <w:t xml:space="preserve">Semana [N.º]: Video. Análisis de la importancia de las guías y protocolos en salud</w:t>
+        <w:t xml:space="preserve">Semana 8: Video. Análisis de la importancia de las guías y protocolos en salud</w:t>
       </w:r>
     </w:p>
     <w:p>
@@ -143,7 +143,7 @@
           <w:sz w:val="24"/>
           <w:szCs w:val="24"/>
         </w:rPr>
-        <w:t xml:space="preserve">Docente: [Nombre del docente]</w:t>
+        <w:t xml:space="preserve">Docente: Martha Cecilia Ordoñez Ocasion</w:t>
       </w:r>
     </w:p>
     <w:p>
@@ -3383,7 +3383,7 @@
           <w:sz w:val="22"/>
           <w:szCs w:val="22"/>
         </w:rPr>
-        <w:t xml:space="preserve">7:42 (24 escenas), dentro del rango de 5 a 8 minutos. </w:t>
+        <w:t xml:space="preserve">7:50 (26 escenas), dentro del rango de 5 a 8 minutos. </w:t>
       </w:r>
       <w:r>
         <w:rPr>
@@ -3758,7 +3758,7 @@
                 <w:sz w:val="18"/>
                 <w:szCs w:val="18"/>
               </w:rPr>
-              <w:t xml:space="preserve">0:00 – 0:06</w:t>
+              <w:t xml:space="preserve">0:00 – 0:10</w:t>
             </w:r>
           </w:p>
         </w:tc>
@@ -3792,7 +3792,7 @@
                 <w:sz w:val="18"/>
                 <w:szCs w:val="18"/>
               </w:rPr>
-              <w:t xml:space="preserve">Tarjeta de portada: título, tema, logo de UNIMINUTO, nombre, curso y semana.</w:t>
+              <w:t xml:space="preserve">Portada con fondo verde y video de pasillo de hospital a la derecha; logo de UNIMINUTO, título, tema, nombre, curso y docente.</w:t>
             </w:r>
           </w:p>
         </w:tc>
@@ -3826,7 +3826,7 @@
                 <w:sz w:val="18"/>
                 <w:szCs w:val="18"/>
               </w:rPr>
-              <w:t xml:space="preserve">La guía no es un papel · Análisis de la importancia de las guías y protocolos en salud</w:t>
+              <w:t xml:space="preserve">Video · Semana 8 · La guía no es un papel · Análisis de la importancia de las guías y protocolos en salud</w:t>
             </w:r>
           </w:p>
         </w:tc>
@@ -3894,7 +3894,7 @@
                 <w:sz w:val="18"/>
                 <w:szCs w:val="18"/>
               </w:rPr>
-              <w:t xml:space="preserve">6 s</w:t>
+              <w:t xml:space="preserve">10 s</w:t>
             </w:r>
           </w:p>
         </w:tc>
@@ -3934,7 +3934,7 @@
                 <w:sz w:val="18"/>
                 <w:szCs w:val="18"/>
               </w:rPr>
-              <w:t xml:space="preserve">2. Presentación</w:t>
+              <w:t xml:space="preserve">2. Un caso real</w:t>
             </w:r>
           </w:p>
         </w:tc>
@@ -3968,7 +3968,7 @@
                 <w:sz w:val="18"/>
                 <w:szCs w:val="18"/>
               </w:rPr>
-              <w:t xml:space="preserve">0:06 – 0:24</w:t>
+              <w:t xml:space="preserve">0:10 – 0:20</w:t>
             </w:r>
           </w:p>
         </w:tc>
@@ -4002,7 +4002,7 @@
                 <w:sz w:val="18"/>
                 <w:szCs w:val="18"/>
               </w:rPr>
-              <w:t xml:space="preserve">Video de stock de un pasillo de hospital; panel lateral con el nombre y el objetivo. Video de stock: “hospital corridor”.</w:t>
+              <w:t xml:space="preserve">Panel verde con el texto y video de stock de un pasillo de hospital. Video de stock: “hospital corridor”.</w:t>
             </w:r>
           </w:p>
         </w:tc>
@@ -4036,7 +4036,7 @@
                 <w:sz w:val="18"/>
                 <w:szCs w:val="18"/>
               </w:rPr>
-              <w:t xml:space="preserve">Un caso real · Santander, 2025</w:t>
+              <w:t xml:space="preserve">Un caso real · Santander, 2025 · ¿Por qué seguir la guía puede salvar una vida?</w:t>
             </w:r>
           </w:p>
         </w:tc>
@@ -4104,7 +4104,7 @@
                 <w:sz w:val="18"/>
                 <w:szCs w:val="18"/>
               </w:rPr>
-              <w:t xml:space="preserve">18 s</w:t>
+              <w:t xml:space="preserve">10 s</w:t>
             </w:r>
           </w:p>
         </w:tc>
@@ -4144,7 +4144,7 @@
                 <w:sz w:val="18"/>
                 <w:szCs w:val="18"/>
               </w:rPr>
-              <w:t xml:space="preserve">3. Guía, protocolo y algoritmo</w:t>
+              <w:t xml:space="preserve">3. Frase de arranque</w:t>
             </w:r>
           </w:p>
         </w:tc>
@@ -4178,7 +4178,7 @@
                 <w:sz w:val="18"/>
                 <w:szCs w:val="18"/>
               </w:rPr>
-              <w:t xml:space="preserve">0:24 – 0:42</w:t>
+              <w:t xml:space="preserve">0:20 – 0:30</w:t>
             </w:r>
           </w:p>
         </w:tc>
@@ -4212,7 +4212,7 @@
                 <w:sz w:val="18"/>
                 <w:szCs w:val="18"/>
               </w:rPr>
-              <w:t xml:space="preserve">Tres tarjetas con íconos: libro (guía), lista de chequeo (protocolo) y flechas de decisión (algoritmo).</w:t>
+              <w:t xml:space="preserve">Fondo verde con hojas; texto animado que aparece por partes.</w:t>
             </w:r>
           </w:p>
         </w:tc>
@@ -4246,7 +4246,7 @@
                 <w:sz w:val="18"/>
                 <w:szCs w:val="18"/>
               </w:rPr>
-              <w:t xml:space="preserve">Guía · Protocolo · Algoritmo</w:t>
+              <w:t xml:space="preserve">¿Qué separa una consulta de rutina de una tragedia? Muchas veces, seguir o no seguir una guía.</w:t>
             </w:r>
           </w:p>
         </w:tc>
@@ -4314,7 +4314,7 @@
                 <w:sz w:val="18"/>
                 <w:szCs w:val="18"/>
               </w:rPr>
-              <w:t xml:space="preserve">18 s</w:t>
+              <w:t xml:space="preserve">10 s</w:t>
             </w:r>
           </w:p>
         </w:tc>
@@ -4354,7 +4354,7 @@
                 <w:sz w:val="18"/>
                 <w:szCs w:val="18"/>
               </w:rPr>
-              <w:t xml:space="preserve">4. ¿Cómo se construye una guía?</w:t>
+              <w:t xml:space="preserve">4. Lo que veremos</w:t>
             </w:r>
           </w:p>
         </w:tc>
@@ -4388,7 +4388,7 @@
                 <w:sz w:val="18"/>
                 <w:szCs w:val="18"/>
               </w:rPr>
-              <w:t xml:space="preserve">0:42 – 0:58</w:t>
+              <w:t xml:space="preserve">0:30 – 0:40</w:t>
             </w:r>
           </w:p>
         </w:tc>
@@ -4422,7 +4422,7 @@
                 <w:sz w:val="18"/>
                 <w:szCs w:val="18"/>
               </w:rPr>
-              <w:t xml:space="preserve">Flujo de cinco pasos con flechas: pregunta clínica, búsqueda de evidencia, calificación, recomendaciones y actualización.</w:t>
+              <w:t xml:space="preserve">Video de stock de un pasillo de hospital con un recuadro beige y el texto del recorrido del video. Video de stock: “hospital corridor”.</w:t>
             </w:r>
           </w:p>
         </w:tc>
@@ -4456,7 +4456,7 @@
                 <w:sz w:val="18"/>
                 <w:szCs w:val="18"/>
               </w:rPr>
-              <w:t xml:space="preserve">Pregunta → Evidencia → Calificación → Recomendación → Actualización</w:t>
+              <w:t xml:space="preserve">En este video veremos qué son las guías, un caso real, lo que dice la norma y lo que podemos mejorar. Empecemos por lo básico.</w:t>
             </w:r>
           </w:p>
         </w:tc>
@@ -4524,7 +4524,7 @@
                 <w:sz w:val="18"/>
                 <w:szCs w:val="18"/>
               </w:rPr>
-              <w:t xml:space="preserve">16 s</w:t>
+              <w:t xml:space="preserve">10 s</w:t>
             </w:r>
           </w:p>
         </w:tc>
@@ -4564,7 +4564,7 @@
                 <w:sz w:val="18"/>
                 <w:szCs w:val="18"/>
               </w:rPr>
-              <w:t xml:space="preserve">5. Contexto: dengue en Santander</w:t>
+              <w:t xml:space="preserve">5. Guía, protocolo y algoritmo</w:t>
             </w:r>
           </w:p>
         </w:tc>
@@ -4598,7 +4598,7 @@
                 <w:sz w:val="18"/>
                 <w:szCs w:val="18"/>
               </w:rPr>
-              <w:t xml:space="preserve">0:58 – 1:16</w:t>
+              <w:t xml:space="preserve">0:40 – 0:56</w:t>
             </w:r>
           </w:p>
         </w:tc>
@@ -4632,7 +4632,7 @@
                 <w:sz w:val="18"/>
                 <w:szCs w:val="18"/>
               </w:rPr>
-              <w:t xml:space="preserve">Video de stock de un mosquito o de fumigación; panel con la cifra destacada. Video de stock: “mosquito”.</w:t>
+              <w:t xml:space="preserve">Tres tarjetas con íconos: libro (guía), lista de chequeo (protocolo) y flechas de decisión (algoritmo).</w:t>
             </w:r>
           </w:p>
         </w:tc>
@@ -4666,7 +4666,7 @@
                 <w:sz w:val="18"/>
                 <w:szCs w:val="18"/>
               </w:rPr>
-              <w:t xml:space="preserve">Santander, 2025: más de 9.000 casos de dengue</w:t>
+              <w:t xml:space="preserve">Guía · Protocolo · Algoritmo</w:t>
             </w:r>
           </w:p>
         </w:tc>
@@ -4700,7 +4700,7 @@
                 <w:sz w:val="18"/>
                 <w:szCs w:val="18"/>
               </w:rPr>
-              <w:t xml:space="preserve">Voz en off. Música: tensión suave.</w:t>
+              <w:t xml:space="preserve">Voz en off. Música: suave.</w:t>
             </w:r>
           </w:p>
         </w:tc>
@@ -4734,7 +4734,7 @@
                 <w:sz w:val="18"/>
                 <w:szCs w:val="18"/>
               </w:rPr>
-              <w:t xml:space="preserve">18 s</w:t>
+              <w:t xml:space="preserve">16 s</w:t>
             </w:r>
           </w:p>
         </w:tc>
@@ -4774,7 +4774,7 @@
                 <w:sz w:val="18"/>
                 <w:szCs w:val="18"/>
               </w:rPr>
-              <w:t xml:space="preserve">6. El caso</w:t>
+              <w:t xml:space="preserve">6. ¿Cómo se construye una guía?</w:t>
             </w:r>
           </w:p>
         </w:tc>
@@ -4808,7 +4808,7 @@
                 <w:sz w:val="18"/>
                 <w:szCs w:val="18"/>
               </w:rPr>
-              <w:t xml:space="preserve">1:16 – 1:38</w:t>
+              <w:t xml:space="preserve">0:56 – 1:12</w:t>
             </w:r>
           </w:p>
         </w:tc>
@@ -4842,7 +4842,7 @@
                 <w:sz w:val="18"/>
                 <w:szCs w:val="18"/>
               </w:rPr>
-              <w:t xml:space="preserve">Línea de tiempo del 26 de octubre al 1 de noviembre de 2025, con la fuente y la aclaración de que el caso está en investigación.</w:t>
+              <w:t xml:space="preserve">Flujo de cinco pasos con flechas: pregunta clínica, búsqueda de evidencia, calificación, recomendaciones y actualización.</w:t>
             </w:r>
           </w:p>
         </w:tc>
@@ -4876,7 +4876,7 @@
                 <w:sz w:val="18"/>
                 <w:szCs w:val="18"/>
               </w:rPr>
-              <w:t xml:space="preserve">Floridablanca, octubre de 2025 · Caso en investigación</w:t>
+              <w:t xml:space="preserve">Pregunta → Evidencia → Calificación → Recomendación → Actualización</w:t>
             </w:r>
           </w:p>
         </w:tc>
@@ -4910,7 +4910,7 @@
                 <w:sz w:val="18"/>
                 <w:szCs w:val="18"/>
               </w:rPr>
-              <w:t xml:space="preserve">Voz en off. Música: tensión suave.</w:t>
+              <w:t xml:space="preserve">Voz en off. Música: suave.</w:t>
             </w:r>
           </w:p>
         </w:tc>
@@ -4944,7 +4944,7 @@
                 <w:sz w:val="18"/>
                 <w:szCs w:val="18"/>
               </w:rPr>
-              <w:t xml:space="preserve">22 s</w:t>
+              <w:t xml:space="preserve">16 s</w:t>
             </w:r>
           </w:p>
         </w:tc>
@@ -4984,7 +4984,7 @@
                 <w:sz w:val="18"/>
                 <w:szCs w:val="18"/>
               </w:rPr>
-              <w:t xml:space="preserve">7. Lo que dice la guía: clasificación</w:t>
+              <w:t xml:space="preserve">7. Contexto: dengue en Santander</w:t>
             </w:r>
           </w:p>
         </w:tc>
@@ -5018,7 +5018,7 @@
                 <w:sz w:val="18"/>
                 <w:szCs w:val="18"/>
               </w:rPr>
-              <w:t xml:space="preserve">1:38 – 2:03</w:t>
+              <w:t xml:space="preserve">1:12 – 1:26</w:t>
             </w:r>
           </w:p>
         </w:tc>
@@ -5052,7 +5052,7 @@
                 <w:sz w:val="18"/>
                 <w:szCs w:val="18"/>
               </w:rPr>
-              <w:t xml:space="preserve">Tres columnas de colores: grupo A (casa con control diario), grupo B (hospitalización) y grupo C (cuidado intensivo).</w:t>
+              <w:t xml:space="preserve">Video de stock de un mosquito o de fumigación; panel con la cifra destacada. Video de stock: “mosquito”.</w:t>
             </w:r>
           </w:p>
         </w:tc>
@@ -5086,7 +5086,7 @@
                 <w:sz w:val="18"/>
                 <w:szCs w:val="18"/>
               </w:rPr>
-              <w:t xml:space="preserve">Grupo A · Grupo B · Grupo C</w:t>
+              <w:t xml:space="preserve">Santander, 2025: más de 9.000 casos de dengue</w:t>
             </w:r>
           </w:p>
         </w:tc>
@@ -5120,7 +5120,7 @@
                 <w:sz w:val="18"/>
                 <w:szCs w:val="18"/>
               </w:rPr>
-              <w:t xml:space="preserve">Voz en off. Música: suave.</w:t>
+              <w:t xml:space="preserve">Voz en off. Música: tensión suave.</w:t>
             </w:r>
           </w:p>
         </w:tc>
@@ -5154,7 +5154,7 @@
                 <w:sz w:val="18"/>
                 <w:szCs w:val="18"/>
               </w:rPr>
-              <w:t xml:space="preserve">25 s</w:t>
+              <w:t xml:space="preserve">14 s</w:t>
             </w:r>
           </w:p>
         </w:tc>
@@ -5194,7 +5194,7 @@
                 <w:sz w:val="18"/>
                 <w:szCs w:val="18"/>
               </w:rPr>
-              <w:t xml:space="preserve">8. Signos de alarma y fase crítica</w:t>
+              <w:t xml:space="preserve">8. El caso</w:t>
             </w:r>
           </w:p>
         </w:tc>
@@ -5228,7 +5228,7 @@
                 <w:sz w:val="18"/>
                 <w:szCs w:val="18"/>
               </w:rPr>
-              <w:t xml:space="preserve">2:03 – 2:25</w:t>
+              <w:t xml:space="preserve">1:26 – 1:48</w:t>
             </w:r>
           </w:p>
         </w:tc>
@@ -5262,7 +5262,7 @@
                 <w:sz w:val="18"/>
                 <w:szCs w:val="18"/>
               </w:rPr>
-              <w:t xml:space="preserve">Lista de signos de alarma con íconos y una barra de días de enfermedad que resalta la fase crítica (días 3 a 7).</w:t>
+              <w:t xml:space="preserve">Línea de tiempo del 26 de octubre al 1 de noviembre de 2025, con la fuente y la aclaración de que el caso está en investigación.</w:t>
             </w:r>
           </w:p>
         </w:tc>
@@ -5296,7 +5296,7 @@
                 <w:sz w:val="18"/>
                 <w:szCs w:val="18"/>
               </w:rPr>
-              <w:t xml:space="preserve">La fase crítica llega cuando baja la fiebre · Plaquetas normales no descartan el riesgo</w:t>
+              <w:t xml:space="preserve">Floridablanca, octubre de 2025 · Caso en investigación</w:t>
             </w:r>
           </w:p>
         </w:tc>
@@ -5330,7 +5330,7 @@
                 <w:sz w:val="18"/>
                 <w:szCs w:val="18"/>
               </w:rPr>
-              <w:t xml:space="preserve">Voz en off. Música: suave.</w:t>
+              <w:t xml:space="preserve">Voz en off. Música: tensión suave.</w:t>
             </w:r>
           </w:p>
         </w:tc>
@@ -5404,7 +5404,7 @@
                 <w:sz w:val="18"/>
                 <w:szCs w:val="18"/>
               </w:rPr>
-              <w:t xml:space="preserve">9. La guía frente al caso</w:t>
+              <w:t xml:space="preserve">9. Lo que dice la guía: clasificación</w:t>
             </w:r>
           </w:p>
         </w:tc>
@@ -5438,7 +5438,7 @@
                 <w:sz w:val="18"/>
                 <w:szCs w:val="18"/>
               </w:rPr>
-              <w:t xml:space="preserve">2:25 – 2:50</w:t>
+              <w:t xml:space="preserve">1:48 – 2:13</w:t>
             </w:r>
           </w:p>
         </w:tc>
@@ -5472,7 +5472,7 @@
                 <w:sz w:val="18"/>
                 <w:szCs w:val="18"/>
               </w:rPr>
-              <w:t xml:space="preserve">Comparación en dos columnas (lo que exige la guía y lo que reporta la familia) y una franja con la consecuencia de cumplirla.</w:t>
+              <w:t xml:space="preserve">Tres columnas de colores: grupo A (casa con control diario), grupo B (hospitalización) y grupo C (cuidado intensivo).</w:t>
             </w:r>
           </w:p>
         </w:tc>
@@ -5506,7 +5506,7 @@
                 <w:sz w:val="18"/>
                 <w:szCs w:val="18"/>
               </w:rPr>
-              <w:t xml:space="preserve">Lo que exige la guía · Lo que reporta la familia · Si se cumple la guía: letalidad menor al 1 %</w:t>
+              <w:t xml:space="preserve">Grupo A · Grupo B · Grupo C</w:t>
             </w:r>
           </w:p>
         </w:tc>
@@ -5614,7 +5614,7 @@
                 <w:sz w:val="18"/>
                 <w:szCs w:val="18"/>
               </w:rPr>
-              <w:t xml:space="preserve">10. Marco normativo general</w:t>
+              <w:t xml:space="preserve">10. Signos de alarma y fase crítica</w:t>
             </w:r>
           </w:p>
         </w:tc>
@@ -5648,7 +5648,7 @@
                 <w:sz w:val="18"/>
                 <w:szCs w:val="18"/>
               </w:rPr>
-              <w:t xml:space="preserve">2:50 – 3:15</w:t>
+              <w:t xml:space="preserve">2:13 – 2:35</w:t>
             </w:r>
           </w:p>
         </w:tc>
@@ -5682,7 +5682,7 @@
                 <w:sz w:val="18"/>
                 <w:szCs w:val="18"/>
               </w:rPr>
-              <w:t xml:space="preserve">Cuatro bloques de normas con su año y lo que exige cada una.</w:t>
+              <w:t xml:space="preserve">Lista de signos de alarma con íconos y una barra de días de enfermedad que resalta la fase crítica (días 3 a 7).</w:t>
             </w:r>
           </w:p>
         </w:tc>
@@ -5716,7 +5716,7 @@
                 <w:sz w:val="18"/>
                 <w:szCs w:val="18"/>
               </w:rPr>
-              <w:t xml:space="preserve">Ley 1751 de 2015 · Ley 1438 de 2011 · Decreto 780 de 2016 · Resolución 3100 de 2019</w:t>
+              <w:t xml:space="preserve">La fase crítica llega cuando baja la fiebre · Plaquetas normales no descartan el riesgo</w:t>
             </w:r>
           </w:p>
         </w:tc>
@@ -5784,7 +5784,7 @@
                 <w:sz w:val="18"/>
                 <w:szCs w:val="18"/>
               </w:rPr>
-              <w:t xml:space="preserve">25 s</w:t>
+              <w:t xml:space="preserve">22 s</w:t>
             </w:r>
           </w:p>
         </w:tc>
@@ -5824,7 +5824,7 @@
                 <w:sz w:val="18"/>
                 <w:szCs w:val="18"/>
               </w:rPr>
-              <w:t xml:space="preserve">11. Cursos de vida: gestación e infancia</w:t>
+              <w:t xml:space="preserve">11. La guía frente al caso</w:t>
             </w:r>
           </w:p>
         </w:tc>
@@ -5858,7 +5858,7 @@
                 <w:sz w:val="18"/>
                 <w:szCs w:val="18"/>
               </w:rPr>
-              <w:t xml:space="preserve">3:15 – 3:40</w:t>
+              <w:t xml:space="preserve">2:35 – 3:00</w:t>
             </w:r>
           </w:p>
         </w:tc>
@@ -5892,7 +5892,7 @@
                 <w:sz w:val="18"/>
                 <w:szCs w:val="18"/>
               </w:rPr>
-              <w:t xml:space="preserve">Línea del curso de vida (gestación → infancia) con las normas y un ejemplo aplicado en cada momento.</w:t>
+              <w:t xml:space="preserve">Comparación en dos columnas (lo que exige la guía y lo que reporta la familia) y una franja con la consecuencia de cumplirla.</w:t>
             </w:r>
           </w:p>
         </w:tc>
@@ -5926,7 +5926,7 @@
                 <w:sz w:val="18"/>
                 <w:szCs w:val="18"/>
               </w:rPr>
-              <w:t xml:space="preserve">Gestación · Primera infancia e infancia</w:t>
+              <w:t xml:space="preserve">Lo que exige la guía · Lo que reporta la familia · Si se cumple la guía: letalidad menor al 1 %</w:t>
             </w:r>
           </w:p>
         </w:tc>
@@ -6034,7 +6034,7 @@
                 <w:sz w:val="18"/>
                 <w:szCs w:val="18"/>
               </w:rPr>
-              <w:t xml:space="preserve">12. Cursos de vida: adolescencia a vejez</w:t>
+              <w:t xml:space="preserve">12. Marco normativo general</w:t>
             </w:r>
           </w:p>
         </w:tc>
@@ -6068,7 +6068,7 @@
                 <w:sz w:val="18"/>
                 <w:szCs w:val="18"/>
               </w:rPr>
-              <w:t xml:space="preserve">3:40 – 4:05</w:t>
+              <w:t xml:space="preserve">3:00 – 3:25</w:t>
             </w:r>
           </w:p>
         </w:tc>
@@ -6102,7 +6102,7 @@
                 <w:sz w:val="18"/>
                 <w:szCs w:val="18"/>
               </w:rPr>
-              <w:t xml:space="preserve">Continuación de la línea del curso de vida (adolescencia → adultez → vejez) con sus normas y un ejemplo aplicado en cada momento.</w:t>
+              <w:t xml:space="preserve">Cuatro bloques de normas con su año y lo que exige cada una.</w:t>
             </w:r>
           </w:p>
         </w:tc>
@@ -6136,7 +6136,7 @@
                 <w:sz w:val="18"/>
                 <w:szCs w:val="18"/>
               </w:rPr>
-              <w:t xml:space="preserve">Adolescencia y juventud · Adultez · Vejez</w:t>
+              <w:t xml:space="preserve">Ley 1751 de 2015 · Ley 1438 de 2011 · Decreto 780 de 2016 · Resolución 3100 de 2019</w:t>
             </w:r>
           </w:p>
         </w:tc>
@@ -6244,7 +6244,7 @@
                 <w:sz w:val="18"/>
                 <w:szCs w:val="18"/>
               </w:rPr>
-              <w:t xml:space="preserve">13. Marco legal del daño médico</w:t>
+              <w:t xml:space="preserve">13. Cursos de vida: gestación e infancia</w:t>
             </w:r>
           </w:p>
         </w:tc>
@@ -6278,7 +6278,7 @@
                 <w:sz w:val="18"/>
                 <w:szCs w:val="18"/>
               </w:rPr>
-              <w:t xml:space="preserve">4:05 – 4:30</w:t>
+              <w:t xml:space="preserve">3:25 – 3:50</w:t>
             </w:r>
           </w:p>
         </w:tc>
@@ -6312,7 +6312,7 @@
                 <w:sz w:val="18"/>
                 <w:szCs w:val="18"/>
               </w:rPr>
-              <w:t xml:space="preserve">Cuatro tarjetas: responsabilidad civil, penal, ético-disciplinaria y administrativa, con su norma.</w:t>
+              <w:t xml:space="preserve">Línea del curso de vida (gestación → infancia) con las normas y un ejemplo aplicado en cada momento.</w:t>
             </w:r>
           </w:p>
         </w:tc>
@@ -6346,7 +6346,7 @@
                 <w:sz w:val="18"/>
                 <w:szCs w:val="18"/>
               </w:rPr>
-              <w:t xml:space="preserve">Civil · Penal · Ético-disciplinaria · Administrativa</w:t>
+              <w:t xml:space="preserve">Gestación · Primera infancia e infancia</w:t>
             </w:r>
           </w:p>
         </w:tc>
@@ -6380,7 +6380,7 @@
                 <w:sz w:val="18"/>
                 <w:szCs w:val="18"/>
               </w:rPr>
-              <w:t xml:space="preserve">Voz en off. Música: tensión suave.</w:t>
+              <w:t xml:space="preserve">Voz en off. Música: suave.</w:t>
             </w:r>
           </w:p>
         </w:tc>
@@ -6454,7 +6454,7 @@
                 <w:sz w:val="18"/>
                 <w:szCs w:val="18"/>
               </w:rPr>
-              <w:t xml:space="preserve">14. La guía como prueba</w:t>
+              <w:t xml:space="preserve">14. Cursos de vida: adolescencia a vejez</w:t>
             </w:r>
           </w:p>
         </w:tc>
@@ -6488,7 +6488,7 @@
                 <w:sz w:val="18"/>
                 <w:szCs w:val="18"/>
               </w:rPr>
-              <w:t xml:space="preserve">4:30 – 4:48</w:t>
+              <w:t xml:space="preserve">3:50 – 4:15</w:t>
             </w:r>
           </w:p>
         </w:tc>
@@ -6522,7 +6522,7 @@
                 <w:sz w:val="18"/>
                 <w:szCs w:val="18"/>
               </w:rPr>
-              <w:t xml:space="preserve">Ecuación visual: daño + falla + nexo causal = responsabilidad; debajo, la historia clínica como prueba.</w:t>
+              <w:t xml:space="preserve">Continuación de la línea del curso de vida (adolescencia → adultez → vejez) con sus normas y un ejemplo aplicado en cada momento.</w:t>
             </w:r>
           </w:p>
         </w:tc>
@@ -6556,7 +6556,7 @@
                 <w:sz w:val="18"/>
                 <w:szCs w:val="18"/>
               </w:rPr>
-              <w:t xml:space="preserve">Daño + Falla + Nexo causal · Obligación de medios</w:t>
+              <w:t xml:space="preserve">Adolescencia y juventud · Adultez · Vejez</w:t>
             </w:r>
           </w:p>
         </w:tc>
@@ -6590,7 +6590,7 @@
                 <w:sz w:val="18"/>
                 <w:szCs w:val="18"/>
               </w:rPr>
-              <w:t xml:space="preserve">Voz en off. Música: tensión suave.</w:t>
+              <w:t xml:space="preserve">Voz en off. Música: suave.</w:t>
             </w:r>
           </w:p>
         </w:tc>
@@ -6624,7 +6624,7 @@
                 <w:sz w:val="18"/>
                 <w:szCs w:val="18"/>
               </w:rPr>
-              <w:t xml:space="preserve">18 s</w:t>
+              <w:t xml:space="preserve">25 s</w:t>
             </w:r>
           </w:p>
         </w:tc>
@@ -6664,7 +6664,7 @@
                 <w:sz w:val="18"/>
                 <w:szCs w:val="18"/>
               </w:rPr>
-              <w:t xml:space="preserve">15. Consecuencias reales</w:t>
+              <w:t xml:space="preserve">15. Marco legal del daño médico</w:t>
             </w:r>
           </w:p>
         </w:tc>
@@ -6698,7 +6698,7 @@
                 <w:sz w:val="18"/>
                 <w:szCs w:val="18"/>
               </w:rPr>
-              <w:t xml:space="preserve">4:48 – 5:13</w:t>
+              <w:t xml:space="preserve">4:15 – 4:40</w:t>
             </w:r>
           </w:p>
         </w:tc>
@@ -6732,7 +6732,7 @@
                 <w:sz w:val="18"/>
                 <w:szCs w:val="18"/>
               </w:rPr>
-              <w:t xml:space="preserve">Dos tarjetas con casos reales: Barrancabermeja (condena penal) y Yarumal (evento adverso e investigación), con su fuente.</w:t>
+              <w:t xml:space="preserve">Cuatro tarjetas: responsabilidad civil, penal, ético-disciplinaria y administrativa, con su norma.</w:t>
             </w:r>
           </w:p>
         </w:tc>
@@ -6766,7 +6766,7 @@
                 <w:sz w:val="18"/>
                 <w:szCs w:val="18"/>
               </w:rPr>
-              <w:t xml:space="preserve">Barrancabermeja, 2026: condena por homicidio culposo · Yarumal, 2026: evento adverso e investigación</w:t>
+              <w:t xml:space="preserve">Civil · Penal · Ético-disciplinaria · Administrativa</w:t>
             </w:r>
           </w:p>
         </w:tc>
@@ -6874,7 +6874,7 @@
                 <w:sz w:val="18"/>
                 <w:szCs w:val="18"/>
               </w:rPr>
-              <w:t xml:space="preserve">16. Consecuencias de no adherirse</w:t>
+              <w:t xml:space="preserve">16. La guía como prueba</w:t>
             </w:r>
           </w:p>
         </w:tc>
@@ -6908,7 +6908,7 @@
                 <w:sz w:val="18"/>
                 <w:szCs w:val="18"/>
               </w:rPr>
-              <w:t xml:space="preserve">5:13 – 5:33</w:t>
+              <w:t xml:space="preserve">4:40 – 4:58</w:t>
             </w:r>
           </w:p>
         </w:tc>
@@ -6942,7 +6942,7 @@
                 <w:sz w:val="18"/>
                 <w:szCs w:val="18"/>
               </w:rPr>
-              <w:t xml:space="preserve">Cuatro íconos en fila: clínicas, éticas, legales e institucionales.</w:t>
+              <w:t xml:space="preserve">Ecuación visual: daño + falla + nexo causal = responsabilidad; debajo, la historia clínica como prueba.</w:t>
             </w:r>
           </w:p>
         </w:tc>
@@ -6976,7 +6976,7 @@
                 <w:sz w:val="18"/>
                 <w:szCs w:val="18"/>
               </w:rPr>
-              <w:t xml:space="preserve">Consecuencias clínicas · éticas · legales · institucionales</w:t>
+              <w:t xml:space="preserve">Daño + Falla + Nexo causal · Obligación de medios</w:t>
             </w:r>
           </w:p>
         </w:tc>
@@ -7044,7 +7044,7 @@
                 <w:sz w:val="18"/>
                 <w:szCs w:val="18"/>
               </w:rPr>
-              <w:t xml:space="preserve">20 s</w:t>
+              <w:t xml:space="preserve">18 s</w:t>
             </w:r>
           </w:p>
         </w:tc>
@@ -7084,7 +7084,7 @@
                 <w:sz w:val="18"/>
                 <w:szCs w:val="18"/>
               </w:rPr>
-              <w:t xml:space="preserve">17. Barreras para cumplir la guía</w:t>
+              <w:t xml:space="preserve">17. Consecuencias reales</w:t>
             </w:r>
           </w:p>
         </w:tc>
@@ -7118,7 +7118,7 @@
                 <w:sz w:val="18"/>
                 <w:szCs w:val="18"/>
               </w:rPr>
-              <w:t xml:space="preserve">5:33 – 5:51</w:t>
+              <w:t xml:space="preserve">4:58 – 5:23</w:t>
             </w:r>
           </w:p>
         </w:tc>
@@ -7152,7 +7152,7 @@
                 <w:sz w:val="18"/>
                 <w:szCs w:val="18"/>
               </w:rPr>
-              <w:t xml:space="preserve">Video de stock de una sala de urgencias congestionada; panel con las cuatro barreras. Video de stock: “busy emergency room”.</w:t>
+              <w:t xml:space="preserve">Dos tarjetas con casos reales: Barrancabermeja (condena penal) y Yarumal (evento adverso e investigación), con su fuente.</w:t>
             </w:r>
           </w:p>
         </w:tc>
@@ -7186,7 +7186,7 @@
                 <w:sz w:val="18"/>
                 <w:szCs w:val="18"/>
               </w:rPr>
-              <w:t xml:space="preserve">Recursos · Capacitación · Cultura de seguridad · Liderazgo</w:t>
+              <w:t xml:space="preserve">Barrancabermeja, 2026: condena por homicidio culposo · Yarumal, 2026: evento adverso e investigación</w:t>
             </w:r>
           </w:p>
         </w:tc>
@@ -7220,7 +7220,7 @@
                 <w:sz w:val="18"/>
                 <w:szCs w:val="18"/>
               </w:rPr>
-              <w:t xml:space="preserve">Voz en off. Música: reflexiva.</w:t>
+              <w:t xml:space="preserve">Voz en off. Música: tensión suave.</w:t>
             </w:r>
           </w:p>
         </w:tc>
@@ -7254,7 +7254,7 @@
                 <w:sz w:val="18"/>
                 <w:szCs w:val="18"/>
               </w:rPr>
-              <w:t xml:space="preserve">18 s</w:t>
+              <w:t xml:space="preserve">25 s</w:t>
             </w:r>
           </w:p>
         </w:tc>
@@ -7294,7 +7294,7 @@
                 <w:sz w:val="18"/>
                 <w:szCs w:val="18"/>
               </w:rPr>
-              <w:t xml:space="preserve">18. Acciones de mejora</w:t>
+              <w:t xml:space="preserve">18. Consecuencias de no adherirse</w:t>
             </w:r>
           </w:p>
         </w:tc>
@@ -7328,7 +7328,7 @@
                 <w:sz w:val="18"/>
                 <w:szCs w:val="18"/>
               </w:rPr>
-              <w:t xml:space="preserve">5:51 – 6:16</w:t>
+              <w:t xml:space="preserve">5:23 – 5:43</w:t>
             </w:r>
           </w:p>
         </w:tc>
@@ -7362,7 +7362,7 @@
                 <w:sz w:val="18"/>
                 <w:szCs w:val="18"/>
               </w:rPr>
-              <w:t xml:space="preserve">Lista de chequeo con cinco acciones de mejora y sus responsables.</w:t>
+              <w:t xml:space="preserve">Cuatro íconos en fila: clínicas, éticas, legales e institucionales.</w:t>
             </w:r>
           </w:p>
         </w:tc>
@@ -7396,7 +7396,7 @@
                 <w:sz w:val="18"/>
                 <w:szCs w:val="18"/>
               </w:rPr>
-              <w:t xml:space="preserve">Capacitación · Formatos · Auditorías · Simulacros · Análisis de casos</w:t>
+              <w:t xml:space="preserve">Consecuencias clínicas · éticas · legales · institucionales</w:t>
             </w:r>
           </w:p>
         </w:tc>
@@ -7430,7 +7430,7 @@
                 <w:sz w:val="18"/>
                 <w:szCs w:val="18"/>
               </w:rPr>
-              <w:t xml:space="preserve">Voz en off. Música: esperanzadora.</w:t>
+              <w:t xml:space="preserve">Voz en off. Música: tensión suave.</w:t>
             </w:r>
           </w:p>
         </w:tc>
@@ -7464,7 +7464,7 @@
                 <w:sz w:val="18"/>
                 <w:szCs w:val="18"/>
               </w:rPr>
-              <w:t xml:space="preserve">25 s</w:t>
+              <w:t xml:space="preserve">20 s</w:t>
             </w:r>
           </w:p>
         </w:tc>
@@ -7504,7 +7504,7 @@
                 <w:sz w:val="18"/>
                 <w:szCs w:val="18"/>
               </w:rPr>
-              <w:t xml:space="preserve">19. Indicadores de seguimiento</w:t>
+              <w:t xml:space="preserve">19. Barreras para cumplir la guía</w:t>
             </w:r>
           </w:p>
         </w:tc>
@@ -7538,7 +7538,7 @@
                 <w:sz w:val="18"/>
                 <w:szCs w:val="18"/>
               </w:rPr>
-              <w:t xml:space="preserve">6:16 – 6:32</w:t>
+              <w:t xml:space="preserve">5:43 – 6:01</w:t>
             </w:r>
           </w:p>
         </w:tc>
@@ -7572,7 +7572,7 @@
                 <w:sz w:val="18"/>
                 <w:szCs w:val="18"/>
               </w:rPr>
-              <w:t xml:space="preserve">Tablero de cinco indicadores con su fórmula y meta.</w:t>
+              <w:t xml:space="preserve">Video de stock de una sala de urgencias congestionada; panel con las cuatro barreras. Video de stock: “busy emergency room”.</w:t>
             </w:r>
           </w:p>
         </w:tc>
@@ -7606,7 +7606,7 @@
                 <w:sz w:val="18"/>
                 <w:szCs w:val="18"/>
               </w:rPr>
-              <w:t xml:space="preserve">Adherencia · Reconsultas · Eventos adversos · Tiempos · Letalidad</w:t>
+              <w:t xml:space="preserve">Recursos · Capacitación · Cultura de seguridad · Liderazgo</w:t>
             </w:r>
           </w:p>
         </w:tc>
@@ -7640,7 +7640,7 @@
                 <w:sz w:val="18"/>
                 <w:szCs w:val="18"/>
               </w:rPr>
-              <w:t xml:space="preserve">Voz en off. Música: esperanzadora.</w:t>
+              <w:t xml:space="preserve">Voz en off. Música: reflexiva.</w:t>
             </w:r>
           </w:p>
         </w:tc>
@@ -7674,7 +7674,7 @@
                 <w:sz w:val="18"/>
                 <w:szCs w:val="18"/>
               </w:rPr>
-              <w:t xml:space="preserve">16 s</w:t>
+              <w:t xml:space="preserve">18 s</w:t>
             </w:r>
           </w:p>
         </w:tc>
@@ -7714,7 +7714,7 @@
                 <w:sz w:val="18"/>
                 <w:szCs w:val="18"/>
               </w:rPr>
-              <w:t xml:space="preserve">20. Mi postura</w:t>
+              <w:t xml:space="preserve">20. Acciones de mejora</w:t>
             </w:r>
           </w:p>
         </w:tc>
@@ -7748,7 +7748,7 @@
                 <w:sz w:val="18"/>
                 <w:szCs w:val="18"/>
               </w:rPr>
-              <w:t xml:space="preserve">6:32 – 6:54</w:t>
+              <w:t xml:space="preserve">6:01 – 6:26</w:t>
             </w:r>
           </w:p>
         </w:tc>
@@ -7782,7 +7782,7 @@
                 <w:sz w:val="18"/>
                 <w:szCs w:val="18"/>
               </w:rPr>
-              <w:t xml:space="preserve">Balanza: a un lado lo que aporta la guía y al otro su límite; abajo, la postura personal.</w:t>
+              <w:t xml:space="preserve">Lista de chequeo con cinco acciones de mejora y sus responsables.</w:t>
             </w:r>
           </w:p>
         </w:tc>
@@ -7816,7 +7816,7 @@
                 <w:sz w:val="18"/>
                 <w:szCs w:val="18"/>
               </w:rPr>
-              <w:t xml:space="preserve">La guía es el piso, no el techo</w:t>
+              <w:t xml:space="preserve">Capacitación · Formatos · Auditorías · Simulacros · Análisis de casos</w:t>
             </w:r>
           </w:p>
         </w:tc>
@@ -7850,7 +7850,7 @@
                 <w:sz w:val="18"/>
                 <w:szCs w:val="18"/>
               </w:rPr>
-              <w:t xml:space="preserve">Voz en off. Música: reflexiva.</w:t>
+              <w:t xml:space="preserve">Voz en off. Música: esperanzadora.</w:t>
             </w:r>
           </w:p>
         </w:tc>
@@ -7884,7 +7884,7 @@
                 <w:sz w:val="18"/>
                 <w:szCs w:val="18"/>
               </w:rPr>
-              <w:t xml:space="preserve">22 s</w:t>
+              <w:t xml:space="preserve">25 s</w:t>
             </w:r>
           </w:p>
         </w:tc>
@@ -7924,7 +7924,7 @@
                 <w:sz w:val="18"/>
                 <w:szCs w:val="18"/>
               </w:rPr>
-              <w:t xml:space="preserve">21. Importancia según el marco legal</w:t>
+              <w:t xml:space="preserve">21. Indicadores de seguimiento</w:t>
             </w:r>
           </w:p>
         </w:tc>
@@ -7958,7 +7958,7 @@
                 <w:sz w:val="18"/>
                 <w:szCs w:val="18"/>
               </w:rPr>
-              <w:t xml:space="preserve">6:54 – 7:14</w:t>
+              <w:t xml:space="preserve">6:26 – 6:42</w:t>
             </w:r>
           </w:p>
         </w:tc>
@@ -7992,7 +7992,7 @@
                 <w:sz w:val="18"/>
                 <w:szCs w:val="18"/>
               </w:rPr>
-              <w:t xml:space="preserve">Tres escudos: protege al paciente, al profesional y a la institución.</w:t>
+              <w:t xml:space="preserve">Tablero de cinco indicadores con su fórmula y meta.</w:t>
             </w:r>
           </w:p>
         </w:tc>
@@ -8026,7 +8026,7 @@
                 <w:sz w:val="18"/>
                 <w:szCs w:val="18"/>
               </w:rPr>
-              <w:t xml:space="preserve">Adherencia = seguridad del paciente</w:t>
+              <w:t xml:space="preserve">Adherencia · Reconsultas · Eventos adversos · Tiempos · Letalidad</w:t>
             </w:r>
           </w:p>
         </w:tc>
@@ -8094,7 +8094,7 @@
                 <w:sz w:val="18"/>
                 <w:szCs w:val="18"/>
               </w:rPr>
-              <w:t xml:space="preserve">20 s</w:t>
+              <w:t xml:space="preserve">16 s</w:t>
             </w:r>
           </w:p>
         </w:tc>
@@ -8134,7 +8134,7 @@
                 <w:sz w:val="18"/>
                 <w:szCs w:val="18"/>
               </w:rPr>
-              <w:t xml:space="preserve">22. Cierre</w:t>
+              <w:t xml:space="preserve">22. Mi postura</w:t>
             </w:r>
           </w:p>
         </w:tc>
@@ -8168,7 +8168,7 @@
                 <w:sz w:val="18"/>
                 <w:szCs w:val="18"/>
               </w:rPr>
-              <w:t xml:space="preserve">7:14 – 7:26</w:t>
+              <w:t xml:space="preserve">6:42 – 7:04</w:t>
             </w:r>
           </w:p>
         </w:tc>
@@ -8202,7 +8202,7 @@
                 <w:sz w:val="18"/>
                 <w:szCs w:val="18"/>
               </w:rPr>
-              <w:t xml:space="preserve">Video de stock de una médica atendiendo a un niño; frase final. Video de stock: “doctor child patient”.</w:t>
+              <w:t xml:space="preserve">Balanza: a un lado lo que aporta la guía y al otro su límite; abajo, la postura personal.</w:t>
             </w:r>
           </w:p>
         </w:tc>
@@ -8236,7 +8236,7 @@
                 <w:sz w:val="18"/>
                 <w:szCs w:val="18"/>
               </w:rPr>
-              <w:t xml:space="preserve">Una guía bien aplicada es una decisión a tiempo</w:t>
+              <w:t xml:space="preserve">La guía es el piso, no el techo</w:t>
             </w:r>
           </w:p>
         </w:tc>
@@ -8270,7 +8270,7 @@
                 <w:sz w:val="18"/>
                 <w:szCs w:val="18"/>
               </w:rPr>
-              <w:t xml:space="preserve">Voz en off. Música: cálida, crece y se desvanece.</w:t>
+              <w:t xml:space="preserve">Voz en off. Música: reflexiva.</w:t>
             </w:r>
           </w:p>
         </w:tc>
@@ -8304,7 +8304,7 @@
                 <w:sz w:val="18"/>
                 <w:szCs w:val="18"/>
               </w:rPr>
-              <w:t xml:space="preserve">12 s</w:t>
+              <w:t xml:space="preserve">22 s</w:t>
             </w:r>
           </w:p>
         </w:tc>
@@ -8344,7 +8344,7 @@
                 <w:sz w:val="18"/>
                 <w:szCs w:val="18"/>
               </w:rPr>
-              <w:t xml:space="preserve">23. Referencias</w:t>
+              <w:t xml:space="preserve">23. Importancia según el marco legal</w:t>
             </w:r>
           </w:p>
         </w:tc>
@@ -8378,7 +8378,7 @@
                 <w:sz w:val="18"/>
                 <w:szCs w:val="18"/>
               </w:rPr>
-              <w:t xml:space="preserve">7:26 – 7:36</w:t>
+              <w:t xml:space="preserve">7:04 – 7:24</w:t>
             </w:r>
           </w:p>
         </w:tc>
@@ -8412,7 +8412,7 @@
                 <w:sz w:val="18"/>
                 <w:szCs w:val="18"/>
               </w:rPr>
-              <w:t xml:space="preserve">Lista de referencias en dos columnas.</w:t>
+              <w:t xml:space="preserve">Tres escudos: protege al paciente, al profesional y a la institución.</w:t>
             </w:r>
           </w:p>
         </w:tc>
@@ -8446,7 +8446,7 @@
                 <w:sz w:val="18"/>
                 <w:szCs w:val="18"/>
               </w:rPr>
-              <w:t xml:space="preserve">Referencias</w:t>
+              <w:t xml:space="preserve">Adherencia = seguridad del paciente</w:t>
             </w:r>
           </w:p>
         </w:tc>
@@ -8480,7 +8480,7 @@
                 <w:sz w:val="18"/>
                 <w:szCs w:val="18"/>
               </w:rPr>
-              <w:t xml:space="preserve">Sin voz. Música: suave.</w:t>
+              <w:t xml:space="preserve">Voz en off. Música: esperanzadora.</w:t>
             </w:r>
           </w:p>
         </w:tc>
@@ -8514,7 +8514,7 @@
                 <w:sz w:val="18"/>
                 <w:szCs w:val="18"/>
               </w:rPr>
-              <w:t xml:space="preserve">10 s</w:t>
+              <w:t xml:space="preserve">20 s</w:t>
             </w:r>
           </w:p>
         </w:tc>
@@ -8554,7 +8554,7 @@
                 <w:sz w:val="18"/>
                 <w:szCs w:val="18"/>
               </w:rPr>
-              <w:t xml:space="preserve">24. Créditos</w:t>
+              <w:t xml:space="preserve">24. Cierre</w:t>
             </w:r>
           </w:p>
         </w:tc>
@@ -8588,7 +8588,427 @@
                 <w:sz w:val="18"/>
                 <w:szCs w:val="18"/>
               </w:rPr>
-              <w:t xml:space="preserve">7:36 – 7:42</w:t>
+              <w:t xml:space="preserve">7:24 – 7:36</w:t>
+            </w:r>
+          </w:p>
+        </w:tc>
+        <w:tc>
+          <w:tcPr>
+            <w:tcW w:type="dxa" w:w="2350"/>
+            <w:tcBorders>
+              <w:top w:val="single" w:color="8EAADB" w:sz="4"/>
+              <w:left w:val="single" w:color="8EAADB" w:sz="4"/>
+              <w:bottom w:val="single" w:color="8EAADB" w:sz="4"/>
+              <w:right w:val="single" w:color="8EAADB" w:sz="4"/>
+            </w:tcBorders>
+            <w:tcMar>
+              <w:top w:type="dxa" w:w="35"/>
+              <w:left w:type="dxa" w:w="80"/>
+              <w:bottom w:type="dxa" w:w="35"/>
+              <w:right w:type="dxa" w:w="80"/>
+            </w:tcMar>
+            <w:vAlign w:val="center"/>
+          </w:tcPr>
+          <w:p>
+            <w:pPr>
+              <w:spacing w:after="20"/>
+            </w:pPr>
+            <w:r>
+              <w:rPr>
+                <w:rFonts w:ascii="Arial" w:cs="Arial" w:eastAsia="Arial" w:hAnsi="Arial"/>
+                <w:b w:val="false"/>
+                <w:bCs w:val="false"/>
+                <w:color w:val="000000"/>
+                <w:sz w:val="18"/>
+                <w:szCs w:val="18"/>
+              </w:rPr>
+              <w:t xml:space="preserve">Video de stock de una médica atendiendo a un niño; frase final. Video de stock: “doctor child patient”.</w:t>
+            </w:r>
+          </w:p>
+        </w:tc>
+        <w:tc>
+          <w:tcPr>
+            <w:tcW w:type="dxa" w:w="2050"/>
+            <w:tcBorders>
+              <w:top w:val="single" w:color="8EAADB" w:sz="4"/>
+              <w:left w:val="single" w:color="8EAADB" w:sz="4"/>
+              <w:bottom w:val="single" w:color="8EAADB" w:sz="4"/>
+              <w:right w:val="single" w:color="8EAADB" w:sz="4"/>
+            </w:tcBorders>
+            <w:tcMar>
+              <w:top w:type="dxa" w:w="35"/>
+              <w:left w:type="dxa" w:w="80"/>
+              <w:bottom w:type="dxa" w:w="35"/>
+              <w:right w:type="dxa" w:w="80"/>
+            </w:tcMar>
+            <w:vAlign w:val="center"/>
+          </w:tcPr>
+          <w:p>
+            <w:pPr>
+              <w:spacing w:after="20"/>
+            </w:pPr>
+            <w:r>
+              <w:rPr>
+                <w:rFonts w:ascii="Arial" w:cs="Arial" w:eastAsia="Arial" w:hAnsi="Arial"/>
+                <w:b w:val="false"/>
+                <w:bCs w:val="false"/>
+                <w:color w:val="000000"/>
+                <w:sz w:val="18"/>
+                <w:szCs w:val="18"/>
+              </w:rPr>
+              <w:t xml:space="preserve">Una guía bien aplicada es una decisión a tiempo</w:t>
+            </w:r>
+          </w:p>
+        </w:tc>
+        <w:tc>
+          <w:tcPr>
+            <w:tcW w:type="dxa" w:w="1610"/>
+            <w:tcBorders>
+              <w:top w:val="single" w:color="8EAADB" w:sz="4"/>
+              <w:left w:val="single" w:color="8EAADB" w:sz="4"/>
+              <w:bottom w:val="single" w:color="8EAADB" w:sz="4"/>
+              <w:right w:val="single" w:color="8EAADB" w:sz="4"/>
+            </w:tcBorders>
+            <w:tcMar>
+              <w:top w:type="dxa" w:w="35"/>
+              <w:left w:type="dxa" w:w="80"/>
+              <w:bottom w:type="dxa" w:w="35"/>
+              <w:right w:type="dxa" w:w="80"/>
+            </w:tcMar>
+            <w:vAlign w:val="center"/>
+          </w:tcPr>
+          <w:p>
+            <w:pPr>
+              <w:spacing w:after="20"/>
+            </w:pPr>
+            <w:r>
+              <w:rPr>
+                <w:rFonts w:ascii="Arial" w:cs="Arial" w:eastAsia="Arial" w:hAnsi="Arial"/>
+                <w:b w:val="false"/>
+                <w:bCs w:val="false"/>
+                <w:color w:val="000000"/>
+                <w:sz w:val="18"/>
+                <w:szCs w:val="18"/>
+              </w:rPr>
+              <w:t xml:space="preserve">Voz en off. Música: cálida, crece y se desvanece.</w:t>
+            </w:r>
+          </w:p>
+        </w:tc>
+        <w:tc>
+          <w:tcPr>
+            <w:tcW w:type="dxa" w:w="1000"/>
+            <w:tcBorders>
+              <w:top w:val="single" w:color="8EAADB" w:sz="4"/>
+              <w:left w:val="single" w:color="8EAADB" w:sz="4"/>
+              <w:bottom w:val="single" w:color="8EAADB" w:sz="4"/>
+              <w:right w:val="single" w:color="8EAADB" w:sz="4"/>
+            </w:tcBorders>
+            <w:tcMar>
+              <w:top w:type="dxa" w:w="35"/>
+              <w:left w:type="dxa" w:w="80"/>
+              <w:bottom w:type="dxa" w:w="35"/>
+              <w:right w:type="dxa" w:w="80"/>
+            </w:tcMar>
+            <w:vAlign w:val="center"/>
+          </w:tcPr>
+          <w:p>
+            <w:pPr>
+              <w:spacing w:after="20"/>
+            </w:pPr>
+            <w:r>
+              <w:rPr>
+                <w:rFonts w:ascii="Arial" w:cs="Arial" w:eastAsia="Arial" w:hAnsi="Arial"/>
+                <w:b w:val="false"/>
+                <w:bCs w:val="false"/>
+                <w:color w:val="000000"/>
+                <w:sz w:val="18"/>
+                <w:szCs w:val="18"/>
+              </w:rPr>
+              <w:t xml:space="preserve">12 s</w:t>
+            </w:r>
+          </w:p>
+        </w:tc>
+      </w:tr>
+      <w:tr>
+        <w:trPr>
+          <w:tblHeader w:val="false"/>
+        </w:trPr>
+        <w:tc>
+          <w:tcPr>
+            <w:tcW w:type="dxa" w:w="1500"/>
+            <w:tcBorders>
+              <w:top w:val="single" w:color="8EAADB" w:sz="4"/>
+              <w:left w:val="single" w:color="8EAADB" w:sz="4"/>
+              <w:bottom w:val="single" w:color="8EAADB" w:sz="4"/>
+              <w:right w:val="single" w:color="8EAADB" w:sz="4"/>
+            </w:tcBorders>
+            <w:shd w:fill="DEEAF6" w:color="auto" w:val="clear"/>
+            <w:tcMar>
+              <w:top w:type="dxa" w:w="35"/>
+              <w:left w:type="dxa" w:w="80"/>
+              <w:bottom w:type="dxa" w:w="35"/>
+              <w:right w:type="dxa" w:w="80"/>
+            </w:tcMar>
+            <w:vAlign w:val="center"/>
+          </w:tcPr>
+          <w:p>
+            <w:pPr>
+              <w:spacing w:after="20"/>
+            </w:pPr>
+            <w:r>
+              <w:rPr>
+                <w:rFonts w:ascii="Arial" w:cs="Arial" w:eastAsia="Arial" w:hAnsi="Arial"/>
+                <w:b/>
+                <w:bCs/>
+                <w:color w:val="000000"/>
+                <w:sz w:val="18"/>
+                <w:szCs w:val="18"/>
+              </w:rPr>
+              <w:t xml:space="preserve">25. Referencias</w:t>
+            </w:r>
+          </w:p>
+        </w:tc>
+        <w:tc>
+          <w:tcPr>
+            <w:tcW w:type="dxa" w:w="850"/>
+            <w:tcBorders>
+              <w:top w:val="single" w:color="8EAADB" w:sz="4"/>
+              <w:left w:val="single" w:color="8EAADB" w:sz="4"/>
+              <w:bottom w:val="single" w:color="8EAADB" w:sz="4"/>
+              <w:right w:val="single" w:color="8EAADB" w:sz="4"/>
+            </w:tcBorders>
+            <w:tcMar>
+              <w:top w:type="dxa" w:w="35"/>
+              <w:left w:type="dxa" w:w="80"/>
+              <w:bottom w:type="dxa" w:w="35"/>
+              <w:right w:type="dxa" w:w="80"/>
+            </w:tcMar>
+            <w:vAlign w:val="center"/>
+          </w:tcPr>
+          <w:p>
+            <w:pPr>
+              <w:spacing w:after="20"/>
+            </w:pPr>
+            <w:r>
+              <w:rPr>
+                <w:rFonts w:ascii="Arial" w:cs="Arial" w:eastAsia="Arial" w:hAnsi="Arial"/>
+                <w:b w:val="false"/>
+                <w:bCs w:val="false"/>
+                <w:color w:val="000000"/>
+                <w:sz w:val="18"/>
+                <w:szCs w:val="18"/>
+              </w:rPr>
+              <w:t xml:space="preserve">7:36 – 7:44</w:t>
+            </w:r>
+          </w:p>
+        </w:tc>
+        <w:tc>
+          <w:tcPr>
+            <w:tcW w:type="dxa" w:w="2350"/>
+            <w:tcBorders>
+              <w:top w:val="single" w:color="8EAADB" w:sz="4"/>
+              <w:left w:val="single" w:color="8EAADB" w:sz="4"/>
+              <w:bottom w:val="single" w:color="8EAADB" w:sz="4"/>
+              <w:right w:val="single" w:color="8EAADB" w:sz="4"/>
+            </w:tcBorders>
+            <w:tcMar>
+              <w:top w:type="dxa" w:w="35"/>
+              <w:left w:type="dxa" w:w="80"/>
+              <w:bottom w:type="dxa" w:w="35"/>
+              <w:right w:type="dxa" w:w="80"/>
+            </w:tcMar>
+            <w:vAlign w:val="center"/>
+          </w:tcPr>
+          <w:p>
+            <w:pPr>
+              <w:spacing w:after="20"/>
+            </w:pPr>
+            <w:r>
+              <w:rPr>
+                <w:rFonts w:ascii="Arial" w:cs="Arial" w:eastAsia="Arial" w:hAnsi="Arial"/>
+                <w:b w:val="false"/>
+                <w:bCs w:val="false"/>
+                <w:color w:val="000000"/>
+                <w:sz w:val="18"/>
+                <w:szCs w:val="18"/>
+              </w:rPr>
+              <w:t xml:space="preserve">Lista de referencias en dos columnas.</w:t>
+            </w:r>
+          </w:p>
+        </w:tc>
+        <w:tc>
+          <w:tcPr>
+            <w:tcW w:type="dxa" w:w="2050"/>
+            <w:tcBorders>
+              <w:top w:val="single" w:color="8EAADB" w:sz="4"/>
+              <w:left w:val="single" w:color="8EAADB" w:sz="4"/>
+              <w:bottom w:val="single" w:color="8EAADB" w:sz="4"/>
+              <w:right w:val="single" w:color="8EAADB" w:sz="4"/>
+            </w:tcBorders>
+            <w:tcMar>
+              <w:top w:type="dxa" w:w="35"/>
+              <w:left w:type="dxa" w:w="80"/>
+              <w:bottom w:type="dxa" w:w="35"/>
+              <w:right w:type="dxa" w:w="80"/>
+            </w:tcMar>
+            <w:vAlign w:val="center"/>
+          </w:tcPr>
+          <w:p>
+            <w:pPr>
+              <w:spacing w:after="20"/>
+            </w:pPr>
+            <w:r>
+              <w:rPr>
+                <w:rFonts w:ascii="Arial" w:cs="Arial" w:eastAsia="Arial" w:hAnsi="Arial"/>
+                <w:b w:val="false"/>
+                <w:bCs w:val="false"/>
+                <w:color w:val="000000"/>
+                <w:sz w:val="18"/>
+                <w:szCs w:val="18"/>
+              </w:rPr>
+              <w:t xml:space="preserve">Referencias</w:t>
+            </w:r>
+          </w:p>
+        </w:tc>
+        <w:tc>
+          <w:tcPr>
+            <w:tcW w:type="dxa" w:w="1610"/>
+            <w:tcBorders>
+              <w:top w:val="single" w:color="8EAADB" w:sz="4"/>
+              <w:left w:val="single" w:color="8EAADB" w:sz="4"/>
+              <w:bottom w:val="single" w:color="8EAADB" w:sz="4"/>
+              <w:right w:val="single" w:color="8EAADB" w:sz="4"/>
+            </w:tcBorders>
+            <w:tcMar>
+              <w:top w:type="dxa" w:w="35"/>
+              <w:left w:type="dxa" w:w="80"/>
+              <w:bottom w:type="dxa" w:w="35"/>
+              <w:right w:type="dxa" w:w="80"/>
+            </w:tcMar>
+            <w:vAlign w:val="center"/>
+          </w:tcPr>
+          <w:p>
+            <w:pPr>
+              <w:spacing w:after="20"/>
+            </w:pPr>
+            <w:r>
+              <w:rPr>
+                <w:rFonts w:ascii="Arial" w:cs="Arial" w:eastAsia="Arial" w:hAnsi="Arial"/>
+                <w:b w:val="false"/>
+                <w:bCs w:val="false"/>
+                <w:color w:val="000000"/>
+                <w:sz w:val="18"/>
+                <w:szCs w:val="18"/>
+              </w:rPr>
+              <w:t xml:space="preserve">Sin voz. Música: suave.</w:t>
+            </w:r>
+          </w:p>
+        </w:tc>
+        <w:tc>
+          <w:tcPr>
+            <w:tcW w:type="dxa" w:w="1000"/>
+            <w:tcBorders>
+              <w:top w:val="single" w:color="8EAADB" w:sz="4"/>
+              <w:left w:val="single" w:color="8EAADB" w:sz="4"/>
+              <w:bottom w:val="single" w:color="8EAADB" w:sz="4"/>
+              <w:right w:val="single" w:color="8EAADB" w:sz="4"/>
+            </w:tcBorders>
+            <w:tcMar>
+              <w:top w:type="dxa" w:w="35"/>
+              <w:left w:type="dxa" w:w="80"/>
+              <w:bottom w:type="dxa" w:w="35"/>
+              <w:right w:type="dxa" w:w="80"/>
+            </w:tcMar>
+            <w:vAlign w:val="center"/>
+          </w:tcPr>
+          <w:p>
+            <w:pPr>
+              <w:spacing w:after="20"/>
+            </w:pPr>
+            <w:r>
+              <w:rPr>
+                <w:rFonts w:ascii="Arial" w:cs="Arial" w:eastAsia="Arial" w:hAnsi="Arial"/>
+                <w:b w:val="false"/>
+                <w:bCs w:val="false"/>
+                <w:color w:val="000000"/>
+                <w:sz w:val="18"/>
+                <w:szCs w:val="18"/>
+              </w:rPr>
+              <w:t xml:space="preserve">8 s</w:t>
+            </w:r>
+          </w:p>
+        </w:tc>
+      </w:tr>
+      <w:tr>
+        <w:trPr>
+          <w:tblHeader w:val="false"/>
+        </w:trPr>
+        <w:tc>
+          <w:tcPr>
+            <w:tcW w:type="dxa" w:w="1500"/>
+            <w:tcBorders>
+              <w:top w:val="single" w:color="8EAADB" w:sz="4"/>
+              <w:left w:val="single" w:color="8EAADB" w:sz="4"/>
+              <w:bottom w:val="single" w:color="8EAADB" w:sz="4"/>
+              <w:right w:val="single" w:color="8EAADB" w:sz="4"/>
+            </w:tcBorders>
+            <w:shd w:fill="DEEAF6" w:color="auto" w:val="clear"/>
+            <w:tcMar>
+              <w:top w:type="dxa" w:w="35"/>
+              <w:left w:type="dxa" w:w="80"/>
+              <w:bottom w:type="dxa" w:w="35"/>
+              <w:right w:type="dxa" w:w="80"/>
+            </w:tcMar>
+            <w:vAlign w:val="center"/>
+          </w:tcPr>
+          <w:p>
+            <w:pPr>
+              <w:spacing w:after="20"/>
+            </w:pPr>
+            <w:r>
+              <w:rPr>
+                <w:rFonts w:ascii="Arial" w:cs="Arial" w:eastAsia="Arial" w:hAnsi="Arial"/>
+                <w:b/>
+                <w:bCs/>
+                <w:color w:val="000000"/>
+                <w:sz w:val="18"/>
+                <w:szCs w:val="18"/>
+              </w:rPr>
+              <w:t xml:space="preserve">26. Créditos</w:t>
+            </w:r>
+          </w:p>
+        </w:tc>
+        <w:tc>
+          <w:tcPr>
+            <w:tcW w:type="dxa" w:w="850"/>
+            <w:tcBorders>
+              <w:top w:val="single" w:color="8EAADB" w:sz="4"/>
+              <w:left w:val="single" w:color="8EAADB" w:sz="4"/>
+              <w:bottom w:val="single" w:color="8EAADB" w:sz="4"/>
+              <w:right w:val="single" w:color="8EAADB" w:sz="4"/>
+            </w:tcBorders>
+            <w:tcMar>
+              <w:top w:type="dxa" w:w="35"/>
+              <w:left w:type="dxa" w:w="80"/>
+              <w:bottom w:type="dxa" w:w="35"/>
+              <w:right w:type="dxa" w:w="80"/>
+            </w:tcMar>
+            <w:vAlign w:val="center"/>
+          </w:tcPr>
+          <w:p>
+            <w:pPr>
+              <w:spacing w:after="20"/>
+            </w:pPr>
+            <w:r>
+              <w:rPr>
+                <w:rFonts w:ascii="Arial" w:cs="Arial" w:eastAsia="Arial" w:hAnsi="Arial"/>
+                <w:b w:val="false"/>
+                <w:bCs w:val="false"/>
+                <w:color w:val="000000"/>
+                <w:sz w:val="18"/>
+                <w:szCs w:val="18"/>
+              </w:rPr>
+              <w:t xml:space="preserve">7:44 – 7:50</w:t>
             </w:r>
           </w:p>
         </w:tc>
@@ -9027,7 +9447,7 @@
                 <w:sz w:val="18"/>
                 <w:szCs w:val="18"/>
               </w:rPr>
-              <w:t xml:space="preserve">0:00 – 0:06</w:t>
+              <w:t xml:space="preserve">0:00 – 0:10</w:t>
             </w:r>
           </w:p>
         </w:tc>
@@ -9061,7 +9481,7 @@
                 <w:sz w:val="18"/>
                 <w:szCs w:val="18"/>
               </w:rPr>
-              <w:t xml:space="preserve">(Sin voz. Solo música.)</w:t>
+              <w:t xml:space="preserve">(Sin voz. Solo música de apertura.)</w:t>
             </w:r>
           </w:p>
         </w:tc>
@@ -9135,7 +9555,7 @@
                 <w:sz w:val="18"/>
                 <w:szCs w:val="18"/>
               </w:rPr>
-              <w:t xml:space="preserve">Presentación</w:t>
+              <w:t xml:space="preserve">Un caso real</w:t>
             </w:r>
           </w:p>
         </w:tc>
@@ -9169,7 +9589,7 @@
                 <w:sz w:val="18"/>
                 <w:szCs w:val="18"/>
               </w:rPr>
-              <w:t xml:space="preserve">0:06 – 0:24</w:t>
+              <w:t xml:space="preserve">0:10 – 0:20</w:t>
             </w:r>
           </w:p>
         </w:tc>
@@ -9203,7 +9623,7 @@
                 <w:sz w:val="18"/>
                 <w:szCs w:val="18"/>
               </w:rPr>
-              <w:t xml:space="preserve">Hola, soy Yina Vanessa Cadena Mantilla, de la Especialización en Gerencia y Auditoría de la Calidad en Salud de UNIMINUTO. A partir de un caso real de Santander, analizo por qué seguir las guías y los protocolos puede salvar una vida.</w:t>
+              <w:t xml:space="preserve">Hola, soy Yina Vanessa Cadena Mantilla, estudiante de UNIMINUTO, y hoy les presento un caso real ocurrido en Santander.</w:t>
             </w:r>
           </w:p>
         </w:tc>
@@ -9277,7 +9697,7 @@
                 <w:sz w:val="18"/>
                 <w:szCs w:val="18"/>
               </w:rPr>
-              <w:t xml:space="preserve">Guía, protocolo y algoritmo</w:t>
+              <w:t xml:space="preserve">Frase de arranque</w:t>
             </w:r>
           </w:p>
         </w:tc>
@@ -9311,7 +9731,7 @@
                 <w:sz w:val="18"/>
                 <w:szCs w:val="18"/>
               </w:rPr>
-              <w:t xml:space="preserve">0:24 – 0:42</w:t>
+              <w:t xml:space="preserve">0:20 – 0:30</w:t>
             </w:r>
           </w:p>
         </w:tc>
@@ -9345,7 +9765,7 @@
                 <w:sz w:val="18"/>
                 <w:szCs w:val="18"/>
               </w:rPr>
-              <w:t xml:space="preserve">Primero, tres conceptos. La guía de práctica clínica reúne recomendaciones basadas en evidencia; el protocolo las adapta a cada institución, y el algoritmo resume las decisiones paso a paso. Ninguno reemplaza el juicio clínico; todos lo orientan.</w:t>
+              <w:t xml:space="preserve">¿Qué separa una consulta de rutina de una tragedia? Muchas veces, seguir o no seguir una guía.</w:t>
             </w:r>
           </w:p>
         </w:tc>
@@ -9419,7 +9839,7 @@
                 <w:sz w:val="18"/>
                 <w:szCs w:val="18"/>
               </w:rPr>
-              <w:t xml:space="preserve">¿Cómo se construye una guía?</w:t>
+              <w:t xml:space="preserve">Lo que veremos</w:t>
             </w:r>
           </w:p>
         </w:tc>
@@ -9453,7 +9873,7 @@
                 <w:sz w:val="18"/>
                 <w:szCs w:val="18"/>
               </w:rPr>
-              <w:t xml:space="preserve">0:42 – 0:58</w:t>
+              <w:t xml:space="preserve">0:30 – 0:40</w:t>
             </w:r>
           </w:p>
         </w:tc>
@@ -9487,7 +9907,7 @@
                 <w:sz w:val="18"/>
                 <w:szCs w:val="18"/>
               </w:rPr>
-              <w:t xml:space="preserve">Una guía no se escribe por opinión: según Torres-Tamayo y colaboradores, parte de preguntas clínicas, busca y califica la evidencia, formula recomendaciones y se actualiza periódicamente.</w:t>
+              <w:t xml:space="preserve">Veremos qué son las guías, un caso real, lo que dice la norma y lo que podemos mejorar. Empecemos por lo básico.</w:t>
             </w:r>
           </w:p>
         </w:tc>
@@ -9561,7 +9981,7 @@
                 <w:sz w:val="18"/>
                 <w:szCs w:val="18"/>
               </w:rPr>
-              <w:t xml:space="preserve">Contexto: dengue en Santander</w:t>
+              <w:t xml:space="preserve">Guía, protocolo y algoritmo</w:t>
             </w:r>
           </w:p>
         </w:tc>
@@ -9595,7 +10015,7 @@
                 <w:sz w:val="18"/>
                 <w:szCs w:val="18"/>
               </w:rPr>
-              <w:t xml:space="preserve">0:58 – 1:16</w:t>
+              <w:t xml:space="preserve">0:40 – 0:56</w:t>
             </w:r>
           </w:p>
         </w:tc>
@@ -9629,7 +10049,7 @@
                 <w:sz w:val="18"/>
                 <w:szCs w:val="18"/>
               </w:rPr>
-              <w:t xml:space="preserve">El caso ocurrió en Santander, el departamento con más casos de dengue del país en 2025: más de nueve mil. En plena epidemia, la guía de dengue era la herramienta clave para decidir quién podía irse a casa y quién no.</w:t>
+              <w:t xml:space="preserve">La guía de práctica clínica reúne recomendaciones basadas en evidencia; el protocolo las adapta a cada institución, y el algoritmo resume las decisiones paso a paso. Ninguno reemplaza el juicio clínico; todos lo orientan.</w:t>
             </w:r>
           </w:p>
         </w:tc>
@@ -9703,7 +10123,7 @@
                 <w:sz w:val="18"/>
                 <w:szCs w:val="18"/>
               </w:rPr>
-              <w:t xml:space="preserve">El caso</w:t>
+              <w:t xml:space="preserve">¿Cómo se construye una guía?</w:t>
             </w:r>
           </w:p>
         </w:tc>
@@ -9737,7 +10157,7 @@
                 <w:sz w:val="18"/>
                 <w:szCs w:val="18"/>
               </w:rPr>
-              <w:t xml:space="preserve">1:16 – 1:38</w:t>
+              <w:t xml:space="preserve">0:56 – 1:12</w:t>
             </w:r>
           </w:p>
         </w:tc>
@@ -9771,7 +10191,7 @@
                 <w:sz w:val="18"/>
                 <w:szCs w:val="18"/>
               </w:rPr>
-              <w:t xml:space="preserve">En octubre de 2025, una niña de diez años de Floridablanca empezó con fiebre alta. Según su familia, en el primer centro le aplicaron suero y la enviaron a casa porque sus plaquetas estaban bien. Un día después regresó con dengue grave, fue intubada y murió el 1 de noviembre.</w:t>
+              <w:t xml:space="preserve">Una guía no se escribe por opinión: según Torres-Tamayo y colaboradores, parte de preguntas clínicas, busca y califica la evidencia, formula recomendaciones y se actualiza periódicamente.</w:t>
             </w:r>
           </w:p>
         </w:tc>
@@ -9845,7 +10265,7 @@
                 <w:sz w:val="18"/>
                 <w:szCs w:val="18"/>
               </w:rPr>
-              <w:t xml:space="preserve">Lo que dice la guía: clasificación</w:t>
+              <w:t xml:space="preserve">Contexto: dengue en Santander</w:t>
             </w:r>
           </w:p>
         </w:tc>
@@ -9879,7 +10299,7 @@
                 <w:sz w:val="18"/>
                 <w:szCs w:val="18"/>
               </w:rPr>
-              <w:t xml:space="preserve">1:38 – 2:03</w:t>
+              <w:t xml:space="preserve">1:12 – 1:26</w:t>
             </w:r>
           </w:p>
         </w:tc>
@@ -9913,7 +10333,7 @@
                 <w:sz w:val="18"/>
                 <w:szCs w:val="18"/>
               </w:rPr>
-              <w:t xml:space="preserve">¿Qué dice la guía? Todo paciente con dengue se clasifica en tres grupos. El grupo A puede manejarse en casa, pero con control médico diario. El grupo B, con signos de alarma o condiciones de riesgo, debe hospitalizarse. Y el grupo C, con dengue grave, necesita cuidado intensivo.</w:t>
+              <w:t xml:space="preserve">El caso ocurrió en Santander, el departamento con más casos de dengue del país en 2025. En plena epidemia, la guía era la herramienta clave para decidir quién podía irse a casa.</w:t>
             </w:r>
           </w:p>
         </w:tc>
@@ -9987,7 +10407,7 @@
                 <w:sz w:val="18"/>
                 <w:szCs w:val="18"/>
               </w:rPr>
-              <w:t xml:space="preserve">Signos de alarma y fase crítica</w:t>
+              <w:t xml:space="preserve">El caso</w:t>
             </w:r>
           </w:p>
         </w:tc>
@@ -10021,7 +10441,7 @@
                 <w:sz w:val="18"/>
                 <w:szCs w:val="18"/>
               </w:rPr>
-              <w:t xml:space="preserve">2:03 – 2:25</w:t>
+              <w:t xml:space="preserve">1:26 – 1:48</w:t>
             </w:r>
           </w:p>
         </w:tc>
@@ -10055,7 +10475,7 @@
                 <w:sz w:val="18"/>
                 <w:szCs w:val="18"/>
               </w:rPr>
-              <w:t xml:space="preserve">La guía advierte que el momento más peligroso llega cuando la fiebre baja, entre el tercer y el séptimo día. Por eso, quien se va a casa debe recibir por escrito los signos de alarma, como dolor abdominal intenso, vómito o sangrados, y volver de inmediato si aparecen.</w:t>
+              <w:t xml:space="preserve">En octubre de 2025, una niña de diez años de Floridablanca empezó con fiebre alta. Según su familia, en el primer centro le aplicaron suero y la enviaron a casa porque sus plaquetas estaban bien. Un día después regresó con dengue grave, fue intubada y murió el 1 de noviembre.</w:t>
             </w:r>
           </w:p>
         </w:tc>
@@ -10129,7 +10549,7 @@
                 <w:sz w:val="18"/>
                 <w:szCs w:val="18"/>
               </w:rPr>
-              <w:t xml:space="preserve">La guía frente al caso</w:t>
+              <w:t xml:space="preserve">Lo que dice la guía: clasificación</w:t>
             </w:r>
           </w:p>
         </w:tc>
@@ -10163,7 +10583,7 @@
                 <w:sz w:val="18"/>
                 <w:szCs w:val="18"/>
               </w:rPr>
-              <w:t xml:space="preserve">2:25 – 2:50</w:t>
+              <w:t xml:space="preserve">1:48 – 2:13</w:t>
             </w:r>
           </w:p>
         </w:tc>
@@ -10197,7 +10617,7 @@
                 <w:sz w:val="18"/>
                 <w:szCs w:val="18"/>
               </w:rPr>
-              <w:t xml:space="preserve">Si el relato de la familia se confirma, la decisión se basó en las plaquetas, un dato que por sí solo no descarta el riesgo. Cumplir la guía cambia el desenlace: con clasificación y tratamiento oportunos, la mortalidad del dengue grave baja a menos del 1 %. Solo la investigación dirá si hubo una falla.</w:t>
+              <w:t xml:space="preserve">¿Qué dice la guía? Todo paciente con dengue se clasifica en tres grupos. El grupo A puede manejarse en casa, pero con control médico diario. El grupo B, con signos de alarma o condiciones de riesgo, debe hospitalizarse. Y el grupo C, con dengue grave, necesita cuidado intensivo.</w:t>
             </w:r>
           </w:p>
         </w:tc>
@@ -10271,7 +10691,7 @@
                 <w:sz w:val="18"/>
                 <w:szCs w:val="18"/>
               </w:rPr>
-              <w:t xml:space="preserve">Marco normativo general</w:t>
+              <w:t xml:space="preserve">Signos de alarma y fase crítica</w:t>
             </w:r>
           </w:p>
         </w:tc>
@@ -10305,7 +10725,7 @@
                 <w:sz w:val="18"/>
                 <w:szCs w:val="18"/>
               </w:rPr>
-              <w:t xml:space="preserve">2:50 – 3:15</w:t>
+              <w:t xml:space="preserve">2:13 – 2:35</w:t>
             </w:r>
           </w:p>
         </w:tc>
@@ -10339,7 +10759,7 @@
                 <w:sz w:val="18"/>
                 <w:szCs w:val="18"/>
               </w:rPr>
-              <w:t xml:space="preserve">En Colombia, seguir las guías no es opcional. La Ley 1751 de 2015 garantiza la autonomía médica, pero dentro de la ética y la evidencia científica. La Ley 1438 de 2011 define las guías como referentes basados en evidencia, y la Resolución 3100 de 2019 exige adoptarlas para habilitar los servicios.</w:t>
+              <w:t xml:space="preserve">La guía advierte que el momento más peligroso llega cuando la fiebre baja, entre el tercer y el séptimo día. Por eso, quien se va a casa debe recibir por escrito los signos de alarma, como dolor abdominal intenso, vómito o sangrados, y volver de inmediato si aparecen.</w:t>
             </w:r>
           </w:p>
         </w:tc>
@@ -10413,7 +10833,7 @@
                 <w:sz w:val="18"/>
                 <w:szCs w:val="18"/>
               </w:rPr>
-              <w:t xml:space="preserve">Cursos de vida: gestación e infancia</w:t>
+              <w:t xml:space="preserve">La guía frente al caso</w:t>
             </w:r>
           </w:p>
         </w:tc>
@@ -10447,7 +10867,7 @@
                 <w:sz w:val="18"/>
                 <w:szCs w:val="18"/>
               </w:rPr>
-              <w:t xml:space="preserve">3:15 – 3:40</w:t>
+              <w:t xml:space="preserve">2:35 – 3:00</w:t>
             </w:r>
           </w:p>
         </w:tc>
@@ -10481,7 +10901,7 @@
                 <w:sz w:val="18"/>
                 <w:szCs w:val="18"/>
               </w:rPr>
-              <w:t xml:space="preserve">Las guías también se organizan por cursos de vida. En la gestación, la Ruta Materno Perinatal incluye el código rojo: ante una hemorragia posparto, el equipo actúa en minutos. En la infancia, la ruta define la valoración integral, la Resolución 2350 orienta la desnutrición aguda y la guía de dengue decide, como en este caso, quién se hospitaliza.</w:t>
+              <w:t xml:space="preserve">Si el relato de la familia se confirma, la decisión se basó en las plaquetas, un dato que por sí solo no descarta el riesgo. Cumplir la guía cambia el desenlace: con clasificación y tratamiento oportunos, la mortalidad del dengue grave baja a menos del 1 %. Solo la investigación dirá si hubo una falla.</w:t>
             </w:r>
           </w:p>
         </w:tc>
@@ -10555,7 +10975,7 @@
                 <w:sz w:val="18"/>
                 <w:szCs w:val="18"/>
               </w:rPr>
-              <w:t xml:space="preserve">Cursos de vida: adolescencia a vejez</w:t>
+              <w:t xml:space="preserve">Marco normativo general</w:t>
             </w:r>
           </w:p>
         </w:tc>
@@ -10589,7 +11009,7 @@
                 <w:sz w:val="18"/>
                 <w:szCs w:val="18"/>
               </w:rPr>
-              <w:t xml:space="preserve">3:40 – 4:05</w:t>
+              <w:t xml:space="preserve">3:00 – 3:25</w:t>
             </w:r>
           </w:p>
         </w:tc>
@@ -10623,7 +11043,7 @@
                 <w:sz w:val="18"/>
                 <w:szCs w:val="18"/>
               </w:rPr>
-              <w:t xml:space="preserve">En la adolescencia, la Resolución 459 de 2012 obliga a atender a una víctima de violencia sexual como una urgencia, con profilaxis en las primeras 72 horas. En la adultez, las guías de hipertensión y diabetes fijan metas de control. Y en la vejez, la ruta y el Decreto 681 de 2022 priorizan la prevención de caídas.</w:t>
+              <w:t xml:space="preserve">En Colombia, seguir las guías no es opcional. La Ley 1751 de 2015 garantiza la autonomía médica, pero dentro de la ética y la evidencia científica. La Ley 1438 de 2011 define las guías como referentes basados en evidencia, y la Resolución 3100 de 2019 exige adoptarlas para habilitar los servicios.</w:t>
             </w:r>
           </w:p>
         </w:tc>
@@ -10697,7 +11117,7 @@
                 <w:sz w:val="18"/>
                 <w:szCs w:val="18"/>
               </w:rPr>
-              <w:t xml:space="preserve">Marco legal del daño médico</w:t>
+              <w:t xml:space="preserve">Cursos de vida: gestación e infancia</w:t>
             </w:r>
           </w:p>
         </w:tc>
@@ -10731,7 +11151,7 @@
                 <w:sz w:val="18"/>
                 <w:szCs w:val="18"/>
               </w:rPr>
-              <w:t xml:space="preserve">4:05 – 4:30</w:t>
+              <w:t xml:space="preserve">3:25 – 3:50</w:t>
             </w:r>
           </w:p>
         </w:tc>
@@ -10765,7 +11185,7 @@
                 <w:sz w:val="18"/>
                 <w:szCs w:val="18"/>
               </w:rPr>
-              <w:t xml:space="preserve">Cuando no se sigue una guía y se causa un daño, la responsabilidad puede ser de cuatro tipos: civil, que obliga a reparar los perjuicios; penal, por homicidio o lesiones culposas; ético-disciplinaria, ante los tribunales de ética; y administrativa, cuando responde una institución pública, además de las sanciones de la Supersalud.</w:t>
+              <w:t xml:space="preserve">Las guías también se organizan por cursos de vida. En la gestación, la Ruta Materno Perinatal incluye el código rojo: ante una hemorragia posparto, el equipo actúa en minutos. En la infancia, la ruta define la valoración integral, la Resolución 2350 orienta la desnutrición aguda y la guía de dengue decide, como en este caso, quién se hospitaliza.</w:t>
             </w:r>
           </w:p>
         </w:tc>
@@ -10839,7 +11259,7 @@
                 <w:sz w:val="18"/>
                 <w:szCs w:val="18"/>
               </w:rPr>
-              <w:t xml:space="preserve">La guía como prueba</w:t>
+              <w:t xml:space="preserve">Cursos de vida: adolescencia a vejez</w:t>
             </w:r>
           </w:p>
         </w:tc>
@@ -10873,7 +11293,7 @@
                 <w:sz w:val="18"/>
                 <w:szCs w:val="18"/>
               </w:rPr>
-              <w:t xml:space="preserve">4:30 – 4:48</w:t>
+              <w:t xml:space="preserve">3:50 – 4:15</w:t>
             </w:r>
           </w:p>
         </w:tc>
@@ -10907,7 +11327,7 @@
                 <w:sz w:val="18"/>
                 <w:szCs w:val="18"/>
               </w:rPr>
-              <w:t xml:space="preserve">Para que haya responsabilidad deben probarse el daño, la falla y la relación entre ambos. La obligación es de medios, no de resultados: el juez compara la atención con la lex artis, y la guía y la historia clínica son la prueba.</w:t>
+              <w:t xml:space="preserve">En la adolescencia, la Resolución 459 de 2012 obliga a atender a una víctima de violencia sexual como una urgencia, con profilaxis en las primeras 72 horas. En la adultez, las guías de hipertensión y diabetes fijan metas de control. Y en la vejez, la ruta y el Decreto 681 de 2022 priorizan la prevención de caídas.</w:t>
             </w:r>
           </w:p>
         </w:tc>
@@ -10981,7 +11401,7 @@
                 <w:sz w:val="18"/>
                 <w:szCs w:val="18"/>
               </w:rPr>
-              <w:t xml:space="preserve">Consecuencias reales</w:t>
+              <w:t xml:space="preserve">Marco legal del daño médico</w:t>
             </w:r>
           </w:p>
         </w:tc>
@@ -11015,7 +11435,7 @@
                 <w:sz w:val="18"/>
                 <w:szCs w:val="18"/>
               </w:rPr>
-              <w:t xml:space="preserve">4:48 – 5:13</w:t>
+              <w:t xml:space="preserve">4:15 – 4:40</w:t>
             </w:r>
           </w:p>
         </w:tc>
@@ -11049,7 +11469,7 @@
                 <w:sz w:val="18"/>
                 <w:szCs w:val="18"/>
               </w:rPr>
-              <w:t xml:space="preserve">Estas consecuencias son reales. En Barrancabermeja, en 2026, un médico fue condenado en primera instancia a cuatro años de prisión por homicidio culposo, tras un procedimiento estético para el que no tenía la especialización requerida. Y en Yarumal, un error en la vía de administración llevó a una paciente a cuidados intensivos y a una investigación.</w:t>
+              <w:t xml:space="preserve">Cuando no se sigue una guía y se causa un daño, la responsabilidad puede ser de cuatro tipos: civil, que obliga a reparar los perjuicios; penal, por homicidio o lesiones culposas; ético-disciplinaria, ante los tribunales de ética; y administrativa, cuando responde una institución pública, además de las sanciones de la Supersalud.</w:t>
             </w:r>
           </w:p>
         </w:tc>
@@ -11123,7 +11543,7 @@
                 <w:sz w:val="18"/>
                 <w:szCs w:val="18"/>
               </w:rPr>
-              <w:t xml:space="preserve">Consecuencias de no adherirse</w:t>
+              <w:t xml:space="preserve">La guía como prueba</w:t>
             </w:r>
           </w:p>
         </w:tc>
@@ -11157,7 +11577,7 @@
                 <w:sz w:val="18"/>
                 <w:szCs w:val="18"/>
               </w:rPr>
-              <w:t xml:space="preserve">5:13 – 5:33</w:t>
+              <w:t xml:space="preserve">4:40 – 4:58</w:t>
             </w:r>
           </w:p>
         </w:tc>
@@ -11191,7 +11611,7 @@
                 <w:sz w:val="18"/>
                 <w:szCs w:val="18"/>
               </w:rPr>
-              <w:t xml:space="preserve">¿Qué pasa cuando una institución no se adhiere a sus guías? Hay consecuencias clínicas, como muertes evitables; éticas, porque se rompen los principios de no hacer daño y de buscar el bien del paciente; legales, como demandas y sanciones; e institucionales, como mayores costos y pérdida de confianza.</w:t>
+              <w:t xml:space="preserve">Para que haya responsabilidad deben probarse el daño, la falla y la relación entre ambos. La obligación es de medios, no de resultados: el juez compara la atención con la lex artis, y la guía y la historia clínica son la prueba.</w:t>
             </w:r>
           </w:p>
         </w:tc>
@@ -11265,7 +11685,7 @@
                 <w:sz w:val="18"/>
                 <w:szCs w:val="18"/>
               </w:rPr>
-              <w:t xml:space="preserve">Barreras para cumplir la guía</w:t>
+              <w:t xml:space="preserve">Consecuencias reales</w:t>
             </w:r>
           </w:p>
         </w:tc>
@@ -11299,7 +11719,7 @@
                 <w:sz w:val="18"/>
                 <w:szCs w:val="18"/>
               </w:rPr>
-              <w:t xml:space="preserve">5:33 – 5:51</w:t>
+              <w:t xml:space="preserve">4:58 – 5:23</w:t>
             </w:r>
           </w:p>
         </w:tc>
@@ -11333,7 +11753,7 @@
                 <w:sz w:val="18"/>
                 <w:szCs w:val="18"/>
               </w:rPr>
-              <w:t xml:space="preserve">En casos como este, las barreras suelen repetirse: urgencias saturadas durante la epidemia, personal que rota y no conoce la guía, una cultura que decide por un solo dato de laboratorio, y líderes que no miden la adherencia.</w:t>
+              <w:t xml:space="preserve">Estas consecuencias son reales. En Barrancabermeja, en 2026, un médico fue condenado en primera instancia a cuatro años de prisión por homicidio culposo, tras un procedimiento estético para el que no tenía la especialización requerida. Y en Yarumal, un error en la vía de administración llevó a una paciente a cuidados intensivos y a una investigación.</w:t>
             </w:r>
           </w:p>
         </w:tc>
@@ -11407,7 +11827,7 @@
                 <w:sz w:val="18"/>
                 <w:szCs w:val="18"/>
               </w:rPr>
-              <w:t xml:space="preserve">Acciones de mejora</w:t>
+              <w:t xml:space="preserve">Consecuencias de no adherirse</w:t>
             </w:r>
           </w:p>
         </w:tc>
@@ -11441,7 +11861,7 @@
                 <w:sz w:val="18"/>
                 <w:szCs w:val="18"/>
               </w:rPr>
-              <w:t xml:space="preserve">5:51 – 6:16</w:t>
+              <w:t xml:space="preserve">5:23 – 5:43</w:t>
             </w:r>
           </w:p>
         </w:tc>
@@ -11475,7 +11895,7 @@
                 <w:sz w:val="18"/>
                 <w:szCs w:val="18"/>
               </w:rPr>
-              <w:t xml:space="preserve">Propongo acciones realistas: capacitar al personal en la guía de dengue y en las rutas integrales; estandarizar una hoja de egreso con los signos de alarma y la cita de control en 24 horas; hacer auditorías internas de historias clínicas dentro del PAMEC; y realizar simulacros de dengue grave.</w:t>
+              <w:t xml:space="preserve">¿Qué pasa cuando una institución no se adhiere a sus guías? Hay consecuencias clínicas, como muertes evitables; éticas, porque se rompen los principios de no hacer daño y de buscar el bien del paciente; legales, como demandas y sanciones; e institucionales, como mayores costos y pérdida de confianza.</w:t>
             </w:r>
           </w:p>
         </w:tc>
@@ -11549,7 +11969,7 @@
                 <w:sz w:val="18"/>
                 <w:szCs w:val="18"/>
               </w:rPr>
-              <w:t xml:space="preserve">Indicadores de seguimiento</w:t>
+              <w:t xml:space="preserve">Barreras para cumplir la guía</w:t>
             </w:r>
           </w:p>
         </w:tc>
@@ -11583,7 +12003,7 @@
                 <w:sz w:val="18"/>
                 <w:szCs w:val="18"/>
               </w:rPr>
-              <w:t xml:space="preserve">6:16 – 6:32</w:t>
+              <w:t xml:space="preserve">5:43 – 6:01</w:t>
             </w:r>
           </w:p>
         </w:tc>
@@ -11617,7 +12037,7 @@
                 <w:sz w:val="18"/>
                 <w:szCs w:val="18"/>
               </w:rPr>
-              <w:t xml:space="preserve">Para saber si funciona, se miden: la adherencia a la guía, las reconsultas en menos de 72 horas, los eventos adversos, el tiempo de atención y la letalidad por dengue.</w:t>
+              <w:t xml:space="preserve">En casos como este, las barreras suelen repetirse: urgencias saturadas durante la epidemia, personal que rota y no conoce la guía, una cultura que decide por un solo dato de laboratorio, y líderes que no miden la adherencia.</w:t>
             </w:r>
           </w:p>
         </w:tc>
@@ -11691,7 +12111,7 @@
                 <w:sz w:val="18"/>
                 <w:szCs w:val="18"/>
               </w:rPr>
-              <w:t xml:space="preserve">Mi postura</w:t>
+              <w:t xml:space="preserve">Acciones de mejora</w:t>
             </w:r>
           </w:p>
         </w:tc>
@@ -11725,7 +12145,7 @@
                 <w:sz w:val="18"/>
                 <w:szCs w:val="18"/>
               </w:rPr>
-              <w:t xml:space="preserve">6:32 – 6:54</w:t>
+              <w:t xml:space="preserve">6:01 – 6:26</w:t>
             </w:r>
           </w:p>
         </w:tc>
@@ -11759,7 +12179,7 @@
                 <w:sz w:val="18"/>
                 <w:szCs w:val="18"/>
               </w:rPr>
-              <w:t xml:space="preserve">¿Las guías limitan la autonomía médica? Mi postura es que no. La guía es el piso, no el techo: garantiza un mínimo de calidad y deja espacio al juicio clínico. Apartarse de ella es posible, pero debe justificarse en la historia clínica.</w:t>
+              <w:t xml:space="preserve">Propongo acciones realistas: capacitar al personal en la guía de dengue y en las rutas integrales; estandarizar una hoja de egreso con los signos de alarma y la cita de control en 24 horas; hacer auditorías internas de historias clínicas dentro del PAMEC; y realizar simulacros de dengue grave.</w:t>
             </w:r>
           </w:p>
         </w:tc>
@@ -11833,7 +12253,7 @@
                 <w:sz w:val="18"/>
                 <w:szCs w:val="18"/>
               </w:rPr>
-              <w:t xml:space="preserve">Importancia según el marco legal</w:t>
+              <w:t xml:space="preserve">Indicadores de seguimiento</w:t>
             </w:r>
           </w:p>
         </w:tc>
@@ -11867,7 +12287,7 @@
                 <w:sz w:val="18"/>
                 <w:szCs w:val="18"/>
               </w:rPr>
-              <w:t xml:space="preserve">6:54 – 7:14</w:t>
+              <w:t xml:space="preserve">6:26 – 6:42</w:t>
             </w:r>
           </w:p>
         </w:tc>
@@ -11901,7 +12321,7 @@
                 <w:sz w:val="18"/>
                 <w:szCs w:val="18"/>
               </w:rPr>
-              <w:t xml:space="preserve">Por eso, según el marco legal, la adherencia a las guías es clave: protege al paciente, porque reduce errores; protege al profesional, porque demuestra que actuó con diligencia; y protege a la institución, porque es parte de la calidad que exige el sistema.</w:t>
+              <w:t xml:space="preserve">Para saber si funciona, se miden: la adherencia a la guía, las reconsultas en menos de 72 horas, los eventos adversos, el tiempo de atención y la letalidad por dengue.</w:t>
             </w:r>
           </w:p>
         </w:tc>
@@ -11975,7 +12395,7 @@
                 <w:sz w:val="18"/>
                 <w:szCs w:val="18"/>
               </w:rPr>
-              <w:t xml:space="preserve">Cierre</w:t>
+              <w:t xml:space="preserve">Mi postura</w:t>
             </w:r>
           </w:p>
         </w:tc>
@@ -12009,7 +12429,7 @@
                 <w:sz w:val="18"/>
                 <w:szCs w:val="18"/>
               </w:rPr>
-              <w:t xml:space="preserve">7:14 – 7:26</w:t>
+              <w:t xml:space="preserve">6:42 – 7:04</w:t>
             </w:r>
           </w:p>
         </w:tc>
@@ -12043,7 +12463,7 @@
                 <w:sz w:val="18"/>
                 <w:szCs w:val="18"/>
               </w:rPr>
-              <w:t xml:space="preserve">Una guía bien aplicada es una decisión tomada a tiempo. Y en salud, decidir a tiempo puede salvar una vida. Gracias.</w:t>
+              <w:t xml:space="preserve">¿Las guías limitan la autonomía médica? Mi postura es que no. La guía es el piso, no el techo: garantiza un mínimo de calidad y deja espacio al juicio clínico. Apartarse de ella es posible, pero debe justificarse en la historia clínica.</w:t>
             </w:r>
           </w:p>
         </w:tc>
@@ -12117,7 +12537,7 @@
                 <w:sz w:val="18"/>
                 <w:szCs w:val="18"/>
               </w:rPr>
-              <w:t xml:space="preserve">Referencias</w:t>
+              <w:t xml:space="preserve">Importancia según el marco legal</w:t>
             </w:r>
           </w:p>
         </w:tc>
@@ -12151,7 +12571,7 @@
                 <w:sz w:val="18"/>
                 <w:szCs w:val="18"/>
               </w:rPr>
-              <w:t xml:space="preserve">7:26 – 7:36</w:t>
+              <w:t xml:space="preserve">7:04 – 7:24</w:t>
             </w:r>
           </w:p>
         </w:tc>
@@ -12185,7 +12605,7 @@
                 <w:sz w:val="18"/>
                 <w:szCs w:val="18"/>
               </w:rPr>
-              <w:t xml:space="preserve">(Sin voz.)</w:t>
+              <w:t xml:space="preserve">Por eso, según el marco legal, la adherencia a las guías es clave: protege al paciente, porque reduce errores; protege al profesional, porque demuestra que actuó con diligencia; y protege a la institución, porque es parte de la calidad que exige el sistema.</w:t>
             </w:r>
           </w:p>
         </w:tc>
@@ -12259,6 +12679,290 @@
                 <w:sz w:val="18"/>
                 <w:szCs w:val="18"/>
               </w:rPr>
+              <w:t xml:space="preserve">Cierre</w:t>
+            </w:r>
+          </w:p>
+        </w:tc>
+        <w:tc>
+          <w:tcPr>
+            <w:tcW w:type="dxa" w:w="1300"/>
+            <w:tcBorders>
+              <w:top w:val="single" w:color="8EAADB" w:sz="4"/>
+              <w:left w:val="single" w:color="8EAADB" w:sz="4"/>
+              <w:bottom w:val="single" w:color="8EAADB" w:sz="4"/>
+              <w:right w:val="single" w:color="8EAADB" w:sz="4"/>
+            </w:tcBorders>
+            <w:tcMar>
+              <w:top w:type="dxa" w:w="35"/>
+              <w:left w:type="dxa" w:w="80"/>
+              <w:bottom w:type="dxa" w:w="35"/>
+              <w:right w:type="dxa" w:w="80"/>
+            </w:tcMar>
+            <w:vAlign w:val="center"/>
+          </w:tcPr>
+          <w:p>
+            <w:pPr>
+              <w:spacing w:after="20"/>
+            </w:pPr>
+            <w:r>
+              <w:rPr>
+                <w:rFonts w:ascii="Arial" w:cs="Arial" w:eastAsia="Arial" w:hAnsi="Arial"/>
+                <w:b w:val="false"/>
+                <w:bCs w:val="false"/>
+                <w:color w:val="000000"/>
+                <w:sz w:val="18"/>
+                <w:szCs w:val="18"/>
+              </w:rPr>
+              <w:t xml:space="preserve">7:24 – 7:36</w:t>
+            </w:r>
+          </w:p>
+        </w:tc>
+        <w:tc>
+          <w:tcPr>
+            <w:tcW w:type="dxa" w:w="5260"/>
+            <w:tcBorders>
+              <w:top w:val="single" w:color="8EAADB" w:sz="4"/>
+              <w:left w:val="single" w:color="8EAADB" w:sz="4"/>
+              <w:bottom w:val="single" w:color="8EAADB" w:sz="4"/>
+              <w:right w:val="single" w:color="8EAADB" w:sz="4"/>
+            </w:tcBorders>
+            <w:tcMar>
+              <w:top w:type="dxa" w:w="35"/>
+              <w:left w:type="dxa" w:w="80"/>
+              <w:bottom w:type="dxa" w:w="35"/>
+              <w:right w:type="dxa" w:w="80"/>
+            </w:tcMar>
+            <w:vAlign w:val="center"/>
+          </w:tcPr>
+          <w:p>
+            <w:pPr>
+              <w:spacing w:after="20"/>
+            </w:pPr>
+            <w:r>
+              <w:rPr>
+                <w:rFonts w:ascii="Arial" w:cs="Arial" w:eastAsia="Arial" w:hAnsi="Arial"/>
+                <w:b w:val="false"/>
+                <w:bCs w:val="false"/>
+                <w:color w:val="000000"/>
+                <w:sz w:val="18"/>
+                <w:szCs w:val="18"/>
+              </w:rPr>
+              <w:t xml:space="preserve">Una guía bien aplicada es una decisión tomada a tiempo. Y en salud, decidir a tiempo puede salvar una vida. Gracias.</w:t>
+            </w:r>
+          </w:p>
+        </w:tc>
+      </w:tr>
+      <w:tr>
+        <w:trPr>
+          <w:tblHeader w:val="false"/>
+        </w:trPr>
+        <w:tc>
+          <w:tcPr>
+            <w:tcW w:type="dxa" w:w="700"/>
+            <w:tcBorders>
+              <w:top w:val="single" w:color="8EAADB" w:sz="4"/>
+              <w:left w:val="single" w:color="8EAADB" w:sz="4"/>
+              <w:bottom w:val="single" w:color="8EAADB" w:sz="4"/>
+              <w:right w:val="single" w:color="8EAADB" w:sz="4"/>
+            </w:tcBorders>
+            <w:shd w:fill="DEEAF6" w:color="auto" w:val="clear"/>
+            <w:tcMar>
+              <w:top w:type="dxa" w:w="35"/>
+              <w:left w:type="dxa" w:w="80"/>
+              <w:bottom w:type="dxa" w:w="35"/>
+              <w:right w:type="dxa" w:w="80"/>
+            </w:tcMar>
+            <w:vAlign w:val="center"/>
+          </w:tcPr>
+          <w:p>
+            <w:pPr>
+              <w:spacing w:after="20"/>
+            </w:pPr>
+            <w:r>
+              <w:rPr>
+                <w:rFonts w:ascii="Arial" w:cs="Arial" w:eastAsia="Arial" w:hAnsi="Arial"/>
+                <w:b/>
+                <w:bCs/>
+                <w:color w:val="000000"/>
+                <w:sz w:val="18"/>
+                <w:szCs w:val="18"/>
+              </w:rPr>
+              <w:t xml:space="preserve">25</w:t>
+            </w:r>
+          </w:p>
+        </w:tc>
+        <w:tc>
+          <w:tcPr>
+            <w:tcW w:type="dxa" w:w="2100"/>
+            <w:tcBorders>
+              <w:top w:val="single" w:color="8EAADB" w:sz="4"/>
+              <w:left w:val="single" w:color="8EAADB" w:sz="4"/>
+              <w:bottom w:val="single" w:color="8EAADB" w:sz="4"/>
+              <w:right w:val="single" w:color="8EAADB" w:sz="4"/>
+            </w:tcBorders>
+            <w:tcMar>
+              <w:top w:type="dxa" w:w="35"/>
+              <w:left w:type="dxa" w:w="80"/>
+              <w:bottom w:type="dxa" w:w="35"/>
+              <w:right w:type="dxa" w:w="80"/>
+            </w:tcMar>
+            <w:vAlign w:val="center"/>
+          </w:tcPr>
+          <w:p>
+            <w:pPr>
+              <w:spacing w:after="20"/>
+            </w:pPr>
+            <w:r>
+              <w:rPr>
+                <w:rFonts w:ascii="Arial" w:cs="Arial" w:eastAsia="Arial" w:hAnsi="Arial"/>
+                <w:b w:val="false"/>
+                <w:bCs w:val="false"/>
+                <w:color w:val="000000"/>
+                <w:sz w:val="18"/>
+                <w:szCs w:val="18"/>
+              </w:rPr>
+              <w:t xml:space="preserve">Referencias</w:t>
+            </w:r>
+          </w:p>
+        </w:tc>
+        <w:tc>
+          <w:tcPr>
+            <w:tcW w:type="dxa" w:w="1300"/>
+            <w:tcBorders>
+              <w:top w:val="single" w:color="8EAADB" w:sz="4"/>
+              <w:left w:val="single" w:color="8EAADB" w:sz="4"/>
+              <w:bottom w:val="single" w:color="8EAADB" w:sz="4"/>
+              <w:right w:val="single" w:color="8EAADB" w:sz="4"/>
+            </w:tcBorders>
+            <w:tcMar>
+              <w:top w:type="dxa" w:w="35"/>
+              <w:left w:type="dxa" w:w="80"/>
+              <w:bottom w:type="dxa" w:w="35"/>
+              <w:right w:type="dxa" w:w="80"/>
+            </w:tcMar>
+            <w:vAlign w:val="center"/>
+          </w:tcPr>
+          <w:p>
+            <w:pPr>
+              <w:spacing w:after="20"/>
+            </w:pPr>
+            <w:r>
+              <w:rPr>
+                <w:rFonts w:ascii="Arial" w:cs="Arial" w:eastAsia="Arial" w:hAnsi="Arial"/>
+                <w:b w:val="false"/>
+                <w:bCs w:val="false"/>
+                <w:color w:val="000000"/>
+                <w:sz w:val="18"/>
+                <w:szCs w:val="18"/>
+              </w:rPr>
+              <w:t xml:space="preserve">7:36 – 7:44</w:t>
+            </w:r>
+          </w:p>
+        </w:tc>
+        <w:tc>
+          <w:tcPr>
+            <w:tcW w:type="dxa" w:w="5260"/>
+            <w:tcBorders>
+              <w:top w:val="single" w:color="8EAADB" w:sz="4"/>
+              <w:left w:val="single" w:color="8EAADB" w:sz="4"/>
+              <w:bottom w:val="single" w:color="8EAADB" w:sz="4"/>
+              <w:right w:val="single" w:color="8EAADB" w:sz="4"/>
+            </w:tcBorders>
+            <w:tcMar>
+              <w:top w:type="dxa" w:w="35"/>
+              <w:left w:type="dxa" w:w="80"/>
+              <w:bottom w:type="dxa" w:w="35"/>
+              <w:right w:type="dxa" w:w="80"/>
+            </w:tcMar>
+            <w:vAlign w:val="center"/>
+          </w:tcPr>
+          <w:p>
+            <w:pPr>
+              <w:spacing w:after="20"/>
+            </w:pPr>
+            <w:r>
+              <w:rPr>
+                <w:rFonts w:ascii="Arial" w:cs="Arial" w:eastAsia="Arial" w:hAnsi="Arial"/>
+                <w:b w:val="false"/>
+                <w:bCs w:val="false"/>
+                <w:color w:val="000000"/>
+                <w:sz w:val="18"/>
+                <w:szCs w:val="18"/>
+              </w:rPr>
+              <w:t xml:space="preserve">(Sin voz.)</w:t>
+            </w:r>
+          </w:p>
+        </w:tc>
+      </w:tr>
+      <w:tr>
+        <w:trPr>
+          <w:tblHeader w:val="false"/>
+        </w:trPr>
+        <w:tc>
+          <w:tcPr>
+            <w:tcW w:type="dxa" w:w="700"/>
+            <w:tcBorders>
+              <w:top w:val="single" w:color="8EAADB" w:sz="4"/>
+              <w:left w:val="single" w:color="8EAADB" w:sz="4"/>
+              <w:bottom w:val="single" w:color="8EAADB" w:sz="4"/>
+              <w:right w:val="single" w:color="8EAADB" w:sz="4"/>
+            </w:tcBorders>
+            <w:shd w:fill="DEEAF6" w:color="auto" w:val="clear"/>
+            <w:tcMar>
+              <w:top w:type="dxa" w:w="35"/>
+              <w:left w:type="dxa" w:w="80"/>
+              <w:bottom w:type="dxa" w:w="35"/>
+              <w:right w:type="dxa" w:w="80"/>
+            </w:tcMar>
+            <w:vAlign w:val="center"/>
+          </w:tcPr>
+          <w:p>
+            <w:pPr>
+              <w:spacing w:after="20"/>
+            </w:pPr>
+            <w:r>
+              <w:rPr>
+                <w:rFonts w:ascii="Arial" w:cs="Arial" w:eastAsia="Arial" w:hAnsi="Arial"/>
+                <w:b/>
+                <w:bCs/>
+                <w:color w:val="000000"/>
+                <w:sz w:val="18"/>
+                <w:szCs w:val="18"/>
+              </w:rPr>
+              <w:t xml:space="preserve">26</w:t>
+            </w:r>
+          </w:p>
+        </w:tc>
+        <w:tc>
+          <w:tcPr>
+            <w:tcW w:type="dxa" w:w="2100"/>
+            <w:tcBorders>
+              <w:top w:val="single" w:color="8EAADB" w:sz="4"/>
+              <w:left w:val="single" w:color="8EAADB" w:sz="4"/>
+              <w:bottom w:val="single" w:color="8EAADB" w:sz="4"/>
+              <w:right w:val="single" w:color="8EAADB" w:sz="4"/>
+            </w:tcBorders>
+            <w:tcMar>
+              <w:top w:type="dxa" w:w="35"/>
+              <w:left w:type="dxa" w:w="80"/>
+              <w:bottom w:type="dxa" w:w="35"/>
+              <w:right w:type="dxa" w:w="80"/>
+            </w:tcMar>
+            <w:vAlign w:val="center"/>
+          </w:tcPr>
+          <w:p>
+            <w:pPr>
+              <w:spacing w:after="20"/>
+            </w:pPr>
+            <w:r>
+              <w:rPr>
+                <w:rFonts w:ascii="Arial" w:cs="Arial" w:eastAsia="Arial" w:hAnsi="Arial"/>
+                <w:b w:val="false"/>
+                <w:bCs w:val="false"/>
+                <w:color w:val="000000"/>
+                <w:sz w:val="18"/>
+                <w:szCs w:val="18"/>
+              </w:rPr>
               <w:t xml:space="preserve">Créditos</w:t>
             </w:r>
           </w:p>
@@ -12293,7 +12997,7 @@
                 <w:sz w:val="18"/>
                 <w:szCs w:val="18"/>
               </w:rPr>
-              <w:t xml:space="preserve">7:36 – 7:42</w:t>
+              <w:t xml:space="preserve">7:44 – 7:50</w:t>
             </w:r>
           </w:p>
         </w:tc>
@@ -12439,7 +13143,7 @@
           <w:sz w:val="22"/>
           <w:szCs w:val="22"/>
         </w:rPr>
-        <w:t xml:space="preserve">si modifica las diapositivas 2, 5, 17 o 22, borre el texto gris de indicación, seleccione el panel azul con sus textos, haga clic derecho → Guardar como imagen → PNG. Así la imagen queda con fondo transparente. Si no las modifica, use los PNG “OVERLAY” incluidos.</w:t>
+        <w:t xml:space="preserve">si modifica las diapositivas OVERLAY del PowerPoint (2, 5, 17 o 22), borre el texto gris de indicación, seleccione el panel azul con sus textos, haga clic derecho → Guardar como imagen → PNG. Así la imagen queda con fondo transparente. Si no las modifica, use los PNG “OVERLAY” incluidos.</w:t>
       </w:r>
     </w:p>
     <w:p>
@@ -12489,7 +13193,7 @@
           <w:sz w:val="22"/>
           <w:szCs w:val="22"/>
         </w:rPr>
-        <w:t xml:space="preserve">Escenas con video de stock (2, 5, 17 y 22): </w:t>
+        <w:t xml:space="preserve">Escenas con video de stock (2 (02_OVERLAY.png), 7 (05_OVERLAY.png), 19 (17_OVERLAY.png), 24 (22_OVERLAY.png)): </w:t>
       </w:r>
       <w:r>
         <w:rPr>
@@ -12498,6 +13202,35 @@
           <w:szCs w:val="22"/>
         </w:rPr>
         <w:t xml:space="preserve">en “Biblioteca de contenido → Videos”, busque el término indicado en la tabla, arrástrelo a la línea de tiempo y ponga encima, en una pista superior, el PNG “OVERLAY”. El video se verá a la derecha y el texto a la izquierda.</w:t>
+      </w:r>
+    </w:p>
+    <w:p>
+      <w:pPr>
+        <w:pStyle w:val="ListParagraph"/>
+        <w:numPr>
+          <w:ilvl w:val="0"/>
+          <w:numId w:val="2"/>
+        </w:numPr>
+        <w:spacing w:after="60" w:line="290"/>
+        <w:jc w:val="both"/>
+      </w:pPr>
+      <w:r>
+        <w:rPr>
+          <w:rFonts w:ascii="Arial" w:cs="Arial" w:eastAsia="Arial" w:hAnsi="Arial"/>
+          <w:b/>
+          <w:bCs/>
+          <w:sz w:val="22"/>
+          <w:szCs w:val="22"/>
+        </w:rPr>
+        <w:t xml:space="preserve">Escenas hechas en Clipchamp (3 y 4): </w:t>
+      </w:r>
+      <w:r>
+        <w:rPr>
+          <w:rFonts w:ascii="Arial" w:cs="Arial" w:eastAsia="Arial" w:hAnsi="Arial"/>
+          <w:sz w:val="22"/>
+          <w:szCs w:val="22"/>
+        </w:rPr>
+        <w:t xml:space="preserve">la frase de arranque y el recorrido del video ya están diseñados directamente en Clipchamp; déjelas de 10 segundos cada una.</w:t>
       </w:r>
     </w:p>
     <w:p>
@@ -13047,7 +13780,7 @@
                 <w:sz w:val="18"/>
                 <w:szCs w:val="18"/>
               </w:rPr>
-              <w:t xml:space="preserve">6 s</w:t>
+              <w:t xml:space="preserve">10 s</w:t>
             </w:r>
           </w:p>
         </w:tc>
@@ -13121,7 +13854,7 @@
                 <w:sz w:val="18"/>
                 <w:szCs w:val="18"/>
               </w:rPr>
-              <w:t xml:space="preserve">Presentación</w:t>
+              <w:t xml:space="preserve">Un caso real</w:t>
             </w:r>
           </w:p>
         </w:tc>
@@ -13223,7 +13956,7 @@
                 <w:sz w:val="18"/>
                 <w:szCs w:val="18"/>
               </w:rPr>
-              <w:t xml:space="preserve">18 s</w:t>
+              <w:t xml:space="preserve">10 s</w:t>
             </w:r>
           </w:p>
         </w:tc>
@@ -13297,7 +14030,7 @@
                 <w:sz w:val="18"/>
                 <w:szCs w:val="18"/>
               </w:rPr>
-              <w:t xml:space="preserve">Guía, protocolo y algoritmo</w:t>
+              <w:t xml:space="preserve">Frase de arranque</w:t>
             </w:r>
           </w:p>
         </w:tc>
@@ -13331,7 +14064,7 @@
                 <w:sz w:val="18"/>
                 <w:szCs w:val="18"/>
               </w:rPr>
-              <w:t xml:space="preserve">03_tarjeta.png</w:t>
+              <w:t xml:space="preserve">Hecha en Clipchamp</w:t>
             </w:r>
           </w:p>
         </w:tc>
@@ -13399,7 +14132,7 @@
                 <w:sz w:val="18"/>
                 <w:szCs w:val="18"/>
               </w:rPr>
-              <w:t xml:space="preserve">18 s</w:t>
+              <w:t xml:space="preserve">10 s</w:t>
             </w:r>
           </w:p>
         </w:tc>
@@ -13473,7 +14206,7 @@
                 <w:sz w:val="18"/>
                 <w:szCs w:val="18"/>
               </w:rPr>
-              <w:t xml:space="preserve">¿Cómo se construye una guía?</w:t>
+              <w:t xml:space="preserve">Lo que veremos</w:t>
             </w:r>
           </w:p>
         </w:tc>
@@ -13507,7 +14240,7 @@
                 <w:sz w:val="18"/>
                 <w:szCs w:val="18"/>
               </w:rPr>
-              <w:t xml:space="preserve">04_tarjeta.png</w:t>
+              <w:t xml:space="preserve">Hecha en Clipchamp</w:t>
             </w:r>
           </w:p>
         </w:tc>
@@ -13541,7 +14274,7 @@
                 <w:sz w:val="18"/>
                 <w:szCs w:val="18"/>
               </w:rPr>
-              <w:t xml:space="preserve">No aplica</w:t>
+              <w:t xml:space="preserve">“hospital corridor”</w:t>
             </w:r>
           </w:p>
         </w:tc>
@@ -13575,7 +14308,7 @@
                 <w:sz w:val="18"/>
                 <w:szCs w:val="18"/>
               </w:rPr>
-              <w:t xml:space="preserve">16 s</w:t>
+              <w:t xml:space="preserve">10 s</w:t>
             </w:r>
           </w:p>
         </w:tc>
@@ -13649,7 +14382,7 @@
                 <w:sz w:val="18"/>
                 <w:szCs w:val="18"/>
               </w:rPr>
-              <w:t xml:space="preserve">Contexto: dengue en Santander</w:t>
+              <w:t xml:space="preserve">Guía, protocolo y algoritmo</w:t>
             </w:r>
           </w:p>
         </w:tc>
@@ -13683,7 +14416,7 @@
                 <w:sz w:val="18"/>
                 <w:szCs w:val="18"/>
               </w:rPr>
-              <w:t xml:space="preserve">05_OVERLAY.png</w:t>
+              <w:t xml:space="preserve">03_tarjeta.png</w:t>
             </w:r>
           </w:p>
         </w:tc>
@@ -13717,7 +14450,7 @@
                 <w:sz w:val="18"/>
                 <w:szCs w:val="18"/>
               </w:rPr>
-              <w:t xml:space="preserve">“mosquito”</w:t>
+              <w:t xml:space="preserve">No aplica</w:t>
             </w:r>
           </w:p>
         </w:tc>
@@ -13751,7 +14484,7 @@
                 <w:sz w:val="18"/>
                 <w:szCs w:val="18"/>
               </w:rPr>
-              <w:t xml:space="preserve">18 s</w:t>
+              <w:t xml:space="preserve">16 s</w:t>
             </w:r>
           </w:p>
         </w:tc>
@@ -13825,7 +14558,7 @@
                 <w:sz w:val="18"/>
                 <w:szCs w:val="18"/>
               </w:rPr>
-              <w:t xml:space="preserve">El caso</w:t>
+              <w:t xml:space="preserve">¿Cómo se construye una guía?</w:t>
             </w:r>
           </w:p>
         </w:tc>
@@ -13859,7 +14592,7 @@
                 <w:sz w:val="18"/>
                 <w:szCs w:val="18"/>
               </w:rPr>
-              <w:t xml:space="preserve">06_tarjeta.png</w:t>
+              <w:t xml:space="preserve">04_tarjeta.png</w:t>
             </w:r>
           </w:p>
         </w:tc>
@@ -13927,7 +14660,7 @@
                 <w:sz w:val="18"/>
                 <w:szCs w:val="18"/>
               </w:rPr>
-              <w:t xml:space="preserve">22 s</w:t>
+              <w:t xml:space="preserve">16 s</w:t>
             </w:r>
           </w:p>
         </w:tc>
@@ -14001,7 +14734,7 @@
                 <w:sz w:val="18"/>
                 <w:szCs w:val="18"/>
               </w:rPr>
-              <w:t xml:space="preserve">Lo que dice la guía: clasificación</w:t>
+              <w:t xml:space="preserve">Contexto: dengue en Santander</w:t>
             </w:r>
           </w:p>
         </w:tc>
@@ -14035,7 +14768,7 @@
                 <w:sz w:val="18"/>
                 <w:szCs w:val="18"/>
               </w:rPr>
-              <w:t xml:space="preserve">07_tarjeta.png</w:t>
+              <w:t xml:space="preserve">05_OVERLAY.png</w:t>
             </w:r>
           </w:p>
         </w:tc>
@@ -14069,7 +14802,7 @@
                 <w:sz w:val="18"/>
                 <w:szCs w:val="18"/>
               </w:rPr>
-              <w:t xml:space="preserve">No aplica</w:t>
+              <w:t xml:space="preserve">“mosquito”</w:t>
             </w:r>
           </w:p>
         </w:tc>
@@ -14103,7 +14836,7 @@
                 <w:sz w:val="18"/>
                 <w:szCs w:val="18"/>
               </w:rPr>
-              <w:t xml:space="preserve">25 s</w:t>
+              <w:t xml:space="preserve">14 s</w:t>
             </w:r>
           </w:p>
         </w:tc>
@@ -14177,7 +14910,7 @@
                 <w:sz w:val="18"/>
                 <w:szCs w:val="18"/>
               </w:rPr>
-              <w:t xml:space="preserve">Signos de alarma y fase crítica</w:t>
+              <w:t xml:space="preserve">El caso</w:t>
             </w:r>
           </w:p>
         </w:tc>
@@ -14211,7 +14944,7 @@
                 <w:sz w:val="18"/>
                 <w:szCs w:val="18"/>
               </w:rPr>
-              <w:t xml:space="preserve">08_tarjeta.png</w:t>
+              <w:t xml:space="preserve">06_tarjeta.png</w:t>
             </w:r>
           </w:p>
         </w:tc>
@@ -14353,7 +15086,7 @@
                 <w:sz w:val="18"/>
                 <w:szCs w:val="18"/>
               </w:rPr>
-              <w:t xml:space="preserve">La guía frente al caso</w:t>
+              <w:t xml:space="preserve">Lo que dice la guía: clasificación</w:t>
             </w:r>
           </w:p>
         </w:tc>
@@ -14387,7 +15120,7 @@
                 <w:sz w:val="18"/>
                 <w:szCs w:val="18"/>
               </w:rPr>
-              <w:t xml:space="preserve">09_tarjeta.png</w:t>
+              <w:t xml:space="preserve">07_tarjeta.png</w:t>
             </w:r>
           </w:p>
         </w:tc>
@@ -14529,7 +15262,7 @@
                 <w:sz w:val="18"/>
                 <w:szCs w:val="18"/>
               </w:rPr>
-              <w:t xml:space="preserve">Marco normativo general</w:t>
+              <w:t xml:space="preserve">Signos de alarma y fase crítica</w:t>
             </w:r>
           </w:p>
         </w:tc>
@@ -14563,7 +15296,7 @@
                 <w:sz w:val="18"/>
                 <w:szCs w:val="18"/>
               </w:rPr>
-              <w:t xml:space="preserve">10_tarjeta.png</w:t>
+              <w:t xml:space="preserve">08_tarjeta.png</w:t>
             </w:r>
           </w:p>
         </w:tc>
@@ -14631,7 +15364,7 @@
                 <w:sz w:val="18"/>
                 <w:szCs w:val="18"/>
               </w:rPr>
-              <w:t xml:space="preserve">25 s</w:t>
+              <w:t xml:space="preserve">22 s</w:t>
             </w:r>
           </w:p>
         </w:tc>
@@ -14705,7 +15438,7 @@
                 <w:sz w:val="18"/>
                 <w:szCs w:val="18"/>
               </w:rPr>
-              <w:t xml:space="preserve">Cursos de vida: gestación e infancia</w:t>
+              <w:t xml:space="preserve">La guía frente al caso</w:t>
             </w:r>
           </w:p>
         </w:tc>
@@ -14739,7 +15472,7 @@
                 <w:sz w:val="18"/>
                 <w:szCs w:val="18"/>
               </w:rPr>
-              <w:t xml:space="preserve">11_tarjeta.png</w:t>
+              <w:t xml:space="preserve">09_tarjeta.png</w:t>
             </w:r>
           </w:p>
         </w:tc>
@@ -14881,7 +15614,7 @@
                 <w:sz w:val="18"/>
                 <w:szCs w:val="18"/>
               </w:rPr>
-              <w:t xml:space="preserve">Cursos de vida: adolescencia a vejez</w:t>
+              <w:t xml:space="preserve">Marco normativo general</w:t>
             </w:r>
           </w:p>
         </w:tc>
@@ -14915,7 +15648,7 @@
                 <w:sz w:val="18"/>
                 <w:szCs w:val="18"/>
               </w:rPr>
-              <w:t xml:space="preserve">12_tarjeta.png</w:t>
+              <w:t xml:space="preserve">10_tarjeta.png</w:t>
             </w:r>
           </w:p>
         </w:tc>
@@ -15057,7 +15790,7 @@
                 <w:sz w:val="18"/>
                 <w:szCs w:val="18"/>
               </w:rPr>
-              <w:t xml:space="preserve">Marco legal del daño médico</w:t>
+              <w:t xml:space="preserve">Cursos de vida: gestación e infancia</w:t>
             </w:r>
           </w:p>
         </w:tc>
@@ -15091,7 +15824,7 @@
                 <w:sz w:val="18"/>
                 <w:szCs w:val="18"/>
               </w:rPr>
-              <w:t xml:space="preserve">13_tarjeta.png</w:t>
+              <w:t xml:space="preserve">11_tarjeta.png</w:t>
             </w:r>
           </w:p>
         </w:tc>
@@ -15233,7 +15966,7 @@
                 <w:sz w:val="18"/>
                 <w:szCs w:val="18"/>
               </w:rPr>
-              <w:t xml:space="preserve">La guía como prueba</w:t>
+              <w:t xml:space="preserve">Cursos de vida: adolescencia a vejez</w:t>
             </w:r>
           </w:p>
         </w:tc>
@@ -15267,7 +16000,7 @@
                 <w:sz w:val="18"/>
                 <w:szCs w:val="18"/>
               </w:rPr>
-              <w:t xml:space="preserve">14_tarjeta.png</w:t>
+              <w:t xml:space="preserve">12_tarjeta.png</w:t>
             </w:r>
           </w:p>
         </w:tc>
@@ -15335,7 +16068,7 @@
                 <w:sz w:val="18"/>
                 <w:szCs w:val="18"/>
               </w:rPr>
-              <w:t xml:space="preserve">18 s</w:t>
+              <w:t xml:space="preserve">25 s</w:t>
             </w:r>
           </w:p>
         </w:tc>
@@ -15409,7 +16142,7 @@
                 <w:sz w:val="18"/>
                 <w:szCs w:val="18"/>
               </w:rPr>
-              <w:t xml:space="preserve">Consecuencias reales</w:t>
+              <w:t xml:space="preserve">Marco legal del daño médico</w:t>
             </w:r>
           </w:p>
         </w:tc>
@@ -15443,7 +16176,7 @@
                 <w:sz w:val="18"/>
                 <w:szCs w:val="18"/>
               </w:rPr>
-              <w:t xml:space="preserve">15_tarjeta.png</w:t>
+              <w:t xml:space="preserve">13_tarjeta.png</w:t>
             </w:r>
           </w:p>
         </w:tc>
@@ -15585,7 +16318,7 @@
                 <w:sz w:val="18"/>
                 <w:szCs w:val="18"/>
               </w:rPr>
-              <w:t xml:space="preserve">Consecuencias de no adherirse</w:t>
+              <w:t xml:space="preserve">La guía como prueba</w:t>
             </w:r>
           </w:p>
         </w:tc>
@@ -15619,7 +16352,7 @@
                 <w:sz w:val="18"/>
                 <w:szCs w:val="18"/>
               </w:rPr>
-              <w:t xml:space="preserve">16_tarjeta.png</w:t>
+              <w:t xml:space="preserve">14_tarjeta.png</w:t>
             </w:r>
           </w:p>
         </w:tc>
@@ -15687,7 +16420,7 @@
                 <w:sz w:val="18"/>
                 <w:szCs w:val="18"/>
               </w:rPr>
-              <w:t xml:space="preserve">20 s</w:t>
+              <w:t xml:space="preserve">18 s</w:t>
             </w:r>
           </w:p>
         </w:tc>
@@ -15761,7 +16494,7 @@
                 <w:sz w:val="18"/>
                 <w:szCs w:val="18"/>
               </w:rPr>
-              <w:t xml:space="preserve">Barreras para cumplir la guía</w:t>
+              <w:t xml:space="preserve">Consecuencias reales</w:t>
             </w:r>
           </w:p>
         </w:tc>
@@ -15795,7 +16528,7 @@
                 <w:sz w:val="18"/>
                 <w:szCs w:val="18"/>
               </w:rPr>
-              <w:t xml:space="preserve">17_OVERLAY.png</w:t>
+              <w:t xml:space="preserve">15_tarjeta.png</w:t>
             </w:r>
           </w:p>
         </w:tc>
@@ -15829,7 +16562,7 @@
                 <w:sz w:val="18"/>
                 <w:szCs w:val="18"/>
               </w:rPr>
-              <w:t xml:space="preserve">“busy emergency room”</w:t>
+              <w:t xml:space="preserve">No aplica</w:t>
             </w:r>
           </w:p>
         </w:tc>
@@ -15863,7 +16596,7 @@
                 <w:sz w:val="18"/>
                 <w:szCs w:val="18"/>
               </w:rPr>
-              <w:t xml:space="preserve">18 s</w:t>
+              <w:t xml:space="preserve">25 s</w:t>
             </w:r>
           </w:p>
         </w:tc>
@@ -15937,7 +16670,7 @@
                 <w:sz w:val="18"/>
                 <w:szCs w:val="18"/>
               </w:rPr>
-              <w:t xml:space="preserve">Acciones de mejora</w:t>
+              <w:t xml:space="preserve">Consecuencias de no adherirse</w:t>
             </w:r>
           </w:p>
         </w:tc>
@@ -15971,7 +16704,7 @@
                 <w:sz w:val="18"/>
                 <w:szCs w:val="18"/>
               </w:rPr>
-              <w:t xml:space="preserve">18_tarjeta.png</w:t>
+              <w:t xml:space="preserve">16_tarjeta.png</w:t>
             </w:r>
           </w:p>
         </w:tc>
@@ -16039,7 +16772,7 @@
                 <w:sz w:val="18"/>
                 <w:szCs w:val="18"/>
               </w:rPr>
-              <w:t xml:space="preserve">25 s</w:t>
+              <w:t xml:space="preserve">20 s</w:t>
             </w:r>
           </w:p>
         </w:tc>
@@ -16113,7 +16846,7 @@
                 <w:sz w:val="18"/>
                 <w:szCs w:val="18"/>
               </w:rPr>
-              <w:t xml:space="preserve">Indicadores de seguimiento</w:t>
+              <w:t xml:space="preserve">Barreras para cumplir la guía</w:t>
             </w:r>
           </w:p>
         </w:tc>
@@ -16147,7 +16880,7 @@
                 <w:sz w:val="18"/>
                 <w:szCs w:val="18"/>
               </w:rPr>
-              <w:t xml:space="preserve">19_tarjeta.png</w:t>
+              <w:t xml:space="preserve">17_OVERLAY.png</w:t>
             </w:r>
           </w:p>
         </w:tc>
@@ -16181,7 +16914,7 @@
                 <w:sz w:val="18"/>
                 <w:szCs w:val="18"/>
               </w:rPr>
-              <w:t xml:space="preserve">No aplica</w:t>
+              <w:t xml:space="preserve">“busy emergency room”</w:t>
             </w:r>
           </w:p>
         </w:tc>
@@ -16215,7 +16948,7 @@
                 <w:sz w:val="18"/>
                 <w:szCs w:val="18"/>
               </w:rPr>
-              <w:t xml:space="preserve">16 s</w:t>
+              <w:t xml:space="preserve">18 s</w:t>
             </w:r>
           </w:p>
         </w:tc>
@@ -16289,7 +17022,7 @@
                 <w:sz w:val="18"/>
                 <w:szCs w:val="18"/>
               </w:rPr>
-              <w:t xml:space="preserve">Mi postura</w:t>
+              <w:t xml:space="preserve">Acciones de mejora</w:t>
             </w:r>
           </w:p>
         </w:tc>
@@ -16323,7 +17056,7 @@
                 <w:sz w:val="18"/>
                 <w:szCs w:val="18"/>
               </w:rPr>
-              <w:t xml:space="preserve">20_tarjeta.png</w:t>
+              <w:t xml:space="preserve">18_tarjeta.png</w:t>
             </w:r>
           </w:p>
         </w:tc>
@@ -16391,7 +17124,7 @@
                 <w:sz w:val="18"/>
                 <w:szCs w:val="18"/>
               </w:rPr>
-              <w:t xml:space="preserve">22 s</w:t>
+              <w:t xml:space="preserve">25 s</w:t>
             </w:r>
           </w:p>
         </w:tc>
@@ -16465,7 +17198,7 @@
                 <w:sz w:val="18"/>
                 <w:szCs w:val="18"/>
               </w:rPr>
-              <w:t xml:space="preserve">Importancia según el marco legal</w:t>
+              <w:t xml:space="preserve">Indicadores de seguimiento</w:t>
             </w:r>
           </w:p>
         </w:tc>
@@ -16499,7 +17232,7 @@
                 <w:sz w:val="18"/>
                 <w:szCs w:val="18"/>
               </w:rPr>
-              <w:t xml:space="preserve">21_tarjeta.png</w:t>
+              <w:t xml:space="preserve">19_tarjeta.png</w:t>
             </w:r>
           </w:p>
         </w:tc>
@@ -16567,7 +17300,7 @@
                 <w:sz w:val="18"/>
                 <w:szCs w:val="18"/>
               </w:rPr>
-              <w:t xml:space="preserve">20 s</w:t>
+              <w:t xml:space="preserve">16 s</w:t>
             </w:r>
           </w:p>
         </w:tc>
@@ -16641,7 +17374,7 @@
                 <w:sz w:val="18"/>
                 <w:szCs w:val="18"/>
               </w:rPr>
-              <w:t xml:space="preserve">Cierre</w:t>
+              <w:t xml:space="preserve">Mi postura</w:t>
             </w:r>
           </w:p>
         </w:tc>
@@ -16675,7 +17408,7 @@
                 <w:sz w:val="18"/>
                 <w:szCs w:val="18"/>
               </w:rPr>
-              <w:t xml:space="preserve">22_OVERLAY.png</w:t>
+              <w:t xml:space="preserve">20_tarjeta.png</w:t>
             </w:r>
           </w:p>
         </w:tc>
@@ -16709,7 +17442,7 @@
                 <w:sz w:val="18"/>
                 <w:szCs w:val="18"/>
               </w:rPr>
-              <w:t xml:space="preserve">“doctor child patient”</w:t>
+              <w:t xml:space="preserve">No aplica</w:t>
             </w:r>
           </w:p>
         </w:tc>
@@ -16743,7 +17476,7 @@
                 <w:sz w:val="18"/>
                 <w:szCs w:val="18"/>
               </w:rPr>
-              <w:t xml:space="preserve">12 s</w:t>
+              <w:t xml:space="preserve">22 s</w:t>
             </w:r>
           </w:p>
         </w:tc>
@@ -16817,7 +17550,7 @@
                 <w:sz w:val="18"/>
                 <w:szCs w:val="18"/>
               </w:rPr>
-              <w:t xml:space="preserve">Referencias</w:t>
+              <w:t xml:space="preserve">Importancia según el marco legal</w:t>
             </w:r>
           </w:p>
         </w:tc>
@@ -16851,7 +17584,7 @@
                 <w:sz w:val="18"/>
                 <w:szCs w:val="18"/>
               </w:rPr>
-              <w:t xml:space="preserve">23_tarjeta.png</w:t>
+              <w:t xml:space="preserve">21_tarjeta.png</w:t>
             </w:r>
           </w:p>
         </w:tc>
@@ -16919,7 +17652,7 @@
                 <w:sz w:val="18"/>
                 <w:szCs w:val="18"/>
               </w:rPr>
-              <w:t xml:space="preserve">10 s</w:t>
+              <w:t xml:space="preserve">20 s</w:t>
             </w:r>
           </w:p>
         </w:tc>
@@ -16960,6 +17693,358 @@
                 <w:szCs w:val="18"/>
               </w:rPr>
               <w:t xml:space="preserve">24</w:t>
+            </w:r>
+          </w:p>
+        </w:tc>
+        <w:tc>
+          <w:tcPr>
+            <w:tcW w:type="dxa" w:w="2700"/>
+            <w:tcBorders>
+              <w:top w:val="single" w:color="8EAADB" w:sz="4"/>
+              <w:left w:val="single" w:color="8EAADB" w:sz="4"/>
+              <w:bottom w:val="single" w:color="8EAADB" w:sz="4"/>
+              <w:right w:val="single" w:color="8EAADB" w:sz="4"/>
+            </w:tcBorders>
+            <w:tcMar>
+              <w:top w:type="dxa" w:w="35"/>
+              <w:left w:type="dxa" w:w="80"/>
+              <w:bottom w:type="dxa" w:w="35"/>
+              <w:right w:type="dxa" w:w="80"/>
+            </w:tcMar>
+            <w:vAlign w:val="center"/>
+          </w:tcPr>
+          <w:p>
+            <w:pPr>
+              <w:spacing w:after="20"/>
+            </w:pPr>
+            <w:r>
+              <w:rPr>
+                <w:rFonts w:ascii="Arial" w:cs="Arial" w:eastAsia="Arial" w:hAnsi="Arial"/>
+                <w:b w:val="false"/>
+                <w:bCs w:val="false"/>
+                <w:color w:val="000000"/>
+                <w:sz w:val="18"/>
+                <w:szCs w:val="18"/>
+              </w:rPr>
+              <w:t xml:space="preserve">Cierre</w:t>
+            </w:r>
+          </w:p>
+        </w:tc>
+        <w:tc>
+          <w:tcPr>
+            <w:tcW w:type="dxa" w:w="2500"/>
+            <w:tcBorders>
+              <w:top w:val="single" w:color="8EAADB" w:sz="4"/>
+              <w:left w:val="single" w:color="8EAADB" w:sz="4"/>
+              <w:bottom w:val="single" w:color="8EAADB" w:sz="4"/>
+              <w:right w:val="single" w:color="8EAADB" w:sz="4"/>
+            </w:tcBorders>
+            <w:tcMar>
+              <w:top w:type="dxa" w:w="35"/>
+              <w:left w:type="dxa" w:w="80"/>
+              <w:bottom w:type="dxa" w:w="35"/>
+              <w:right w:type="dxa" w:w="80"/>
+            </w:tcMar>
+            <w:vAlign w:val="center"/>
+          </w:tcPr>
+          <w:p>
+            <w:pPr>
+              <w:spacing w:after="20"/>
+            </w:pPr>
+            <w:r>
+              <w:rPr>
+                <w:rFonts w:ascii="Arial" w:cs="Arial" w:eastAsia="Arial" w:hAnsi="Arial"/>
+                <w:b w:val="false"/>
+                <w:bCs w:val="false"/>
+                <w:color w:val="000000"/>
+                <w:sz w:val="18"/>
+                <w:szCs w:val="18"/>
+              </w:rPr>
+              <w:t xml:space="preserve">22_OVERLAY.png</w:t>
+            </w:r>
+          </w:p>
+        </w:tc>
+        <w:tc>
+          <w:tcPr>
+            <w:tcW w:type="dxa" w:w="2460"/>
+            <w:tcBorders>
+              <w:top w:val="single" w:color="8EAADB" w:sz="4"/>
+              <w:left w:val="single" w:color="8EAADB" w:sz="4"/>
+              <w:bottom w:val="single" w:color="8EAADB" w:sz="4"/>
+              <w:right w:val="single" w:color="8EAADB" w:sz="4"/>
+            </w:tcBorders>
+            <w:tcMar>
+              <w:top w:type="dxa" w:w="35"/>
+              <w:left w:type="dxa" w:w="80"/>
+              <w:bottom w:type="dxa" w:w="35"/>
+              <w:right w:type="dxa" w:w="80"/>
+            </w:tcMar>
+            <w:vAlign w:val="center"/>
+          </w:tcPr>
+          <w:p>
+            <w:pPr>
+              <w:spacing w:after="20"/>
+            </w:pPr>
+            <w:r>
+              <w:rPr>
+                <w:rFonts w:ascii="Arial" w:cs="Arial" w:eastAsia="Arial" w:hAnsi="Arial"/>
+                <w:b w:val="false"/>
+                <w:bCs w:val="false"/>
+                <w:color w:val="000000"/>
+                <w:sz w:val="18"/>
+                <w:szCs w:val="18"/>
+              </w:rPr>
+              <w:t xml:space="preserve">“doctor child patient”</w:t>
+            </w:r>
+          </w:p>
+        </w:tc>
+        <w:tc>
+          <w:tcPr>
+            <w:tcW w:type="dxa" w:w="1000"/>
+            <w:tcBorders>
+              <w:top w:val="single" w:color="8EAADB" w:sz="4"/>
+              <w:left w:val="single" w:color="8EAADB" w:sz="4"/>
+              <w:bottom w:val="single" w:color="8EAADB" w:sz="4"/>
+              <w:right w:val="single" w:color="8EAADB" w:sz="4"/>
+            </w:tcBorders>
+            <w:tcMar>
+              <w:top w:type="dxa" w:w="35"/>
+              <w:left w:type="dxa" w:w="80"/>
+              <w:bottom w:type="dxa" w:w="35"/>
+              <w:right w:type="dxa" w:w="80"/>
+            </w:tcMar>
+            <w:vAlign w:val="center"/>
+          </w:tcPr>
+          <w:p>
+            <w:pPr>
+              <w:spacing w:after="20"/>
+            </w:pPr>
+            <w:r>
+              <w:rPr>
+                <w:rFonts w:ascii="Arial" w:cs="Arial" w:eastAsia="Arial" w:hAnsi="Arial"/>
+                <w:b w:val="false"/>
+                <w:bCs w:val="false"/>
+                <w:color w:val="000000"/>
+                <w:sz w:val="18"/>
+                <w:szCs w:val="18"/>
+              </w:rPr>
+              <w:t xml:space="preserve">12 s</w:t>
+            </w:r>
+          </w:p>
+        </w:tc>
+      </w:tr>
+      <w:tr>
+        <w:trPr>
+          <w:tblHeader w:val="false"/>
+        </w:trPr>
+        <w:tc>
+          <w:tcPr>
+            <w:tcW w:type="dxa" w:w="700"/>
+            <w:tcBorders>
+              <w:top w:val="single" w:color="8EAADB" w:sz="4"/>
+              <w:left w:val="single" w:color="8EAADB" w:sz="4"/>
+              <w:bottom w:val="single" w:color="8EAADB" w:sz="4"/>
+              <w:right w:val="single" w:color="8EAADB" w:sz="4"/>
+            </w:tcBorders>
+            <w:shd w:fill="DEEAF6" w:color="auto" w:val="clear"/>
+            <w:tcMar>
+              <w:top w:type="dxa" w:w="35"/>
+              <w:left w:type="dxa" w:w="80"/>
+              <w:bottom w:type="dxa" w:w="35"/>
+              <w:right w:type="dxa" w:w="80"/>
+            </w:tcMar>
+            <w:vAlign w:val="center"/>
+          </w:tcPr>
+          <w:p>
+            <w:pPr>
+              <w:spacing w:after="20"/>
+            </w:pPr>
+            <w:r>
+              <w:rPr>
+                <w:rFonts w:ascii="Arial" w:cs="Arial" w:eastAsia="Arial" w:hAnsi="Arial"/>
+                <w:b/>
+                <w:bCs/>
+                <w:color w:val="000000"/>
+                <w:sz w:val="18"/>
+                <w:szCs w:val="18"/>
+              </w:rPr>
+              <w:t xml:space="preserve">25</w:t>
+            </w:r>
+          </w:p>
+        </w:tc>
+        <w:tc>
+          <w:tcPr>
+            <w:tcW w:type="dxa" w:w="2700"/>
+            <w:tcBorders>
+              <w:top w:val="single" w:color="8EAADB" w:sz="4"/>
+              <w:left w:val="single" w:color="8EAADB" w:sz="4"/>
+              <w:bottom w:val="single" w:color="8EAADB" w:sz="4"/>
+              <w:right w:val="single" w:color="8EAADB" w:sz="4"/>
+            </w:tcBorders>
+            <w:tcMar>
+              <w:top w:type="dxa" w:w="35"/>
+              <w:left w:type="dxa" w:w="80"/>
+              <w:bottom w:type="dxa" w:w="35"/>
+              <w:right w:type="dxa" w:w="80"/>
+            </w:tcMar>
+            <w:vAlign w:val="center"/>
+          </w:tcPr>
+          <w:p>
+            <w:pPr>
+              <w:spacing w:after="20"/>
+            </w:pPr>
+            <w:r>
+              <w:rPr>
+                <w:rFonts w:ascii="Arial" w:cs="Arial" w:eastAsia="Arial" w:hAnsi="Arial"/>
+                <w:b w:val="false"/>
+                <w:bCs w:val="false"/>
+                <w:color w:val="000000"/>
+                <w:sz w:val="18"/>
+                <w:szCs w:val="18"/>
+              </w:rPr>
+              <w:t xml:space="preserve">Referencias</w:t>
+            </w:r>
+          </w:p>
+        </w:tc>
+        <w:tc>
+          <w:tcPr>
+            <w:tcW w:type="dxa" w:w="2500"/>
+            <w:tcBorders>
+              <w:top w:val="single" w:color="8EAADB" w:sz="4"/>
+              <w:left w:val="single" w:color="8EAADB" w:sz="4"/>
+              <w:bottom w:val="single" w:color="8EAADB" w:sz="4"/>
+              <w:right w:val="single" w:color="8EAADB" w:sz="4"/>
+            </w:tcBorders>
+            <w:tcMar>
+              <w:top w:type="dxa" w:w="35"/>
+              <w:left w:type="dxa" w:w="80"/>
+              <w:bottom w:type="dxa" w:w="35"/>
+              <w:right w:type="dxa" w:w="80"/>
+            </w:tcMar>
+            <w:vAlign w:val="center"/>
+          </w:tcPr>
+          <w:p>
+            <w:pPr>
+              <w:spacing w:after="20"/>
+            </w:pPr>
+            <w:r>
+              <w:rPr>
+                <w:rFonts w:ascii="Arial" w:cs="Arial" w:eastAsia="Arial" w:hAnsi="Arial"/>
+                <w:b w:val="false"/>
+                <w:bCs w:val="false"/>
+                <w:color w:val="000000"/>
+                <w:sz w:val="18"/>
+                <w:szCs w:val="18"/>
+              </w:rPr>
+              <w:t xml:space="preserve">23_tarjeta.png</w:t>
+            </w:r>
+          </w:p>
+        </w:tc>
+        <w:tc>
+          <w:tcPr>
+            <w:tcW w:type="dxa" w:w="2460"/>
+            <w:tcBorders>
+              <w:top w:val="single" w:color="8EAADB" w:sz="4"/>
+              <w:left w:val="single" w:color="8EAADB" w:sz="4"/>
+              <w:bottom w:val="single" w:color="8EAADB" w:sz="4"/>
+              <w:right w:val="single" w:color="8EAADB" w:sz="4"/>
+            </w:tcBorders>
+            <w:tcMar>
+              <w:top w:type="dxa" w:w="35"/>
+              <w:left w:type="dxa" w:w="80"/>
+              <w:bottom w:type="dxa" w:w="35"/>
+              <w:right w:type="dxa" w:w="80"/>
+            </w:tcMar>
+            <w:vAlign w:val="center"/>
+          </w:tcPr>
+          <w:p>
+            <w:pPr>
+              <w:spacing w:after="20"/>
+            </w:pPr>
+            <w:r>
+              <w:rPr>
+                <w:rFonts w:ascii="Arial" w:cs="Arial" w:eastAsia="Arial" w:hAnsi="Arial"/>
+                <w:b w:val="false"/>
+                <w:bCs w:val="false"/>
+                <w:color w:val="000000"/>
+                <w:sz w:val="18"/>
+                <w:szCs w:val="18"/>
+              </w:rPr>
+              <w:t xml:space="preserve">No aplica</w:t>
+            </w:r>
+          </w:p>
+        </w:tc>
+        <w:tc>
+          <w:tcPr>
+            <w:tcW w:type="dxa" w:w="1000"/>
+            <w:tcBorders>
+              <w:top w:val="single" w:color="8EAADB" w:sz="4"/>
+              <w:left w:val="single" w:color="8EAADB" w:sz="4"/>
+              <w:bottom w:val="single" w:color="8EAADB" w:sz="4"/>
+              <w:right w:val="single" w:color="8EAADB" w:sz="4"/>
+            </w:tcBorders>
+            <w:tcMar>
+              <w:top w:type="dxa" w:w="35"/>
+              <w:left w:type="dxa" w:w="80"/>
+              <w:bottom w:type="dxa" w:w="35"/>
+              <w:right w:type="dxa" w:w="80"/>
+            </w:tcMar>
+            <w:vAlign w:val="center"/>
+          </w:tcPr>
+          <w:p>
+            <w:pPr>
+              <w:spacing w:after="20"/>
+            </w:pPr>
+            <w:r>
+              <w:rPr>
+                <w:rFonts w:ascii="Arial" w:cs="Arial" w:eastAsia="Arial" w:hAnsi="Arial"/>
+                <w:b w:val="false"/>
+                <w:bCs w:val="false"/>
+                <w:color w:val="000000"/>
+                <w:sz w:val="18"/>
+                <w:szCs w:val="18"/>
+              </w:rPr>
+              <w:t xml:space="preserve">8 s</w:t>
+            </w:r>
+          </w:p>
+        </w:tc>
+      </w:tr>
+      <w:tr>
+        <w:trPr>
+          <w:tblHeader w:val="false"/>
+        </w:trPr>
+        <w:tc>
+          <w:tcPr>
+            <w:tcW w:type="dxa" w:w="700"/>
+            <w:tcBorders>
+              <w:top w:val="single" w:color="8EAADB" w:sz="4"/>
+              <w:left w:val="single" w:color="8EAADB" w:sz="4"/>
+              <w:bottom w:val="single" w:color="8EAADB" w:sz="4"/>
+              <w:right w:val="single" w:color="8EAADB" w:sz="4"/>
+            </w:tcBorders>
+            <w:shd w:fill="DEEAF6" w:color="auto" w:val="clear"/>
+            <w:tcMar>
+              <w:top w:type="dxa" w:w="35"/>
+              <w:left w:type="dxa" w:w="80"/>
+              <w:bottom w:type="dxa" w:w="35"/>
+              <w:right w:type="dxa" w:w="80"/>
+            </w:tcMar>
+            <w:vAlign w:val="center"/>
+          </w:tcPr>
+          <w:p>
+            <w:pPr>
+              <w:spacing w:after="20"/>
+            </w:pPr>
+            <w:r>
+              <w:rPr>
+                <w:rFonts w:ascii="Arial" w:cs="Arial" w:eastAsia="Arial" w:hAnsi="Arial"/>
+                <w:b/>
+                <w:bCs/>
+                <w:color w:val="000000"/>
+                <w:sz w:val="18"/>
+                <w:szCs w:val="18"/>
+              </w:rPr>
+              <w:t xml:space="preserve">26</w:t>
             </w:r>
           </w:p>
         </w:tc>

</xml_diff>